<commit_message>
docs: integrate 15 comprehensive literature review studies and exact citations into Word and PDF papers
</commit_message>
<xml_diff>
--- a/docs/paper/CNN_ASD_Research_Paper.docx
+++ b/docs/paper/CNN_ASD_Research_Paper.docx
@@ -153,7 +153,7 @@
           <w:color w:val="000000"/>
           <w:sz w:val="19"/>
         </w:rPr>
-        <w:t xml:space="preserve"> Spectrum Disorder (ASD) is a heterogeneous neurodevelopmental syndrome distinguished by reciprocal social communication impairments, atypical language acquisition, and repetitive or restricted repertoires of interest [1]. Recent epidemiological surveillance by the United States Centers for Disease Control and Prevention (CDC) Autism and Developmental Disabilities Monitoring (ADDM) Network estimates that ASD affects approximately 1 in 36 children (2.8%) [2]. Similar escalating prevalence rates have been reported globally, underscoring an urgent societal demand for rapid, objective, and scalable screening modalities.</w:t>
+        <w:t xml:space="preserve"> Spectrum Disorder (ASD) is a heterogeneous neurodevelopmental syndrome distinguished by reciprocal social communication impairments, atypical language acquisition, and repetitive or restricted repertoires of interest [16]. Recent epidemiological surveillance by the United States Centers for Disease Control and Prevention (CDC) Autism and Developmental Disabilities Monitoring (ADDM) Network estimates that ASD affects approximately 1 in 36 children (2.8%) [17]. Similar escalating prevalence rates have been reported globally, underscoring an urgent societal demand for rapid, objective, and scalable screening modalities.</w:t>
       </w:r>
     </w:p>
     <w:p>
@@ -168,7 +168,7 @@
           <w:color w:val="000000"/>
           <w:sz w:val="19"/>
         </w:rPr>
-        <w:t>Clinical literature overwhelmingly demonstrates that early therapeutic intervention initiated within the neuroplastic developmental window (&lt; 36 months) profoundly enhances long-term cognitive agility, linguistic fluency, and adaptive autonomy [1]. Nonetheless, formal clinical diagnosis relies almost exclusively on observational psychiatric instruments, including the Autism Diagnostic Observation Schedule, Second Edition (ADOS-2) and the Autism Diagnostic Interview-Revised (ADI-R). Administering these evaluations requires certified child psychiatrists and lengthy observation sessions, leading to worldwide waiting queues spanning 12 to 18 months. During this diagnostic delay, children miss the most responsive period for early developmental therapy.</w:t>
+        <w:t>Clinical literature overwhelmingly demonstrates that early therapeutic intervention initiated within the neuroplastic developmental window (&lt; 36 months) profoundly enhances long-term cognitive agility, linguistic fluency, and adaptive autonomy [16]. Nonetheless, formal clinical diagnosis relies almost exclusively on observational psychiatric instruments, including the Autism Diagnostic Observation Schedule, Second Edition (ADOS-2) and the Autism Diagnostic Interview-Revised (ADI-R). Administering these evaluations requires certified child psychiatrists and lengthy observation sessions, leading to worldwide waiting queues spanning 12 to 18 months. During this diagnostic delay, children miss the most responsive period for early developmental therapy.</w:t>
       </w:r>
     </w:p>
     <w:p>
@@ -183,7 +183,7 @@
           <w:color w:val="000000"/>
           <w:sz w:val="19"/>
         </w:rPr>
-        <w:t>To eliminate clinical bottlenecks, neuroimaging researchers have investigated resting-state functional magnetic resonance imaging (rs-fMRI) to identify connectome-level biomarkers [3], [4], [5]. Most recently, Singh et al. [6] benchmarked functional connectivity matrices across the multi-site ABIDE repository, demonstrating 78.1% classification accuracy and 83.9% AUROC. Despite these technical milestones, fMRI remains clinically infeasible for routine pediatric triage due to three insurmountable barriers:</w:t>
+        <w:t>To eliminate clinical bottlenecks, neuroimaging researchers have investigated resting-state functional magnetic resonance imaging (rs-fMRI) to identify connectome-level biomarkers [18], [19]. Despite technical milestones, fMRI remains clinically infeasible for routine pediatric triage due to three insurmountable barriers:</w:t>
       </w:r>
     </w:p>
     <w:p>
@@ -243,7 +243,7 @@
           <w:color w:val="000000"/>
           <w:sz w:val="19"/>
         </w:rPr>
-        <w:t>To establish an accessible alternative, developmental embryology offers a compelling foundation: during human organogenesis (gestational weeks 3–8), the central nervous system and craniofacial structures develop simultaneously from common neuroectodermal origins and reciprocal paracrine signaling pathways (e.g., Sonic Hedgehog and Fibroblast Growth Factor signaling between the forebrain neuroectoderm and migrating cranial neural crest cells) [7]. Consequently, prenatal perturbations that disrupt early neural connectivity frequently produce subtle, characteristic craniofacial variations, including altered intercanthal spacing, mid-face vertical proportions, and palpebral fissure morphology [8], [9].</w:t>
+        <w:t>To establish an accessible alternative, developmental embryology offers a compelling foundation: during human organogenesis (gestational weeks 3–8), the central nervous system and craniofacial structures develop simultaneously from common neuroectodermal origins and reciprocal paracrine signaling pathways (e.g., Sonic Hedgehog and Fibroblast Growth Factor signaling between the forebrain neuroectoderm and migrating cranial neural crest cells) [20]. Consequently, prenatal perturbations that disrupt early neural connectivity frequently produce subtle, characteristic craniofacial variations, including altered intercanthal spacing, mid-face vertical proportions, and palpebral fissure morphology [21], [22].</w:t>
       </w:r>
     </w:p>
     <w:p>
@@ -258,7 +258,7 @@
           <w:color w:val="000000"/>
           <w:sz w:val="19"/>
         </w:rPr>
-        <w:t>Building upon these morphometric insights, computer vision researchers have explored 2D facial photographs for ASD detection. Ahmad et al. [10] evaluated several pretrained convolutional neural networks (CNNs), confirming that deep networks can distinguish autistic facial features from photographic portraits. However, clinical adoption requires systematic empirical benchmarking across diverse network depths, rigorous validation on balanced multi-center cohorts, and transparent quantification of computational latency.</w:t>
+        <w:t>Building upon these morphometric insights, computer vision researchers have explored 2D facial photographs for ASD detection. Recent landmark investigations, including Akter et al. [4] and Khan et al. [11], have confirmed that deep convolutional networks can extract discriminative facial biomarkers from pediatric portraits. However, clinical adoption requires systematic empirical benchmarking across diverse network depths, rigorous validation on balanced multi-center cohorts, and transparent quantification of computational latency.</w:t>
       </w:r>
     </w:p>
     <w:p>
@@ -483,7 +483,7 @@
           <w:color w:val="000000"/>
           <w:sz w:val="19"/>
         </w:rPr>
-        <w:t>Automated Autism Spectrum Disorder screening has historically developed along two primary computational directions: neuroimaging functional connectomics and photographic computer vision.</w:t>
+        <w:t>Automated Autism Spectrum Disorder (ASD) detection has increasingly leveraged computer vision, deep learning, and biometric pattern recognition. A comprehensive survey of recent literature reveals diverse methodological paradigms, spanning transfer learning, facial landmark geometry, multi-model feature fusion, and cross-attention architectures.</w:t>
       </w:r>
     </w:p>
     <w:p>
@@ -500,7 +500,7 @@
           <w:color w:val="000000"/>
           <w:sz w:val="19"/>
         </w:rPr>
-        <w:t>A. Neuroimaging Connectomics for Autism Detection</w:t>
+        <w:t>A. Literature Survey of Deep Learning and Photographic ASD Screening</w:t>
       </w:r>
     </w:p>
     <w:p>
@@ -515,7 +515,217 @@
           <w:color w:val="000000"/>
           <w:sz w:val="19"/>
         </w:rPr>
-        <w:t>The creation of the Autism Brain Imaging Data Exchange (ABIDE-I) consortium enabled large-scale exploration of intrinsic functional brain architecture across 1,035 subjects [3]. Heinsfeld et al. [4] applied deep autoencoders to whole-brain functional connectivity matrices, attaining 70.0% classification accuracy. Eslami et al. [5] introduced DiagNet, combining autoencoders with linear discriminant models to achieve 70.3% accuracy. To address cross-site scanner variance across ABIDE imaging centers, Sun et al. [11] developed Maximum Independence Domain Adaptation (MIDA), achieving 72.0% accuracy and 78.6% AUROC. Recently, Singh et al. [6] integrated Tangent Full Correlation Embedding (TFCE) with domain adaptation, reporting 78.1% accuracy and 83.9% AUROC within a multi-site holdout protocol. While these studies advanced computational neuroscience, their reliance on MRI machinery precludes scalable pediatric screening.</w:t>
+        <w:t>The study proposes a MobileNet-based deep-learning model for classifying children as autistic or non-autistic from facial images. It uses 3,014 facial images and reports 94.64% test accuracy. The model uses MobileNet followed by two dense layers. [1]</w:t>
+      </w:r>
+    </w:p>
+    <w:p>
+      <w:pPr>
+        <w:spacing w:line="240" w:lineRule="auto" w:before="0" w:after="0"/>
+        <w:ind w:firstLine="202"/>
+        <w:jc w:val="both"/>
+      </w:pPr>
+      <w:r>
+        <w:rPr>
+          <w:rFonts w:ascii="Times New Roman" w:hAnsi="Times New Roman"/>
+          <w:color w:val="000000"/>
+          <w:sz w:val="19"/>
+        </w:rPr>
+        <w:t>The study proposes a modified VGG19 model using Dlib facial landmarks and MediaPipe Face Mesh to analyze eye and forehead regions. Using images from 60 children, it achieved 94.35% accuracy, 95.24% recall, 93.75% precision, and 0.9831 AUC. [14]</w:t>
+      </w:r>
+    </w:p>
+    <w:p>
+      <w:pPr>
+        <w:spacing w:line="240" w:lineRule="auto" w:before="0" w:after="0"/>
+        <w:ind w:firstLine="202"/>
+        <w:jc w:val="both"/>
+      </w:pPr>
+      <w:r>
+        <w:rPr>
+          <w:rFonts w:ascii="Times New Roman" w:hAnsi="Times New Roman"/>
+          <w:color w:val="000000"/>
+          <w:sz w:val="19"/>
+        </w:rPr>
+        <w:t>The study compares Xception, ResNet50, MobileNetV2, VGG16, and DenseNet121 on 2,940 facial images. DenseNet121 performed best, achieving 96% accuracy, 99% precision, and 93% recall for the autistic class. [11]</w:t>
+      </w:r>
+    </w:p>
+    <w:p>
+      <w:pPr>
+        <w:spacing w:line="240" w:lineRule="auto" w:before="0" w:after="0"/>
+        <w:ind w:firstLine="202"/>
+        <w:jc w:val="both"/>
+      </w:pPr>
+      <w:r>
+        <w:rPr>
+          <w:rFonts w:ascii="Times New Roman" w:hAnsi="Times New Roman"/>
+          <w:color w:val="000000"/>
+          <w:sz w:val="19"/>
+        </w:rPr>
+        <w:t>The study uses VGG16 and VGG19 CNN models to classify facial images into autistic and non-autistic classes. VGG16 achieved 86.33% accuracy, with 84.67% precision and 87.59% sensitivity. [5]</w:t>
+      </w:r>
+    </w:p>
+    <w:p>
+      <w:pPr>
+        <w:spacing w:line="240" w:lineRule="auto" w:before="0" w:after="0"/>
+        <w:ind w:firstLine="202"/>
+        <w:jc w:val="both"/>
+      </w:pPr>
+      <w:r>
+        <w:rPr>
+          <w:rFonts w:ascii="Times New Roman" w:hAnsi="Times New Roman"/>
+          <w:color w:val="000000"/>
+          <w:sz w:val="19"/>
+        </w:rPr>
+        <w:t>The study compares MobileNet, MobileNetV2, and VGG16 with multiple machine-learning classifiers using facial images and landmarks. MobileNetV2 achieved 92% test accuracy. [7]</w:t>
+      </w:r>
+    </w:p>
+    <w:p>
+      <w:pPr>
+        <w:spacing w:line="240" w:lineRule="auto" w:before="0" w:after="0"/>
+        <w:ind w:firstLine="202"/>
+        <w:jc w:val="both"/>
+      </w:pPr>
+      <w:r>
+        <w:rPr>
+          <w:rFonts w:ascii="Times New Roman" w:hAnsi="Times New Roman"/>
+          <w:color w:val="000000"/>
+          <w:sz w:val="19"/>
+        </w:rPr>
+        <w:t>The study proposes a Modified HOG-based Multichannel CNN that combines HOG feature extraction with three CNN channels. Using 2,936 facial images and 3-fold cross-validation, it achieved 98% validation accuracy and 96.2% test accuracy. [15]</w:t>
+      </w:r>
+    </w:p>
+    <w:p>
+      <w:pPr>
+        <w:spacing w:line="240" w:lineRule="auto" w:before="0" w:after="0"/>
+        <w:ind w:firstLine="202"/>
+        <w:jc w:val="both"/>
+      </w:pPr>
+      <w:r>
+        <w:rPr>
+          <w:rFonts w:ascii="Times New Roman" w:hAnsi="Times New Roman"/>
+          <w:color w:val="000000"/>
+          <w:sz w:val="19"/>
+        </w:rPr>
+        <w:t>The study combines VGG16, ResNet101, and MobileNet features with t-SNE and machine-learning classifiers. The best VGG16-MobileNet with Random Forest model achieved 98.8% accuracy and 99.25% AUC. [12]</w:t>
+      </w:r>
+    </w:p>
+    <w:p>
+      <w:pPr>
+        <w:spacing w:line="240" w:lineRule="auto" w:before="0" w:after="0"/>
+        <w:ind w:firstLine="202"/>
+        <w:jc w:val="both"/>
+      </w:pPr>
+      <w:r>
+        <w:rPr>
+          <w:rFonts w:ascii="Times New Roman" w:hAnsi="Times New Roman"/>
+          <w:color w:val="000000"/>
+          <w:sz w:val="19"/>
+        </w:rPr>
+        <w:t>The study compares VGG16, VGG19, ResNet50, InceptionV3, and MobileNet using 5,000 facial images. VGG19 achieved the highest accuracy of 77.89%, while InceptionV3 achieved the highest reported recall of 99.67%. [13]</w:t>
+      </w:r>
+    </w:p>
+    <w:p>
+      <w:pPr>
+        <w:spacing w:line="240" w:lineRule="auto" w:before="0" w:after="0"/>
+        <w:ind w:firstLine="202"/>
+        <w:jc w:val="both"/>
+      </w:pPr>
+      <w:r>
+        <w:rPr>
+          <w:rFonts w:ascii="Times New Roman" w:hAnsi="Times New Roman"/>
+          <w:color w:val="000000"/>
+          <w:sz w:val="19"/>
+        </w:rPr>
+        <w:t>The study compares Naive Bayes, SVM, Logistic Regression, KNN, ANN, and CNN using UCI screening datasets for children, adolescents, and adults. CNN achieved 99.53% accuracy for adults, 98.30% for children, and 96.88% for adolescents. [9]</w:t>
+      </w:r>
+    </w:p>
+    <w:p>
+      <w:pPr>
+        <w:spacing w:line="240" w:lineRule="auto" w:before="0" w:after="0"/>
+        <w:ind w:firstLine="202"/>
+        <w:jc w:val="both"/>
+      </w:pPr>
+      <w:r>
+        <w:rPr>
+          <w:rFonts w:ascii="Times New Roman" w:hAnsi="Times New Roman"/>
+          <w:color w:val="000000"/>
+          <w:sz w:val="19"/>
+        </w:rPr>
+        <w:t>The study evaluates MobileNet, Xception, and InceptionV3 on 3,014 facial images and deploys the trained model through a Flask web application. MobileNet achieved 95% validation accuracy, with 97% sensitivity and 93% specificity. [8]* (*Note: Retracted evidence).</w:t>
+      </w:r>
+    </w:p>
+    <w:p>
+      <w:pPr>
+        <w:spacing w:line="240" w:lineRule="auto" w:before="0" w:after="0"/>
+        <w:ind w:firstLine="202"/>
+        <w:jc w:val="both"/>
+      </w:pPr>
+      <w:r>
+        <w:rPr>
+          <w:rFonts w:ascii="Times New Roman" w:hAnsi="Times New Roman"/>
+          <w:color w:val="000000"/>
+          <w:sz w:val="19"/>
+        </w:rPr>
+        <w:t>The study uses VGG16 transfer learning on a clinically diagnosed East Asian dataset containing 1,122 images. It achieved 95% classification accuracy and a 0.95 F1-score, while also examining the effect of ethnoracial representation on model performance. [6]</w:t>
+      </w:r>
+    </w:p>
+    <w:p>
+      <w:pPr>
+        <w:spacing w:line="240" w:lineRule="auto" w:before="0" w:after="0"/>
+        <w:ind w:firstLine="202"/>
+        <w:jc w:val="both"/>
+      </w:pPr>
+      <w:r>
+        <w:rPr>
+          <w:rFonts w:ascii="Times New Roman" w:hAnsi="Times New Roman"/>
+          <w:color w:val="000000"/>
+          <w:sz w:val="19"/>
+        </w:rPr>
+        <w:t>The study proposes an improved MobileNet-V1 framework using 2,936 Kaggle facial images. The model achieved 90.67% test accuracy, while K-means clustering was also used to explore possible ASD subtypes. [4]</w:t>
+      </w:r>
+    </w:p>
+    <w:p>
+      <w:pPr>
+        <w:spacing w:line="240" w:lineRule="auto" w:before="0" w:after="0"/>
+        <w:ind w:firstLine="202"/>
+        <w:jc w:val="both"/>
+      </w:pPr>
+      <w:r>
+        <w:rPr>
+          <w:rFonts w:ascii="Times New Roman" w:hAnsi="Times New Roman"/>
+          <w:color w:val="000000"/>
+          <w:sz w:val="19"/>
+        </w:rPr>
+        <w:t>The study proposes a 1D CNN using behavioral, demographic, and screening-related features from public ASD datasets. It reports 98.66% accuracy for children, 90% for adolescents, and 99.45% for adults. [10]</w:t>
+      </w:r>
+    </w:p>
+    <w:p>
+      <w:pPr>
+        <w:spacing w:line="240" w:lineRule="auto" w:before="0" w:after="0"/>
+        <w:ind w:firstLine="202"/>
+        <w:jc w:val="both"/>
+      </w:pPr>
+      <w:r>
+        <w:rPr>
+          <w:rFonts w:ascii="Times New Roman" w:hAnsi="Times New Roman"/>
+          <w:color w:val="000000"/>
+          <w:sz w:val="19"/>
+        </w:rPr>
+        <w:t>The study combines ResNet-152 with CBAM and ViT-Large using cross-attention to capture local and global facial information. A weighted ensemble with test-time augmentation achieved 92.00% accuracy and 96.74% AUC. [3]</w:t>
+      </w:r>
+    </w:p>
+    <w:p>
+      <w:pPr>
+        <w:spacing w:line="240" w:lineRule="auto" w:before="0" w:after="0"/>
+        <w:ind w:firstLine="202"/>
+        <w:jc w:val="both"/>
+      </w:pPr>
+      <w:r>
+        <w:rPr>
+          <w:rFonts w:ascii="Times New Roman" w:hAnsi="Times New Roman"/>
+          <w:color w:val="000000"/>
+          <w:sz w:val="19"/>
+        </w:rPr>
+        <w:t>The study evaluates MobileNet, Xception, EfficientNetB0, EfficientNetB1, and EfficientNetB2 for ASD detection from 2,936 static facial images. Xception achieved the highest reported AUC of 96.63%, with 88.46% sensitivity and 91.66% specificity. [2]</w:t>
       </w:r>
     </w:p>
     <w:p>
@@ -532,7 +742,7 @@
           <w:color w:val="000000"/>
           <w:sz w:val="19"/>
         </w:rPr>
-        <w:t>B. Facial Photographic Screening and Deep CNNs</w:t>
+        <w:t>B. Overall Literature Observation and Research Gaps</w:t>
       </w:r>
     </w:p>
     <w:p>
@@ -547,7 +757,7 @@
           <w:color w:val="000000"/>
           <w:sz w:val="19"/>
         </w:rPr>
-        <w:t>Recognizing the clinical advantages of non-invasive facial photography, computer vision investigators have evaluated deep learning architectures for autism detection. Elbashir et al. [12] proposed a lightweight customized CNN, achieving 83.2% accuracy on a curated image subset. Alsaade and Alzahrani [13] investigated deep transfer learning ensembles, reporting 84.1% accuracy. Most recently, Ahmad et al. [10] conducted an empirical comparison of pretrained CNNs on a Kaggle facial repository, documenting accuracies up to 87% for ResNet-50 and VGG-19 under naive random partitioning. However, prior investigations lacked standardized multi-center cross-validation, comprehensive comparative metric suites (AUROC, Sensitivity, Specificity, F1-Score), and systematic analysis of architectural depth versus computational latency. Table I synthesizes the comparative landscape of related works.</w:t>
+        <w:t>The reviewed studies demonstrate the widespread use of machine learning, CNNs, transfer learning, facial landmarks, hybrid architectures, and feature fusion for ASD detection. Common challenges include limited dataset size and diversity, reliance on public facial-image datasets, static-image limitations, demographic bias, and the need for independent clinical validation. Table I synthesizes the comparative landscape of prominent works.</w:t>
       </w:r>
     </w:p>
     <w:p>
@@ -613,10 +823,10 @@
             <w:tcW w:type="dxa" w:w="1872"/>
             <w:vAlign w:val="center"/>
             <w:tcMar>
-              <w:top w:w="40" w:type="dxa"/>
-              <w:bottom w:w="40" w:type="dxa"/>
-              <w:left w:w="50" w:type="dxa"/>
-              <w:right w:w="50" w:type="dxa"/>
+              <w:top w:w="35" w:type="dxa"/>
+              <w:bottom w:w="35" w:type="dxa"/>
+              <w:left w:w="45" w:type="dxa"/>
+              <w:right w:w="45" w:type="dxa"/>
             </w:tcMar>
             <w:shd w:fill="F1F5F9"/>
           </w:tcPr>
@@ -629,7 +839,7 @@
               <w:rPr>
                 <w:rFonts w:ascii="Times New Roman" w:hAnsi="Times New Roman"/>
                 <w:b/>
-                <w:sz w:val="16"/>
+                <w:sz w:val="15"/>
               </w:rPr>
               <w:t>Authors &amp; Year</w:t>
             </w:r>
@@ -640,10 +850,10 @@
             <w:tcW w:type="dxa" w:w="1008"/>
             <w:vAlign w:val="center"/>
             <w:tcMar>
-              <w:top w:w="40" w:type="dxa"/>
-              <w:bottom w:w="40" w:type="dxa"/>
-              <w:left w:w="50" w:type="dxa"/>
-              <w:right w:w="50" w:type="dxa"/>
+              <w:top w:w="35" w:type="dxa"/>
+              <w:bottom w:w="35" w:type="dxa"/>
+              <w:left w:w="45" w:type="dxa"/>
+              <w:right w:w="45" w:type="dxa"/>
             </w:tcMar>
             <w:shd w:fill="F1F5F9"/>
           </w:tcPr>
@@ -656,7 +866,7 @@
               <w:rPr>
                 <w:rFonts w:ascii="Times New Roman" w:hAnsi="Times New Roman"/>
                 <w:b/>
-                <w:sz w:val="16"/>
+                <w:sz w:val="15"/>
               </w:rPr>
               <w:t>Modality</w:t>
             </w:r>
@@ -667,10 +877,10 @@
             <w:tcW w:type="dxa" w:w="1584"/>
             <w:vAlign w:val="center"/>
             <w:tcMar>
-              <w:top w:w="40" w:type="dxa"/>
-              <w:bottom w:w="40" w:type="dxa"/>
-              <w:left w:w="50" w:type="dxa"/>
-              <w:right w:w="50" w:type="dxa"/>
+              <w:top w:w="35" w:type="dxa"/>
+              <w:bottom w:w="35" w:type="dxa"/>
+              <w:left w:w="45" w:type="dxa"/>
+              <w:right w:w="45" w:type="dxa"/>
             </w:tcMar>
             <w:shd w:fill="F1F5F9"/>
           </w:tcPr>
@@ -683,7 +893,7 @@
               <w:rPr>
                 <w:rFonts w:ascii="Times New Roman" w:hAnsi="Times New Roman"/>
                 <w:b/>
-                <w:sz w:val="16"/>
+                <w:sz w:val="15"/>
               </w:rPr>
               <w:t>Dataset (Size)</w:t>
             </w:r>
@@ -694,10 +904,10 @@
             <w:tcW w:type="dxa" w:w="2016"/>
             <w:vAlign w:val="center"/>
             <w:tcMar>
-              <w:top w:w="40" w:type="dxa"/>
-              <w:bottom w:w="40" w:type="dxa"/>
-              <w:left w:w="50" w:type="dxa"/>
-              <w:right w:w="50" w:type="dxa"/>
+              <w:top w:w="35" w:type="dxa"/>
+              <w:bottom w:w="35" w:type="dxa"/>
+              <w:left w:w="45" w:type="dxa"/>
+              <w:right w:w="45" w:type="dxa"/>
             </w:tcMar>
             <w:shd w:fill="F1F5F9"/>
           </w:tcPr>
@@ -710,7 +920,7 @@
               <w:rPr>
                 <w:rFonts w:ascii="Times New Roman" w:hAnsi="Times New Roman"/>
                 <w:b/>
-                <w:sz w:val="16"/>
+                <w:sz w:val="15"/>
               </w:rPr>
               <w:t>Methodology Architecture</w:t>
             </w:r>
@@ -721,10 +931,10 @@
             <w:tcW w:type="dxa" w:w="1584"/>
             <w:vAlign w:val="center"/>
             <w:tcMar>
-              <w:top w:w="40" w:type="dxa"/>
-              <w:bottom w:w="40" w:type="dxa"/>
-              <w:left w:w="50" w:type="dxa"/>
-              <w:right w:w="50" w:type="dxa"/>
+              <w:top w:w="35" w:type="dxa"/>
+              <w:bottom w:w="35" w:type="dxa"/>
+              <w:left w:w="45" w:type="dxa"/>
+              <w:right w:w="45" w:type="dxa"/>
             </w:tcMar>
             <w:shd w:fill="F1F5F9"/>
           </w:tcPr>
@@ -737,7 +947,7 @@
               <w:rPr>
                 <w:rFonts w:ascii="Times New Roman" w:hAnsi="Times New Roman"/>
                 <w:b/>
-                <w:sz w:val="16"/>
+                <w:sz w:val="15"/>
               </w:rPr>
               <w:t>Key Metrics</w:t>
             </w:r>
@@ -748,10 +958,10 @@
             <w:tcW w:type="dxa" w:w="2376"/>
             <w:vAlign w:val="center"/>
             <w:tcMar>
-              <w:top w:w="40" w:type="dxa"/>
-              <w:bottom w:w="40" w:type="dxa"/>
-              <w:left w:w="50" w:type="dxa"/>
-              <w:right w:w="50" w:type="dxa"/>
+              <w:top w:w="35" w:type="dxa"/>
+              <w:bottom w:w="35" w:type="dxa"/>
+              <w:left w:w="45" w:type="dxa"/>
+              <w:right w:w="45" w:type="dxa"/>
             </w:tcMar>
             <w:shd w:fill="F1F5F9"/>
           </w:tcPr>
@@ -764,7 +974,7 @@
               <w:rPr>
                 <w:rFonts w:ascii="Times New Roman" w:hAnsi="Times New Roman"/>
                 <w:b/>
-                <w:sz w:val="16"/>
+                <w:sz w:val="15"/>
               </w:rPr>
               <w:t>Research Gaps &amp; Clinical Constraints</w:t>
             </w:r>
@@ -777,10 +987,10 @@
             <w:tcW w:type="dxa" w:w="1872"/>
             <w:vAlign w:val="center"/>
             <w:tcMar>
-              <w:top w:w="40" w:type="dxa"/>
-              <w:bottom w:w="40" w:type="dxa"/>
-              <w:left w:w="50" w:type="dxa"/>
-              <w:right w:w="50" w:type="dxa"/>
+              <w:top w:w="35" w:type="dxa"/>
+              <w:bottom w:w="35" w:type="dxa"/>
+              <w:left w:w="45" w:type="dxa"/>
+              <w:right w:w="45" w:type="dxa"/>
             </w:tcMar>
             <w:shd w:fill="FFFFFF"/>
           </w:tcPr>
@@ -792,9 +1002,9 @@
             <w:r>
               <w:rPr>
                 <w:rFonts w:ascii="Times New Roman" w:hAnsi="Times New Roman"/>
-                <w:sz w:val="16"/>
+                <w:sz w:val="15"/>
               </w:rPr>
-              <w:t>Heinsfeld et al. (2018) [4]</w:t>
+              <w:t>Beary et al. (2020) [1]</w:t>
             </w:r>
           </w:p>
         </w:tc>
@@ -803,10 +1013,10 @@
             <w:tcW w:type="dxa" w:w="1008"/>
             <w:vAlign w:val="center"/>
             <w:tcMar>
-              <w:top w:w="40" w:type="dxa"/>
-              <w:bottom w:w="40" w:type="dxa"/>
-              <w:left w:w="50" w:type="dxa"/>
-              <w:right w:w="50" w:type="dxa"/>
+              <w:top w:w="35" w:type="dxa"/>
+              <w:bottom w:w="35" w:type="dxa"/>
+              <w:left w:w="45" w:type="dxa"/>
+              <w:right w:w="45" w:type="dxa"/>
             </w:tcMar>
             <w:shd w:fill="FFFFFF"/>
           </w:tcPr>
@@ -818,9 +1028,9 @@
             <w:r>
               <w:rPr>
                 <w:rFonts w:ascii="Times New Roman" w:hAnsi="Times New Roman"/>
-                <w:sz w:val="16"/>
+                <w:sz w:val="15"/>
               </w:rPr>
-              <w:t>rs-fMRI</w:t>
+              <w:t>2D Photos</w:t>
             </w:r>
           </w:p>
         </w:tc>
@@ -829,10 +1039,10 @@
             <w:tcW w:type="dxa" w:w="1584"/>
             <w:vAlign w:val="center"/>
             <w:tcMar>
-              <w:top w:w="40" w:type="dxa"/>
-              <w:bottom w:w="40" w:type="dxa"/>
-              <w:left w:w="50" w:type="dxa"/>
-              <w:right w:w="50" w:type="dxa"/>
+              <w:top w:w="35" w:type="dxa"/>
+              <w:bottom w:w="35" w:type="dxa"/>
+              <w:left w:w="45" w:type="dxa"/>
+              <w:right w:w="45" w:type="dxa"/>
             </w:tcMar>
             <w:shd w:fill="FFFFFF"/>
           </w:tcPr>
@@ -844,9 +1054,9 @@
             <w:r>
               <w:rPr>
                 <w:rFonts w:ascii="Times New Roman" w:hAnsi="Times New Roman"/>
-                <w:sz w:val="16"/>
+                <w:sz w:val="15"/>
               </w:rPr>
-              <w:t>ABIDE-I (N=1,035)</w:t>
+              <w:t>Kaggle ASD (N=3,014)</w:t>
             </w:r>
           </w:p>
         </w:tc>
@@ -855,10 +1065,10 @@
             <w:tcW w:type="dxa" w:w="2016"/>
             <w:vAlign w:val="center"/>
             <w:tcMar>
-              <w:top w:w="40" w:type="dxa"/>
-              <w:bottom w:w="40" w:type="dxa"/>
-              <w:left w:w="50" w:type="dxa"/>
-              <w:right w:w="50" w:type="dxa"/>
+              <w:top w:w="35" w:type="dxa"/>
+              <w:bottom w:w="35" w:type="dxa"/>
+              <w:left w:w="45" w:type="dxa"/>
+              <w:right w:w="45" w:type="dxa"/>
             </w:tcMar>
             <w:shd w:fill="FFFFFF"/>
           </w:tcPr>
@@ -870,9 +1080,9 @@
             <w:r>
               <w:rPr>
                 <w:rFonts w:ascii="Times New Roman" w:hAnsi="Times New Roman"/>
-                <w:sz w:val="16"/>
+                <w:sz w:val="15"/>
               </w:rPr>
-              <w:t>Deep Autoencoder + MLP</w:t>
+              <w:t>MobileNet + Dense Layers</w:t>
             </w:r>
           </w:p>
         </w:tc>
@@ -881,10 +1091,10 @@
             <w:tcW w:type="dxa" w:w="1584"/>
             <w:vAlign w:val="center"/>
             <w:tcMar>
-              <w:top w:w="40" w:type="dxa"/>
-              <w:bottom w:w="40" w:type="dxa"/>
-              <w:left w:w="50" w:type="dxa"/>
-              <w:right w:w="50" w:type="dxa"/>
+              <w:top w:w="35" w:type="dxa"/>
+              <w:bottom w:w="35" w:type="dxa"/>
+              <w:left w:w="45" w:type="dxa"/>
+              <w:right w:w="45" w:type="dxa"/>
             </w:tcMar>
             <w:shd w:fill="FFFFFF"/>
           </w:tcPr>
@@ -896,9 +1106,9 @@
             <w:r>
               <w:rPr>
                 <w:rFonts w:ascii="Times New Roman" w:hAnsi="Times New Roman"/>
-                <w:sz w:val="16"/>
+                <w:sz w:val="15"/>
               </w:rPr>
-              <w:t>Acc: 70.0%</w:t>
+              <w:t>Acc: 94.64%</w:t>
             </w:r>
           </w:p>
         </w:tc>
@@ -907,10 +1117,10 @@
             <w:tcW w:type="dxa" w:w="2376"/>
             <w:vAlign w:val="center"/>
             <w:tcMar>
-              <w:top w:w="40" w:type="dxa"/>
-              <w:bottom w:w="40" w:type="dxa"/>
-              <w:left w:w="50" w:type="dxa"/>
-              <w:right w:w="50" w:type="dxa"/>
+              <w:top w:w="35" w:type="dxa"/>
+              <w:bottom w:w="35" w:type="dxa"/>
+              <w:left w:w="45" w:type="dxa"/>
+              <w:right w:w="45" w:type="dxa"/>
             </w:tcMar>
             <w:shd w:fill="FFFFFF"/>
           </w:tcPr>
@@ -922,9 +1132,9 @@
             <w:r>
               <w:rPr>
                 <w:rFonts w:ascii="Times New Roman" w:hAnsi="Times New Roman"/>
-                <w:sz w:val="16"/>
+                <w:sz w:val="15"/>
               </w:rPr>
-              <w:t>Scanner heterogeneity unaddressed; MRI pediatric sedation required.</w:t>
+              <w:t>Shallow classification head; lacks sensitivity/specificity profiling.</w:t>
             </w:r>
           </w:p>
         </w:tc>
@@ -935,10 +1145,10 @@
             <w:tcW w:type="dxa" w:w="1872"/>
             <w:vAlign w:val="center"/>
             <w:tcMar>
-              <w:top w:w="40" w:type="dxa"/>
-              <w:bottom w:w="40" w:type="dxa"/>
-              <w:left w:w="50" w:type="dxa"/>
-              <w:right w:w="50" w:type="dxa"/>
+              <w:top w:w="35" w:type="dxa"/>
+              <w:bottom w:w="35" w:type="dxa"/>
+              <w:left w:w="45" w:type="dxa"/>
+              <w:right w:w="45" w:type="dxa"/>
             </w:tcMar>
             <w:shd w:fill="FFFFFF"/>
           </w:tcPr>
@@ -950,9 +1160,9 @@
             <w:r>
               <w:rPr>
                 <w:rFonts w:ascii="Times New Roman" w:hAnsi="Times New Roman"/>
-                <w:sz w:val="16"/>
+                <w:sz w:val="15"/>
               </w:rPr>
-              <w:t>Eslami et al. (2019) [5]</w:t>
+              <w:t>Lu &amp; Perkowski (2021) [6]</w:t>
             </w:r>
           </w:p>
         </w:tc>
@@ -961,10 +1171,10 @@
             <w:tcW w:type="dxa" w:w="1008"/>
             <w:vAlign w:val="center"/>
             <w:tcMar>
-              <w:top w:w="40" w:type="dxa"/>
-              <w:bottom w:w="40" w:type="dxa"/>
-              <w:left w:w="50" w:type="dxa"/>
-              <w:right w:w="50" w:type="dxa"/>
+              <w:top w:w="35" w:type="dxa"/>
+              <w:bottom w:w="35" w:type="dxa"/>
+              <w:left w:w="45" w:type="dxa"/>
+              <w:right w:w="45" w:type="dxa"/>
             </w:tcMar>
             <w:shd w:fill="FFFFFF"/>
           </w:tcPr>
@@ -976,9 +1186,9 @@
             <w:r>
               <w:rPr>
                 <w:rFonts w:ascii="Times New Roman" w:hAnsi="Times New Roman"/>
-                <w:sz w:val="16"/>
+                <w:sz w:val="15"/>
               </w:rPr>
-              <w:t>rs-fMRI</w:t>
+              <w:t>2D Photos</w:t>
             </w:r>
           </w:p>
         </w:tc>
@@ -987,10 +1197,10 @@
             <w:tcW w:type="dxa" w:w="1584"/>
             <w:vAlign w:val="center"/>
             <w:tcMar>
-              <w:top w:w="40" w:type="dxa"/>
-              <w:bottom w:w="40" w:type="dxa"/>
-              <w:left w:w="50" w:type="dxa"/>
-              <w:right w:w="50" w:type="dxa"/>
+              <w:top w:w="35" w:type="dxa"/>
+              <w:bottom w:w="35" w:type="dxa"/>
+              <w:left w:w="45" w:type="dxa"/>
+              <w:right w:w="45" w:type="dxa"/>
             </w:tcMar>
             <w:shd w:fill="FFFFFF"/>
           </w:tcPr>
@@ -1002,9 +1212,9 @@
             <w:r>
               <w:rPr>
                 <w:rFonts w:ascii="Times New Roman" w:hAnsi="Times New Roman"/>
-                <w:sz w:val="16"/>
+                <w:sz w:val="15"/>
               </w:rPr>
-              <w:t>ABIDE-I (N=1,035)</w:t>
+              <w:t>East Asian (N=1,122)</w:t>
             </w:r>
           </w:p>
         </w:tc>
@@ -1013,10 +1223,10 @@
             <w:tcW w:type="dxa" w:w="2016"/>
             <w:vAlign w:val="center"/>
             <w:tcMar>
-              <w:top w:w="40" w:type="dxa"/>
-              <w:bottom w:w="40" w:type="dxa"/>
-              <w:left w:w="50" w:type="dxa"/>
-              <w:right w:w="50" w:type="dxa"/>
+              <w:top w:w="35" w:type="dxa"/>
+              <w:bottom w:w="35" w:type="dxa"/>
+              <w:left w:w="45" w:type="dxa"/>
+              <w:right w:w="45" w:type="dxa"/>
             </w:tcMar>
             <w:shd w:fill="FFFFFF"/>
           </w:tcPr>
@@ -1028,9 +1238,9 @@
             <w:r>
               <w:rPr>
                 <w:rFonts w:ascii="Times New Roman" w:hAnsi="Times New Roman"/>
-                <w:sz w:val="16"/>
+                <w:sz w:val="15"/>
               </w:rPr>
-              <w:t>DiagNet Autoencoder</w:t>
+              <w:t>VGG-16 Transfer Learning</w:t>
             </w:r>
           </w:p>
         </w:tc>
@@ -1039,10 +1249,10 @@
             <w:tcW w:type="dxa" w:w="1584"/>
             <w:vAlign w:val="center"/>
             <w:tcMar>
-              <w:top w:w="40" w:type="dxa"/>
-              <w:bottom w:w="40" w:type="dxa"/>
-              <w:left w:w="50" w:type="dxa"/>
-              <w:right w:w="50" w:type="dxa"/>
+              <w:top w:w="35" w:type="dxa"/>
+              <w:bottom w:w="35" w:type="dxa"/>
+              <w:left w:w="45" w:type="dxa"/>
+              <w:right w:w="45" w:type="dxa"/>
             </w:tcMar>
             <w:shd w:fill="FFFFFF"/>
           </w:tcPr>
@@ -1054,9 +1264,9 @@
             <w:r>
               <w:rPr>
                 <w:rFonts w:ascii="Times New Roman" w:hAnsi="Times New Roman"/>
-                <w:sz w:val="16"/>
+                <w:sz w:val="15"/>
               </w:rPr>
-              <w:t>Acc: 70.3%</w:t>
+              <w:t>Acc: 95.0%, F1: 0.95</w:t>
             </w:r>
           </w:p>
         </w:tc>
@@ -1065,10 +1275,10 @@
             <w:tcW w:type="dxa" w:w="2376"/>
             <w:vAlign w:val="center"/>
             <w:tcMar>
-              <w:top w:w="40" w:type="dxa"/>
-              <w:bottom w:w="40" w:type="dxa"/>
-              <w:left w:w="50" w:type="dxa"/>
-              <w:right w:w="50" w:type="dxa"/>
+              <w:top w:w="35" w:type="dxa"/>
+              <w:bottom w:w="35" w:type="dxa"/>
+              <w:left w:w="45" w:type="dxa"/>
+              <w:right w:w="45" w:type="dxa"/>
             </w:tcMar>
             <w:shd w:fill="FFFFFF"/>
           </w:tcPr>
@@ -1080,9 +1290,9 @@
             <w:r>
               <w:rPr>
                 <w:rFonts w:ascii="Times New Roman" w:hAnsi="Times New Roman"/>
-                <w:sz w:val="16"/>
+                <w:sz w:val="15"/>
               </w:rPr>
-              <w:t>Confined scanner bore triggers sensory panic in young children.</w:t>
+              <w:t>Ethnoracial disparity examined; limited to single geographic cohort.</w:t>
             </w:r>
           </w:p>
         </w:tc>
@@ -1093,10 +1303,10 @@
             <w:tcW w:type="dxa" w:w="1872"/>
             <w:vAlign w:val="center"/>
             <w:tcMar>
-              <w:top w:w="40" w:type="dxa"/>
-              <w:bottom w:w="40" w:type="dxa"/>
-              <w:left w:w="50" w:type="dxa"/>
-              <w:right w:w="50" w:type="dxa"/>
+              <w:top w:w="35" w:type="dxa"/>
+              <w:bottom w:w="35" w:type="dxa"/>
+              <w:left w:w="45" w:type="dxa"/>
+              <w:right w:w="45" w:type="dxa"/>
             </w:tcMar>
             <w:shd w:fill="FFFFFF"/>
           </w:tcPr>
@@ -1108,9 +1318,9 @@
             <w:r>
               <w:rPr>
                 <w:rFonts w:ascii="Times New Roman" w:hAnsi="Times New Roman"/>
-                <w:sz w:val="16"/>
+                <w:sz w:val="15"/>
               </w:rPr>
-              <w:t>Sun et al. (2020) [11]</w:t>
+              <w:t>Akter et al. (2021) [4]</w:t>
             </w:r>
           </w:p>
         </w:tc>
@@ -1119,10 +1329,10 @@
             <w:tcW w:type="dxa" w:w="1008"/>
             <w:vAlign w:val="center"/>
             <w:tcMar>
-              <w:top w:w="40" w:type="dxa"/>
-              <w:bottom w:w="40" w:type="dxa"/>
-              <w:left w:w="50" w:type="dxa"/>
-              <w:right w:w="50" w:type="dxa"/>
+              <w:top w:w="35" w:type="dxa"/>
+              <w:bottom w:w="35" w:type="dxa"/>
+              <w:left w:w="45" w:type="dxa"/>
+              <w:right w:w="45" w:type="dxa"/>
             </w:tcMar>
             <w:shd w:fill="FFFFFF"/>
           </w:tcPr>
@@ -1134,9 +1344,9 @@
             <w:r>
               <w:rPr>
                 <w:rFonts w:ascii="Times New Roman" w:hAnsi="Times New Roman"/>
-                <w:sz w:val="16"/>
+                <w:sz w:val="15"/>
               </w:rPr>
-              <w:t>rs-fMRI</w:t>
+              <w:t>2D Photos</w:t>
             </w:r>
           </w:p>
         </w:tc>
@@ -1145,10 +1355,10 @@
             <w:tcW w:type="dxa" w:w="1584"/>
             <w:vAlign w:val="center"/>
             <w:tcMar>
-              <w:top w:w="40" w:type="dxa"/>
-              <w:bottom w:w="40" w:type="dxa"/>
-              <w:left w:w="50" w:type="dxa"/>
-              <w:right w:w="50" w:type="dxa"/>
+              <w:top w:w="35" w:type="dxa"/>
+              <w:bottom w:w="35" w:type="dxa"/>
+              <w:left w:w="45" w:type="dxa"/>
+              <w:right w:w="45" w:type="dxa"/>
             </w:tcMar>
             <w:shd w:fill="FFFFFF"/>
           </w:tcPr>
@@ -1160,9 +1370,9 @@
             <w:r>
               <w:rPr>
                 <w:rFonts w:ascii="Times New Roman" w:hAnsi="Times New Roman"/>
-                <w:sz w:val="16"/>
+                <w:sz w:val="15"/>
               </w:rPr>
-              <w:t>ABIDE-I (N=1,035)</w:t>
+              <w:t>Kaggle ASD (N=2,936)</w:t>
             </w:r>
           </w:p>
         </w:tc>
@@ -1171,10 +1381,10 @@
             <w:tcW w:type="dxa" w:w="2016"/>
             <w:vAlign w:val="center"/>
             <w:tcMar>
-              <w:top w:w="40" w:type="dxa"/>
-              <w:bottom w:w="40" w:type="dxa"/>
-              <w:left w:w="50" w:type="dxa"/>
-              <w:right w:w="50" w:type="dxa"/>
+              <w:top w:w="35" w:type="dxa"/>
+              <w:bottom w:w="35" w:type="dxa"/>
+              <w:left w:w="45" w:type="dxa"/>
+              <w:right w:w="45" w:type="dxa"/>
             </w:tcMar>
             <w:shd w:fill="FFFFFF"/>
           </w:tcPr>
@@ -1186,9 +1396,9 @@
             <w:r>
               <w:rPr>
                 <w:rFonts w:ascii="Times New Roman" w:hAnsi="Times New Roman"/>
-                <w:sz w:val="16"/>
+                <w:sz w:val="15"/>
               </w:rPr>
-              <w:t>MIDA Domain Adaptation</w:t>
+              <w:t>MobileNet-V1 + K-Means Clustering</w:t>
             </w:r>
           </w:p>
         </w:tc>
@@ -1197,10 +1407,10 @@
             <w:tcW w:type="dxa" w:w="1584"/>
             <w:vAlign w:val="center"/>
             <w:tcMar>
-              <w:top w:w="40" w:type="dxa"/>
-              <w:bottom w:w="40" w:type="dxa"/>
-              <w:left w:w="50" w:type="dxa"/>
-              <w:right w:w="50" w:type="dxa"/>
+              <w:top w:w="35" w:type="dxa"/>
+              <w:bottom w:w="35" w:type="dxa"/>
+              <w:left w:w="45" w:type="dxa"/>
+              <w:right w:w="45" w:type="dxa"/>
             </w:tcMar>
             <w:shd w:fill="FFFFFF"/>
           </w:tcPr>
@@ -1212,9 +1422,9 @@
             <w:r>
               <w:rPr>
                 <w:rFonts w:ascii="Times New Roman" w:hAnsi="Times New Roman"/>
-                <w:sz w:val="16"/>
+                <w:sz w:val="15"/>
               </w:rPr>
-              <w:t>Acc: 72.0%, AUROC: 78.6%</w:t>
+              <w:t>Acc: 90.67%</w:t>
             </w:r>
           </w:p>
         </w:tc>
@@ -1223,10 +1433,10 @@
             <w:tcW w:type="dxa" w:w="2376"/>
             <w:vAlign w:val="center"/>
             <w:tcMar>
-              <w:top w:w="40" w:type="dxa"/>
-              <w:bottom w:w="40" w:type="dxa"/>
-              <w:left w:w="50" w:type="dxa"/>
-              <w:right w:w="50" w:type="dxa"/>
+              <w:top w:w="35" w:type="dxa"/>
+              <w:bottom w:w="35" w:type="dxa"/>
+              <w:left w:w="45" w:type="dxa"/>
+              <w:right w:w="45" w:type="dxa"/>
             </w:tcMar>
             <w:shd w:fill="FFFFFF"/>
           </w:tcPr>
@@ -1238,9 +1448,9 @@
             <w:r>
               <w:rPr>
                 <w:rFonts w:ascii="Times New Roman" w:hAnsi="Times New Roman"/>
-                <w:sz w:val="16"/>
+                <w:sz w:val="15"/>
               </w:rPr>
-              <w:t>High equipment costs ($1–3M); restricted to tertiary academic centers.</w:t>
+              <w:t>Subtype clustering exploratory; unstandardized face alignment.</w:t>
             </w:r>
           </w:p>
         </w:tc>
@@ -1251,10 +1461,10 @@
             <w:tcW w:type="dxa" w:w="1872"/>
             <w:vAlign w:val="center"/>
             <w:tcMar>
-              <w:top w:w="40" w:type="dxa"/>
-              <w:bottom w:w="40" w:type="dxa"/>
-              <w:left w:w="50" w:type="dxa"/>
-              <w:right w:w="50" w:type="dxa"/>
+              <w:top w:w="35" w:type="dxa"/>
+              <w:bottom w:w="35" w:type="dxa"/>
+              <w:left w:w="45" w:type="dxa"/>
+              <w:right w:w="45" w:type="dxa"/>
             </w:tcMar>
             <w:shd w:fill="FFFFFF"/>
           </w:tcPr>
@@ -1266,9 +1476,9 @@
             <w:r>
               <w:rPr>
                 <w:rFonts w:ascii="Times New Roman" w:hAnsi="Times New Roman"/>
-                <w:sz w:val="16"/>
+                <w:sz w:val="15"/>
               </w:rPr>
-              <w:t>Singh et al. (2024) [6]</w:t>
+              <w:t>Mujeeb Rahman et al. (2022) [2]</w:t>
             </w:r>
           </w:p>
         </w:tc>
@@ -1277,10 +1487,10 @@
             <w:tcW w:type="dxa" w:w="1008"/>
             <w:vAlign w:val="center"/>
             <w:tcMar>
-              <w:top w:w="40" w:type="dxa"/>
-              <w:bottom w:w="40" w:type="dxa"/>
-              <w:left w:w="50" w:type="dxa"/>
-              <w:right w:w="50" w:type="dxa"/>
+              <w:top w:w="35" w:type="dxa"/>
+              <w:bottom w:w="35" w:type="dxa"/>
+              <w:left w:w="45" w:type="dxa"/>
+              <w:right w:w="45" w:type="dxa"/>
             </w:tcMar>
             <w:shd w:fill="FFFFFF"/>
           </w:tcPr>
@@ -1292,9 +1502,9 @@
             <w:r>
               <w:rPr>
                 <w:rFonts w:ascii="Times New Roman" w:hAnsi="Times New Roman"/>
-                <w:sz w:val="16"/>
+                <w:sz w:val="15"/>
               </w:rPr>
-              <w:t>rs-fMRI</w:t>
+              <w:t>2D Photos</w:t>
             </w:r>
           </w:p>
         </w:tc>
@@ -1303,10 +1513,10 @@
             <w:tcW w:type="dxa" w:w="1584"/>
             <w:vAlign w:val="center"/>
             <w:tcMar>
-              <w:top w:w="40" w:type="dxa"/>
-              <w:bottom w:w="40" w:type="dxa"/>
-              <w:left w:w="50" w:type="dxa"/>
-              <w:right w:w="50" w:type="dxa"/>
+              <w:top w:w="35" w:type="dxa"/>
+              <w:bottom w:w="35" w:type="dxa"/>
+              <w:left w:w="45" w:type="dxa"/>
+              <w:right w:w="45" w:type="dxa"/>
             </w:tcMar>
             <w:shd w:fill="FFFFFF"/>
           </w:tcPr>
@@ -1318,9 +1528,9 @@
             <w:r>
               <w:rPr>
                 <w:rFonts w:ascii="Times New Roman" w:hAnsi="Times New Roman"/>
-                <w:sz w:val="16"/>
+                <w:sz w:val="15"/>
               </w:rPr>
-              <w:t>ABIDE-I (N=1,035)</w:t>
+              <w:t>Static Facial (N=2,936)</w:t>
             </w:r>
           </w:p>
         </w:tc>
@@ -1329,10 +1539,10 @@
             <w:tcW w:type="dxa" w:w="2016"/>
             <w:vAlign w:val="center"/>
             <w:tcMar>
-              <w:top w:w="40" w:type="dxa"/>
-              <w:bottom w:w="40" w:type="dxa"/>
-              <w:left w:w="50" w:type="dxa"/>
-              <w:right w:w="50" w:type="dxa"/>
+              <w:top w:w="35" w:type="dxa"/>
+              <w:bottom w:w="35" w:type="dxa"/>
+              <w:left w:w="45" w:type="dxa"/>
+              <w:right w:w="45" w:type="dxa"/>
             </w:tcMar>
             <w:shd w:fill="FFFFFF"/>
           </w:tcPr>
@@ -1344,9 +1554,9 @@
             <w:r>
               <w:rPr>
                 <w:rFonts w:ascii="Times New Roman" w:hAnsi="Times New Roman"/>
-                <w:sz w:val="16"/>
+                <w:sz w:val="15"/>
               </w:rPr>
-              <w:t>TFCE + Domain Adaptation + SVM</w:t>
+              <w:t>Xception / EfficientNet-B0–B2</w:t>
             </w:r>
           </w:p>
         </w:tc>
@@ -1355,10 +1565,10 @@
             <w:tcW w:type="dxa" w:w="1584"/>
             <w:vAlign w:val="center"/>
             <w:tcMar>
-              <w:top w:w="40" w:type="dxa"/>
-              <w:bottom w:w="40" w:type="dxa"/>
-              <w:left w:w="50" w:type="dxa"/>
-              <w:right w:w="50" w:type="dxa"/>
+              <w:top w:w="35" w:type="dxa"/>
+              <w:bottom w:w="35" w:type="dxa"/>
+              <w:left w:w="45" w:type="dxa"/>
+              <w:right w:w="45" w:type="dxa"/>
             </w:tcMar>
             <w:shd w:fill="FFFFFF"/>
           </w:tcPr>
@@ -1370,9 +1580,9 @@
             <w:r>
               <w:rPr>
                 <w:rFonts w:ascii="Times New Roman" w:hAnsi="Times New Roman"/>
-                <w:sz w:val="16"/>
+                <w:sz w:val="15"/>
               </w:rPr>
-              <w:t>Acc: 78.1%, AUROC: 83.9%</w:t>
+              <w:t>AUC: 96.63%, Sens: 88.5%</w:t>
             </w:r>
           </w:p>
         </w:tc>
@@ -1381,10 +1591,10 @@
             <w:tcW w:type="dxa" w:w="2376"/>
             <w:vAlign w:val="center"/>
             <w:tcMar>
-              <w:top w:w="40" w:type="dxa"/>
-              <w:bottom w:w="40" w:type="dxa"/>
-              <w:left w:w="50" w:type="dxa"/>
-              <w:right w:w="50" w:type="dxa"/>
+              <w:top w:w="35" w:type="dxa"/>
+              <w:bottom w:w="35" w:type="dxa"/>
+              <w:left w:w="45" w:type="dxa"/>
+              <w:right w:w="45" w:type="dxa"/>
             </w:tcMar>
             <w:shd w:fill="FFFFFF"/>
           </w:tcPr>
@@ -1396,9 +1606,9 @@
             <w:r>
               <w:rPr>
                 <w:rFonts w:ascii="Times New Roman" w:hAnsi="Times New Roman"/>
-                <w:sz w:val="16"/>
+                <w:sz w:val="15"/>
               </w:rPr>
-              <w:t>Hospital-bound neuroimaging; acoustic noise prevents routine community triage.</w:t>
+              <w:t>Evaluated on static images without standardized multi-center cross-testing.</w:t>
             </w:r>
           </w:p>
         </w:tc>
@@ -1409,10 +1619,10 @@
             <w:tcW w:type="dxa" w:w="1872"/>
             <w:vAlign w:val="center"/>
             <w:tcMar>
-              <w:top w:w="40" w:type="dxa"/>
-              <w:bottom w:w="40" w:type="dxa"/>
-              <w:left w:w="50" w:type="dxa"/>
-              <w:right w:w="50" w:type="dxa"/>
+              <w:top w:w="35" w:type="dxa"/>
+              <w:bottom w:w="35" w:type="dxa"/>
+              <w:left w:w="45" w:type="dxa"/>
+              <w:right w:w="45" w:type="dxa"/>
             </w:tcMar>
             <w:shd w:fill="FFFFFF"/>
           </w:tcPr>
@@ -1424,9 +1634,9 @@
             <w:r>
               <w:rPr>
                 <w:rFonts w:ascii="Times New Roman" w:hAnsi="Times New Roman"/>
-                <w:sz w:val="16"/>
+                <w:sz w:val="15"/>
               </w:rPr>
-              <w:t>Ahmad et al. (2024) [10]</w:t>
+              <w:t>Awaji et al. (2023) [12]</w:t>
             </w:r>
           </w:p>
         </w:tc>
@@ -1435,10 +1645,10 @@
             <w:tcW w:type="dxa" w:w="1008"/>
             <w:vAlign w:val="center"/>
             <w:tcMar>
-              <w:top w:w="40" w:type="dxa"/>
-              <w:bottom w:w="40" w:type="dxa"/>
-              <w:left w:w="50" w:type="dxa"/>
-              <w:right w:w="50" w:type="dxa"/>
+              <w:top w:w="35" w:type="dxa"/>
+              <w:bottom w:w="35" w:type="dxa"/>
+              <w:left w:w="45" w:type="dxa"/>
+              <w:right w:w="45" w:type="dxa"/>
             </w:tcMar>
             <w:shd w:fill="FFFFFF"/>
           </w:tcPr>
@@ -1450,7 +1660,7 @@
             <w:r>
               <w:rPr>
                 <w:rFonts w:ascii="Times New Roman" w:hAnsi="Times New Roman"/>
-                <w:sz w:val="16"/>
+                <w:sz w:val="15"/>
               </w:rPr>
               <w:t>2D Photos</w:t>
             </w:r>
@@ -1461,10 +1671,10 @@
             <w:tcW w:type="dxa" w:w="1584"/>
             <w:vAlign w:val="center"/>
             <w:tcMar>
-              <w:top w:w="40" w:type="dxa"/>
-              <w:bottom w:w="40" w:type="dxa"/>
-              <w:left w:w="50" w:type="dxa"/>
-              <w:right w:w="50" w:type="dxa"/>
+              <w:top w:w="35" w:type="dxa"/>
+              <w:bottom w:w="35" w:type="dxa"/>
+              <w:left w:w="45" w:type="dxa"/>
+              <w:right w:w="45" w:type="dxa"/>
             </w:tcMar>
             <w:shd w:fill="FFFFFF"/>
           </w:tcPr>
@@ -1476,9 +1686,9 @@
             <w:r>
               <w:rPr>
                 <w:rFonts w:ascii="Times New Roman" w:hAnsi="Times New Roman"/>
-                <w:sz w:val="16"/>
+                <w:sz w:val="15"/>
               </w:rPr>
-              <w:t>Kaggle ASD (N=2,940)</w:t>
+              <w:t>Multi-Feature (N=2,940)</w:t>
             </w:r>
           </w:p>
         </w:tc>
@@ -1487,10 +1697,10 @@
             <w:tcW w:type="dxa" w:w="2016"/>
             <w:vAlign w:val="center"/>
             <w:tcMar>
-              <w:top w:w="40" w:type="dxa"/>
-              <w:bottom w:w="40" w:type="dxa"/>
-              <w:left w:w="50" w:type="dxa"/>
-              <w:right w:w="50" w:type="dxa"/>
+              <w:top w:w="35" w:type="dxa"/>
+              <w:bottom w:w="35" w:type="dxa"/>
+              <w:left w:w="45" w:type="dxa"/>
+              <w:right w:w="45" w:type="dxa"/>
             </w:tcMar>
             <w:shd w:fill="FFFFFF"/>
           </w:tcPr>
@@ -1502,9 +1712,9 @@
             <w:r>
               <w:rPr>
                 <w:rFonts w:ascii="Times New Roman" w:hAnsi="Times New Roman"/>
-                <w:sz w:val="16"/>
+                <w:sz w:val="15"/>
               </w:rPr>
-              <w:t>Pretrained CNNs (ResNet50, VGG19)</w:t>
+              <w:t>VGG16 + ResNet101 + MobileNet + RF</w:t>
             </w:r>
           </w:p>
         </w:tc>
@@ -1513,10 +1723,10 @@
             <w:tcW w:type="dxa" w:w="1584"/>
             <w:vAlign w:val="center"/>
             <w:tcMar>
-              <w:top w:w="40" w:type="dxa"/>
-              <w:bottom w:w="40" w:type="dxa"/>
-              <w:left w:w="50" w:type="dxa"/>
-              <w:right w:w="50" w:type="dxa"/>
+              <w:top w:w="35" w:type="dxa"/>
+              <w:bottom w:w="35" w:type="dxa"/>
+              <w:left w:w="45" w:type="dxa"/>
+              <w:right w:w="45" w:type="dxa"/>
             </w:tcMar>
             <w:shd w:fill="FFFFFF"/>
           </w:tcPr>
@@ -1528,9 +1738,9 @@
             <w:r>
               <w:rPr>
                 <w:rFonts w:ascii="Times New Roman" w:hAnsi="Times New Roman"/>
-                <w:sz w:val="16"/>
+                <w:sz w:val="15"/>
               </w:rPr>
-              <w:t>Acc: 87.0%, Prec: 93.0%</w:t>
+              <w:t>Acc: 98.8%, AUC: 99.25%</w:t>
             </w:r>
           </w:p>
         </w:tc>
@@ -1539,10 +1749,10 @@
             <w:tcW w:type="dxa" w:w="2376"/>
             <w:vAlign w:val="center"/>
             <w:tcMar>
-              <w:top w:w="40" w:type="dxa"/>
-              <w:bottom w:w="40" w:type="dxa"/>
-              <w:left w:w="50" w:type="dxa"/>
-              <w:right w:w="50" w:type="dxa"/>
+              <w:top w:w="35" w:type="dxa"/>
+              <w:bottom w:w="35" w:type="dxa"/>
+              <w:left w:w="45" w:type="dxa"/>
+              <w:right w:w="45" w:type="dxa"/>
             </w:tcMar>
             <w:shd w:fill="FFFFFF"/>
           </w:tcPr>
@@ -1554,9 +1764,9 @@
             <w:r>
               <w:rPr>
                 <w:rFonts w:ascii="Times New Roman" w:hAnsi="Times New Roman"/>
-                <w:sz w:val="16"/>
+                <w:sz w:val="15"/>
               </w:rPr>
-              <w:t>Evaluated on smaller random split; lacked AUROC/Sensitivity/Specificity profiling.</w:t>
+              <w:t>Complex multi-backbone feature fusion; substantial memory footprint.</w:t>
             </w:r>
           </w:p>
         </w:tc>
@@ -1567,10 +1777,484 @@
             <w:tcW w:type="dxa" w:w="1872"/>
             <w:vAlign w:val="center"/>
             <w:tcMar>
-              <w:top w:w="40" w:type="dxa"/>
-              <w:bottom w:w="40" w:type="dxa"/>
-              <w:left w:w="50" w:type="dxa"/>
-              <w:right w:w="50" w:type="dxa"/>
+              <w:top w:w="35" w:type="dxa"/>
+              <w:bottom w:w="35" w:type="dxa"/>
+              <w:left w:w="45" w:type="dxa"/>
+              <w:right w:w="45" w:type="dxa"/>
+            </w:tcMar>
+            <w:shd w:fill="FFFFFF"/>
+          </w:tcPr>
+          <w:p>
+            <w:pPr>
+              <w:spacing w:before="0" w:after="0" w:line="240" w:lineRule="auto"/>
+              <w:jc w:val="left"/>
+            </w:pPr>
+            <w:r>
+              <w:rPr>
+                <w:rFonts w:ascii="Times New Roman" w:hAnsi="Times New Roman"/>
+                <w:sz w:val="15"/>
+              </w:rPr>
+              <w:t>Khan et al. (2024) [11]</w:t>
+            </w:r>
+          </w:p>
+        </w:tc>
+        <w:tc>
+          <w:tcPr>
+            <w:tcW w:type="dxa" w:w="1008"/>
+            <w:vAlign w:val="center"/>
+            <w:tcMar>
+              <w:top w:w="35" w:type="dxa"/>
+              <w:bottom w:w="35" w:type="dxa"/>
+              <w:left w:w="45" w:type="dxa"/>
+              <w:right w:w="45" w:type="dxa"/>
+            </w:tcMar>
+            <w:shd w:fill="FFFFFF"/>
+          </w:tcPr>
+          <w:p>
+            <w:pPr>
+              <w:spacing w:before="0" w:after="0" w:line="240" w:lineRule="auto"/>
+              <w:jc w:val="left"/>
+            </w:pPr>
+            <w:r>
+              <w:rPr>
+                <w:rFonts w:ascii="Times New Roman" w:hAnsi="Times New Roman"/>
+                <w:sz w:val="15"/>
+              </w:rPr>
+              <w:t>2D Photos</w:t>
+            </w:r>
+          </w:p>
+        </w:tc>
+        <w:tc>
+          <w:tcPr>
+            <w:tcW w:type="dxa" w:w="1584"/>
+            <w:vAlign w:val="center"/>
+            <w:tcMar>
+              <w:top w:w="35" w:type="dxa"/>
+              <w:bottom w:w="35" w:type="dxa"/>
+              <w:left w:w="45" w:type="dxa"/>
+              <w:right w:w="45" w:type="dxa"/>
+            </w:tcMar>
+            <w:shd w:fill="FFFFFF"/>
+          </w:tcPr>
+          <w:p>
+            <w:pPr>
+              <w:spacing w:before="0" w:after="0" w:line="240" w:lineRule="auto"/>
+              <w:jc w:val="left"/>
+            </w:pPr>
+            <w:r>
+              <w:rPr>
+                <w:rFonts w:ascii="Times New Roman" w:hAnsi="Times New Roman"/>
+                <w:sz w:val="15"/>
+              </w:rPr>
+              <w:t>Kaggle ASD (N=2,940)</w:t>
+            </w:r>
+          </w:p>
+        </w:tc>
+        <w:tc>
+          <w:tcPr>
+            <w:tcW w:type="dxa" w:w="2016"/>
+            <w:vAlign w:val="center"/>
+            <w:tcMar>
+              <w:top w:w="35" w:type="dxa"/>
+              <w:bottom w:w="35" w:type="dxa"/>
+              <w:left w:w="45" w:type="dxa"/>
+              <w:right w:w="45" w:type="dxa"/>
+            </w:tcMar>
+            <w:shd w:fill="FFFFFF"/>
+          </w:tcPr>
+          <w:p>
+            <w:pPr>
+              <w:spacing w:before="0" w:after="0" w:line="240" w:lineRule="auto"/>
+              <w:jc w:val="left"/>
+            </w:pPr>
+            <w:r>
+              <w:rPr>
+                <w:rFonts w:ascii="Times New Roman" w:hAnsi="Times New Roman"/>
+                <w:sz w:val="15"/>
+              </w:rPr>
+              <w:t>DenseNet121, ResNet50, MobileNetV2</w:t>
+            </w:r>
+          </w:p>
+        </w:tc>
+        <w:tc>
+          <w:tcPr>
+            <w:tcW w:type="dxa" w:w="1584"/>
+            <w:vAlign w:val="center"/>
+            <w:tcMar>
+              <w:top w:w="35" w:type="dxa"/>
+              <w:bottom w:w="35" w:type="dxa"/>
+              <w:left w:w="45" w:type="dxa"/>
+              <w:right w:w="45" w:type="dxa"/>
+            </w:tcMar>
+            <w:shd w:fill="FFFFFF"/>
+          </w:tcPr>
+          <w:p>
+            <w:pPr>
+              <w:spacing w:before="0" w:after="0" w:line="240" w:lineRule="auto"/>
+              <w:jc w:val="left"/>
+            </w:pPr>
+            <w:r>
+              <w:rPr>
+                <w:rFonts w:ascii="Times New Roman" w:hAnsi="Times New Roman"/>
+                <w:sz w:val="15"/>
+              </w:rPr>
+              <w:t>Acc: 96.0%, Prec: 99.0%</w:t>
+            </w:r>
+          </w:p>
+        </w:tc>
+        <w:tc>
+          <w:tcPr>
+            <w:tcW w:type="dxa" w:w="2376"/>
+            <w:vAlign w:val="center"/>
+            <w:tcMar>
+              <w:top w:w="35" w:type="dxa"/>
+              <w:bottom w:w="35" w:type="dxa"/>
+              <w:left w:w="45" w:type="dxa"/>
+              <w:right w:w="45" w:type="dxa"/>
+            </w:tcMar>
+            <w:shd w:fill="FFFFFF"/>
+          </w:tcPr>
+          <w:p>
+            <w:pPr>
+              <w:spacing w:before="0" w:after="0" w:line="240" w:lineRule="auto"/>
+              <w:jc w:val="left"/>
+            </w:pPr>
+            <w:r>
+              <w:rPr>
+                <w:rFonts w:ascii="Times New Roman" w:hAnsi="Times New Roman"/>
+                <w:sz w:val="15"/>
+              </w:rPr>
+              <w:t>Random split; lacked latency quantification for point-of-care triage.</w:t>
+            </w:r>
+          </w:p>
+        </w:tc>
+      </w:tr>
+      <w:tr>
+        <w:tc>
+          <w:tcPr>
+            <w:tcW w:type="dxa" w:w="1872"/>
+            <w:vAlign w:val="center"/>
+            <w:tcMar>
+              <w:top w:w="35" w:type="dxa"/>
+              <w:bottom w:w="35" w:type="dxa"/>
+              <w:left w:w="45" w:type="dxa"/>
+              <w:right w:w="45" w:type="dxa"/>
+            </w:tcMar>
+            <w:shd w:fill="FFFFFF"/>
+          </w:tcPr>
+          <w:p>
+            <w:pPr>
+              <w:spacing w:before="0" w:after="0" w:line="240" w:lineRule="auto"/>
+              <w:jc w:val="left"/>
+            </w:pPr>
+            <w:r>
+              <w:rPr>
+                <w:rFonts w:ascii="Times New Roman" w:hAnsi="Times New Roman"/>
+                <w:sz w:val="15"/>
+              </w:rPr>
+              <w:t>Kaur et al. (2026) [15]</w:t>
+            </w:r>
+          </w:p>
+        </w:tc>
+        <w:tc>
+          <w:tcPr>
+            <w:tcW w:type="dxa" w:w="1008"/>
+            <w:vAlign w:val="center"/>
+            <w:tcMar>
+              <w:top w:w="35" w:type="dxa"/>
+              <w:bottom w:w="35" w:type="dxa"/>
+              <w:left w:w="45" w:type="dxa"/>
+              <w:right w:w="45" w:type="dxa"/>
+            </w:tcMar>
+            <w:shd w:fill="FFFFFF"/>
+          </w:tcPr>
+          <w:p>
+            <w:pPr>
+              <w:spacing w:before="0" w:after="0" w:line="240" w:lineRule="auto"/>
+              <w:jc w:val="left"/>
+            </w:pPr>
+            <w:r>
+              <w:rPr>
+                <w:rFonts w:ascii="Times New Roman" w:hAnsi="Times New Roman"/>
+                <w:sz w:val="15"/>
+              </w:rPr>
+              <w:t>2D Photos</w:t>
+            </w:r>
+          </w:p>
+        </w:tc>
+        <w:tc>
+          <w:tcPr>
+            <w:tcW w:type="dxa" w:w="1584"/>
+            <w:vAlign w:val="center"/>
+            <w:tcMar>
+              <w:top w:w="35" w:type="dxa"/>
+              <w:bottom w:w="35" w:type="dxa"/>
+              <w:left w:w="45" w:type="dxa"/>
+              <w:right w:w="45" w:type="dxa"/>
+            </w:tcMar>
+            <w:shd w:fill="FFFFFF"/>
+          </w:tcPr>
+          <w:p>
+            <w:pPr>
+              <w:spacing w:before="0" w:after="0" w:line="240" w:lineRule="auto"/>
+              <w:jc w:val="left"/>
+            </w:pPr>
+            <w:r>
+              <w:rPr>
+                <w:rFonts w:ascii="Times New Roman" w:hAnsi="Times New Roman"/>
+                <w:sz w:val="15"/>
+              </w:rPr>
+              <w:t>Kaggle ASD (N=2,936)</w:t>
+            </w:r>
+          </w:p>
+        </w:tc>
+        <w:tc>
+          <w:tcPr>
+            <w:tcW w:type="dxa" w:w="2016"/>
+            <w:vAlign w:val="center"/>
+            <w:tcMar>
+              <w:top w:w="35" w:type="dxa"/>
+              <w:bottom w:w="35" w:type="dxa"/>
+              <w:left w:w="45" w:type="dxa"/>
+              <w:right w:w="45" w:type="dxa"/>
+            </w:tcMar>
+            <w:shd w:fill="FFFFFF"/>
+          </w:tcPr>
+          <w:p>
+            <w:pPr>
+              <w:spacing w:before="0" w:after="0" w:line="240" w:lineRule="auto"/>
+              <w:jc w:val="left"/>
+            </w:pPr>
+            <w:r>
+              <w:rPr>
+                <w:rFonts w:ascii="Times New Roman" w:hAnsi="Times New Roman"/>
+                <w:sz w:val="15"/>
+              </w:rPr>
+              <w:t>Modified HOG + Multichannel CNN</w:t>
+            </w:r>
+          </w:p>
+        </w:tc>
+        <w:tc>
+          <w:tcPr>
+            <w:tcW w:type="dxa" w:w="1584"/>
+            <w:vAlign w:val="center"/>
+            <w:tcMar>
+              <w:top w:w="35" w:type="dxa"/>
+              <w:bottom w:w="35" w:type="dxa"/>
+              <w:left w:w="45" w:type="dxa"/>
+              <w:right w:w="45" w:type="dxa"/>
+            </w:tcMar>
+            <w:shd w:fill="FFFFFF"/>
+          </w:tcPr>
+          <w:p>
+            <w:pPr>
+              <w:spacing w:before="0" w:after="0" w:line="240" w:lineRule="auto"/>
+              <w:jc w:val="left"/>
+            </w:pPr>
+            <w:r>
+              <w:rPr>
+                <w:rFonts w:ascii="Times New Roman" w:hAnsi="Times New Roman"/>
+                <w:sz w:val="15"/>
+              </w:rPr>
+              <w:t>Acc: 96.2%, Val: 98.0%</w:t>
+            </w:r>
+          </w:p>
+        </w:tc>
+        <w:tc>
+          <w:tcPr>
+            <w:tcW w:type="dxa" w:w="2376"/>
+            <w:vAlign w:val="center"/>
+            <w:tcMar>
+              <w:top w:w="35" w:type="dxa"/>
+              <w:bottom w:w="35" w:type="dxa"/>
+              <w:left w:w="45" w:type="dxa"/>
+              <w:right w:w="45" w:type="dxa"/>
+            </w:tcMar>
+            <w:shd w:fill="FFFFFF"/>
+          </w:tcPr>
+          <w:p>
+            <w:pPr>
+              <w:spacing w:before="0" w:after="0" w:line="240" w:lineRule="auto"/>
+              <w:jc w:val="left"/>
+            </w:pPr>
+            <w:r>
+              <w:rPr>
+                <w:rFonts w:ascii="Times New Roman" w:hAnsi="Times New Roman"/>
+                <w:sz w:val="15"/>
+              </w:rPr>
+              <w:t>Manual HOG hand-crafted feature extraction overhead.</w:t>
+            </w:r>
+          </w:p>
+        </w:tc>
+      </w:tr>
+      <w:tr>
+        <w:tc>
+          <w:tcPr>
+            <w:tcW w:type="dxa" w:w="1872"/>
+            <w:vAlign w:val="center"/>
+            <w:tcMar>
+              <w:top w:w="35" w:type="dxa"/>
+              <w:bottom w:w="35" w:type="dxa"/>
+              <w:left w:w="45" w:type="dxa"/>
+              <w:right w:w="45" w:type="dxa"/>
+            </w:tcMar>
+            <w:shd w:fill="FFFFFF"/>
+          </w:tcPr>
+          <w:p>
+            <w:pPr>
+              <w:spacing w:before="0" w:after="0" w:line="240" w:lineRule="auto"/>
+              <w:jc w:val="left"/>
+            </w:pPr>
+            <w:r>
+              <w:rPr>
+                <w:rFonts w:ascii="Times New Roman" w:hAnsi="Times New Roman"/>
+                <w:sz w:val="15"/>
+              </w:rPr>
+              <w:t>Revathi et al. (2026) [3]</w:t>
+            </w:r>
+          </w:p>
+        </w:tc>
+        <w:tc>
+          <w:tcPr>
+            <w:tcW w:type="dxa" w:w="1008"/>
+            <w:vAlign w:val="center"/>
+            <w:tcMar>
+              <w:top w:w="35" w:type="dxa"/>
+              <w:bottom w:w="35" w:type="dxa"/>
+              <w:left w:w="45" w:type="dxa"/>
+              <w:right w:w="45" w:type="dxa"/>
+            </w:tcMar>
+            <w:shd w:fill="FFFFFF"/>
+          </w:tcPr>
+          <w:p>
+            <w:pPr>
+              <w:spacing w:before="0" w:after="0" w:line="240" w:lineRule="auto"/>
+              <w:jc w:val="left"/>
+            </w:pPr>
+            <w:r>
+              <w:rPr>
+                <w:rFonts w:ascii="Times New Roman" w:hAnsi="Times New Roman"/>
+                <w:sz w:val="15"/>
+              </w:rPr>
+              <w:t>2D Photos</w:t>
+            </w:r>
+          </w:p>
+        </w:tc>
+        <w:tc>
+          <w:tcPr>
+            <w:tcW w:type="dxa" w:w="1584"/>
+            <w:vAlign w:val="center"/>
+            <w:tcMar>
+              <w:top w:w="35" w:type="dxa"/>
+              <w:bottom w:w="35" w:type="dxa"/>
+              <w:left w:w="45" w:type="dxa"/>
+              <w:right w:w="45" w:type="dxa"/>
+            </w:tcMar>
+            <w:shd w:fill="FFFFFF"/>
+          </w:tcPr>
+          <w:p>
+            <w:pPr>
+              <w:spacing w:before="0" w:after="0" w:line="240" w:lineRule="auto"/>
+              <w:jc w:val="left"/>
+            </w:pPr>
+            <w:r>
+              <w:rPr>
+                <w:rFonts w:ascii="Times New Roman" w:hAnsi="Times New Roman"/>
+                <w:sz w:val="15"/>
+              </w:rPr>
+              <w:t>Kaggle ASD (N=2,940)</w:t>
+            </w:r>
+          </w:p>
+        </w:tc>
+        <w:tc>
+          <w:tcPr>
+            <w:tcW w:type="dxa" w:w="2016"/>
+            <w:vAlign w:val="center"/>
+            <w:tcMar>
+              <w:top w:w="35" w:type="dxa"/>
+              <w:bottom w:w="35" w:type="dxa"/>
+              <w:left w:w="45" w:type="dxa"/>
+              <w:right w:w="45" w:type="dxa"/>
+            </w:tcMar>
+            <w:shd w:fill="FFFFFF"/>
+          </w:tcPr>
+          <w:p>
+            <w:pPr>
+              <w:spacing w:before="0" w:after="0" w:line="240" w:lineRule="auto"/>
+              <w:jc w:val="left"/>
+            </w:pPr>
+            <w:r>
+              <w:rPr>
+                <w:rFonts w:ascii="Times New Roman" w:hAnsi="Times New Roman"/>
+                <w:sz w:val="15"/>
+              </w:rPr>
+              <w:t>ResNet-152 + CBAM + ViT-Large</w:t>
+            </w:r>
+          </w:p>
+        </w:tc>
+        <w:tc>
+          <w:tcPr>
+            <w:tcW w:type="dxa" w:w="1584"/>
+            <w:vAlign w:val="center"/>
+            <w:tcMar>
+              <w:top w:w="35" w:type="dxa"/>
+              <w:bottom w:w="35" w:type="dxa"/>
+              <w:left w:w="45" w:type="dxa"/>
+              <w:right w:w="45" w:type="dxa"/>
+            </w:tcMar>
+            <w:shd w:fill="FFFFFF"/>
+          </w:tcPr>
+          <w:p>
+            <w:pPr>
+              <w:spacing w:before="0" w:after="0" w:line="240" w:lineRule="auto"/>
+              <w:jc w:val="left"/>
+            </w:pPr>
+            <w:r>
+              <w:rPr>
+                <w:rFonts w:ascii="Times New Roman" w:hAnsi="Times New Roman"/>
+                <w:sz w:val="15"/>
+              </w:rPr>
+              <w:t>Acc: 92.0%, AUC: 96.74%</w:t>
+            </w:r>
+          </w:p>
+        </w:tc>
+        <w:tc>
+          <w:tcPr>
+            <w:tcW w:type="dxa" w:w="2376"/>
+            <w:vAlign w:val="center"/>
+            <w:tcMar>
+              <w:top w:w="35" w:type="dxa"/>
+              <w:bottom w:w="35" w:type="dxa"/>
+              <w:left w:w="45" w:type="dxa"/>
+              <w:right w:w="45" w:type="dxa"/>
+            </w:tcMar>
+            <w:shd w:fill="FFFFFF"/>
+          </w:tcPr>
+          <w:p>
+            <w:pPr>
+              <w:spacing w:before="0" w:after="0" w:line="240" w:lineRule="auto"/>
+              <w:jc w:val="left"/>
+            </w:pPr>
+            <w:r>
+              <w:rPr>
+                <w:rFonts w:ascii="Times New Roman" w:hAnsi="Times New Roman"/>
+                <w:sz w:val="15"/>
+              </w:rPr>
+              <w:t>High compute complexity requiring large transformer cross-attention.</w:t>
+            </w:r>
+          </w:p>
+        </w:tc>
+      </w:tr>
+      <w:tr>
+        <w:tc>
+          <w:tcPr>
+            <w:tcW w:type="dxa" w:w="1872"/>
+            <w:vAlign w:val="center"/>
+            <w:tcMar>
+              <w:top w:w="35" w:type="dxa"/>
+              <w:bottom w:w="35" w:type="dxa"/>
+              <w:left w:w="45" w:type="dxa"/>
+              <w:right w:w="45" w:type="dxa"/>
             </w:tcMar>
             <w:shd w:fill="F8FAFC"/>
           </w:tcPr>
@@ -1583,7 +2267,7 @@
               <w:rPr>
                 <w:rFonts w:ascii="Times New Roman" w:hAnsi="Times New Roman"/>
                 <w:b/>
-                <w:sz w:val="16"/>
+                <w:sz w:val="15"/>
               </w:rPr>
               <w:t>This Work (Proposed)</w:t>
             </w:r>
@@ -1594,10 +2278,10 @@
             <w:tcW w:type="dxa" w:w="1008"/>
             <w:vAlign w:val="center"/>
             <w:tcMar>
-              <w:top w:w="40" w:type="dxa"/>
-              <w:bottom w:w="40" w:type="dxa"/>
-              <w:left w:w="50" w:type="dxa"/>
-              <w:right w:w="50" w:type="dxa"/>
+              <w:top w:w="35" w:type="dxa"/>
+              <w:bottom w:w="35" w:type="dxa"/>
+              <w:left w:w="45" w:type="dxa"/>
+              <w:right w:w="45" w:type="dxa"/>
             </w:tcMar>
             <w:shd w:fill="F8FAFC"/>
           </w:tcPr>
@@ -1610,7 +2294,7 @@
               <w:rPr>
                 <w:rFonts w:ascii="Times New Roman" w:hAnsi="Times New Roman"/>
                 <w:b/>
-                <w:sz w:val="16"/>
+                <w:sz w:val="15"/>
               </w:rPr>
               <w:t>2D Photos</w:t>
             </w:r>
@@ -1621,10 +2305,10 @@
             <w:tcW w:type="dxa" w:w="1584"/>
             <w:vAlign w:val="center"/>
             <w:tcMar>
-              <w:top w:w="40" w:type="dxa"/>
-              <w:bottom w:w="40" w:type="dxa"/>
-              <w:left w:w="50" w:type="dxa"/>
-              <w:right w:w="50" w:type="dxa"/>
+              <w:top w:w="35" w:type="dxa"/>
+              <w:bottom w:w="35" w:type="dxa"/>
+              <w:left w:w="45" w:type="dxa"/>
+              <w:right w:w="45" w:type="dxa"/>
             </w:tcMar>
             <w:shd w:fill="F8FAFC"/>
           </w:tcPr>
@@ -1637,7 +2321,7 @@
               <w:rPr>
                 <w:rFonts w:ascii="Times New Roman" w:hAnsi="Times New Roman"/>
                 <w:b/>
-                <w:sz w:val="16"/>
+                <w:sz w:val="15"/>
               </w:rPr>
               <w:t>Multi-Center (N=5,772)</w:t>
             </w:r>
@@ -1648,10 +2332,10 @@
             <w:tcW w:type="dxa" w:w="2016"/>
             <w:vAlign w:val="center"/>
             <w:tcMar>
-              <w:top w:w="40" w:type="dxa"/>
-              <w:bottom w:w="40" w:type="dxa"/>
-              <w:left w:w="50" w:type="dxa"/>
-              <w:right w:w="50" w:type="dxa"/>
+              <w:top w:w="35" w:type="dxa"/>
+              <w:bottom w:w="35" w:type="dxa"/>
+              <w:left w:w="45" w:type="dxa"/>
+              <w:right w:w="45" w:type="dxa"/>
             </w:tcMar>
             <w:shd w:fill="F8FAFC"/>
           </w:tcPr>
@@ -1664,9 +2348,9 @@
               <w:rPr>
                 <w:rFonts w:ascii="Times New Roman" w:hAnsi="Times New Roman"/>
                 <w:b/>
-                <w:sz w:val="16"/>
+                <w:sz w:val="15"/>
               </w:rPr>
-              <w:t>Deep CNN Benchmark (ResNet-50)</w:t>
+              <w:t>Comparative Deep CNN Benchmark (ResNet-50)</w:t>
             </w:r>
           </w:p>
         </w:tc>
@@ -1675,10 +2359,10 @@
             <w:tcW w:type="dxa" w:w="1584"/>
             <w:vAlign w:val="center"/>
             <w:tcMar>
-              <w:top w:w="40" w:type="dxa"/>
-              <w:bottom w:w="40" w:type="dxa"/>
-              <w:left w:w="50" w:type="dxa"/>
-              <w:right w:w="50" w:type="dxa"/>
+              <w:top w:w="35" w:type="dxa"/>
+              <w:bottom w:w="35" w:type="dxa"/>
+              <w:left w:w="45" w:type="dxa"/>
+              <w:right w:w="45" w:type="dxa"/>
             </w:tcMar>
             <w:shd w:fill="F8FAFC"/>
           </w:tcPr>
@@ -1691,7 +2375,7 @@
               <w:rPr>
                 <w:rFonts w:ascii="Times New Roman" w:hAnsi="Times New Roman"/>
                 <w:b/>
-                <w:sz w:val="16"/>
+                <w:sz w:val="15"/>
               </w:rPr>
               <w:t>Acc: 82.4%, AUROC: 88.6%</w:t>
             </w:r>
@@ -1702,10 +2386,10 @@
             <w:tcW w:type="dxa" w:w="2376"/>
             <w:vAlign w:val="center"/>
             <w:tcMar>
-              <w:top w:w="40" w:type="dxa"/>
-              <w:bottom w:w="40" w:type="dxa"/>
-              <w:left w:w="50" w:type="dxa"/>
-              <w:right w:w="50" w:type="dxa"/>
+              <w:top w:w="35" w:type="dxa"/>
+              <w:bottom w:w="35" w:type="dxa"/>
+              <w:left w:w="45" w:type="dxa"/>
+              <w:right w:w="45" w:type="dxa"/>
             </w:tcMar>
             <w:shd w:fill="F8FAFC"/>
           </w:tcPr>
@@ -1718,9 +2402,9 @@
               <w:rPr>
                 <w:rFonts w:ascii="Times New Roman" w:hAnsi="Times New Roman"/>
                 <w:b/>
-                <w:sz w:val="16"/>
+                <w:sz w:val="15"/>
               </w:rPr>
-              <w:t>Non-invasive, sub-45ms latency, balanced 5,772 cohort, full clinical metric suite.</w:t>
+              <w:t>Balanced multi-center cohort (N=5,772), automated MTCNN alignment, sub-45ms latency.</w:t>
             </w:r>
           </w:p>
         </w:tc>
@@ -1817,10 +2501,10 @@
             <w:tcW w:type="dxa" w:w="1152"/>
             <w:vAlign w:val="center"/>
             <w:tcMar>
-              <w:top w:w="30" w:type="dxa"/>
-              <w:bottom w:w="30" w:type="dxa"/>
-              <w:left w:w="40" w:type="dxa"/>
-              <w:right w:w="40" w:type="dxa"/>
+              <w:top w:w="25" w:type="dxa"/>
+              <w:bottom w:w="25" w:type="dxa"/>
+              <w:left w:w="35" w:type="dxa"/>
+              <w:right w:w="35" w:type="dxa"/>
             </w:tcMar>
             <w:shd w:fill="F1F5F9"/>
           </w:tcPr>
@@ -1844,10 +2528,10 @@
             <w:tcW w:type="dxa" w:w="1440"/>
             <w:vAlign w:val="center"/>
             <w:tcMar>
-              <w:top w:w="30" w:type="dxa"/>
-              <w:bottom w:w="30" w:type="dxa"/>
-              <w:left w:w="40" w:type="dxa"/>
-              <w:right w:w="40" w:type="dxa"/>
+              <w:top w:w="25" w:type="dxa"/>
+              <w:bottom w:w="25" w:type="dxa"/>
+              <w:left w:w="35" w:type="dxa"/>
+              <w:right w:w="35" w:type="dxa"/>
             </w:tcMar>
             <w:shd w:fill="F1F5F9"/>
           </w:tcPr>
@@ -1871,10 +2555,10 @@
             <w:tcW w:type="dxa" w:w="2448"/>
             <w:vAlign w:val="center"/>
             <w:tcMar>
-              <w:top w:w="30" w:type="dxa"/>
-              <w:bottom w:w="30" w:type="dxa"/>
-              <w:left w:w="40" w:type="dxa"/>
-              <w:right w:w="40" w:type="dxa"/>
+              <w:top w:w="25" w:type="dxa"/>
+              <w:bottom w:w="25" w:type="dxa"/>
+              <w:left w:w="35" w:type="dxa"/>
+              <w:right w:w="35" w:type="dxa"/>
             </w:tcMar>
             <w:shd w:fill="F1F5F9"/>
           </w:tcPr>
@@ -1900,10 +2584,10 @@
             <w:tcW w:type="dxa" w:w="1152"/>
             <w:vAlign w:val="center"/>
             <w:tcMar>
-              <w:top w:w="30" w:type="dxa"/>
-              <w:bottom w:w="30" w:type="dxa"/>
-              <w:left w:w="40" w:type="dxa"/>
-              <w:right w:w="40" w:type="dxa"/>
+              <w:top w:w="25" w:type="dxa"/>
+              <w:bottom w:w="25" w:type="dxa"/>
+              <w:left w:w="35" w:type="dxa"/>
+              <w:right w:w="35" w:type="dxa"/>
             </w:tcMar>
             <w:shd w:fill="FFFFFF"/>
           </w:tcPr>
@@ -1927,10 +2611,10 @@
             <w:tcW w:type="dxa" w:w="1440"/>
             <w:vAlign w:val="center"/>
             <w:tcMar>
-              <w:top w:w="30" w:type="dxa"/>
-              <w:bottom w:w="30" w:type="dxa"/>
-              <w:left w:w="40" w:type="dxa"/>
-              <w:right w:w="40" w:type="dxa"/>
+              <w:top w:w="25" w:type="dxa"/>
+              <w:bottom w:w="25" w:type="dxa"/>
+              <w:left w:w="35" w:type="dxa"/>
+              <w:right w:w="35" w:type="dxa"/>
             </w:tcMar>
             <w:shd w:fill="FFFFFF"/>
           </w:tcPr>
@@ -1953,10 +2637,10 @@
             <w:tcW w:type="dxa" w:w="2448"/>
             <w:vAlign w:val="center"/>
             <w:tcMar>
-              <w:top w:w="30" w:type="dxa"/>
-              <w:bottom w:w="30" w:type="dxa"/>
-              <w:left w:w="40" w:type="dxa"/>
-              <w:right w:w="40" w:type="dxa"/>
+              <w:top w:w="25" w:type="dxa"/>
+              <w:bottom w:w="25" w:type="dxa"/>
+              <w:left w:w="35" w:type="dxa"/>
+              <w:right w:w="35" w:type="dxa"/>
             </w:tcMar>
             <w:shd w:fill="FFFFFF"/>
           </w:tcPr>
@@ -1981,10 +2665,10 @@
             <w:tcW w:type="dxa" w:w="1152"/>
             <w:vAlign w:val="center"/>
             <w:tcMar>
-              <w:top w:w="30" w:type="dxa"/>
-              <w:bottom w:w="30" w:type="dxa"/>
-              <w:left w:w="40" w:type="dxa"/>
-              <w:right w:w="40" w:type="dxa"/>
+              <w:top w:w="25" w:type="dxa"/>
+              <w:bottom w:w="25" w:type="dxa"/>
+              <w:left w:w="35" w:type="dxa"/>
+              <w:right w:w="35" w:type="dxa"/>
             </w:tcMar>
             <w:shd w:fill="FFFFFF"/>
           </w:tcPr>
@@ -2008,10 +2692,10 @@
             <w:tcW w:type="dxa" w:w="1440"/>
             <w:vAlign w:val="center"/>
             <w:tcMar>
-              <w:top w:w="30" w:type="dxa"/>
-              <w:bottom w:w="30" w:type="dxa"/>
-              <w:left w:w="40" w:type="dxa"/>
-              <w:right w:w="40" w:type="dxa"/>
+              <w:top w:w="25" w:type="dxa"/>
+              <w:bottom w:w="25" w:type="dxa"/>
+              <w:left w:w="35" w:type="dxa"/>
+              <w:right w:w="35" w:type="dxa"/>
             </w:tcMar>
             <w:shd w:fill="FFFFFF"/>
           </w:tcPr>
@@ -2034,10 +2718,10 @@
             <w:tcW w:type="dxa" w:w="2448"/>
             <w:vAlign w:val="center"/>
             <w:tcMar>
-              <w:top w:w="30" w:type="dxa"/>
-              <w:bottom w:w="30" w:type="dxa"/>
-              <w:left w:w="40" w:type="dxa"/>
-              <w:right w:w="40" w:type="dxa"/>
+              <w:top w:w="25" w:type="dxa"/>
+              <w:bottom w:w="25" w:type="dxa"/>
+              <w:left w:w="35" w:type="dxa"/>
+              <w:right w:w="35" w:type="dxa"/>
             </w:tcMar>
             <w:shd w:fill="FFFFFF"/>
           </w:tcPr>
@@ -2062,10 +2746,10 @@
             <w:tcW w:type="dxa" w:w="1152"/>
             <w:vAlign w:val="center"/>
             <w:tcMar>
-              <w:top w:w="30" w:type="dxa"/>
-              <w:bottom w:w="30" w:type="dxa"/>
-              <w:left w:w="40" w:type="dxa"/>
-              <w:right w:w="40" w:type="dxa"/>
+              <w:top w:w="25" w:type="dxa"/>
+              <w:bottom w:w="25" w:type="dxa"/>
+              <w:left w:w="35" w:type="dxa"/>
+              <w:right w:w="35" w:type="dxa"/>
             </w:tcMar>
             <w:shd w:fill="FFFFFF"/>
           </w:tcPr>
@@ -2089,10 +2773,10 @@
             <w:tcW w:type="dxa" w:w="1440"/>
             <w:vAlign w:val="center"/>
             <w:tcMar>
-              <w:top w:w="30" w:type="dxa"/>
-              <w:bottom w:w="30" w:type="dxa"/>
-              <w:left w:w="40" w:type="dxa"/>
-              <w:right w:w="40" w:type="dxa"/>
+              <w:top w:w="25" w:type="dxa"/>
+              <w:bottom w:w="25" w:type="dxa"/>
+              <w:left w:w="35" w:type="dxa"/>
+              <w:right w:w="35" w:type="dxa"/>
             </w:tcMar>
             <w:shd w:fill="FFFFFF"/>
           </w:tcPr>
@@ -2115,10 +2799,10 @@
             <w:tcW w:type="dxa" w:w="2448"/>
             <w:vAlign w:val="center"/>
             <w:tcMar>
-              <w:top w:w="30" w:type="dxa"/>
-              <w:bottom w:w="30" w:type="dxa"/>
-              <w:left w:w="40" w:type="dxa"/>
-              <w:right w:w="40" w:type="dxa"/>
+              <w:top w:w="25" w:type="dxa"/>
+              <w:bottom w:w="25" w:type="dxa"/>
+              <w:left w:w="35" w:type="dxa"/>
+              <w:right w:w="35" w:type="dxa"/>
             </w:tcMar>
             <w:shd w:fill="FFFFFF"/>
           </w:tcPr>
@@ -2143,10 +2827,10 @@
             <w:tcW w:type="dxa" w:w="1152"/>
             <w:vAlign w:val="center"/>
             <w:tcMar>
-              <w:top w:w="30" w:type="dxa"/>
-              <w:bottom w:w="30" w:type="dxa"/>
-              <w:left w:w="40" w:type="dxa"/>
-              <w:right w:w="40" w:type="dxa"/>
+              <w:top w:w="25" w:type="dxa"/>
+              <w:bottom w:w="25" w:type="dxa"/>
+              <w:left w:w="35" w:type="dxa"/>
+              <w:right w:w="35" w:type="dxa"/>
             </w:tcMar>
             <w:shd w:fill="FFFFFF"/>
           </w:tcPr>
@@ -2170,10 +2854,10 @@
             <w:tcW w:type="dxa" w:w="1440"/>
             <w:vAlign w:val="center"/>
             <w:tcMar>
-              <w:top w:w="30" w:type="dxa"/>
-              <w:bottom w:w="30" w:type="dxa"/>
-              <w:left w:w="40" w:type="dxa"/>
-              <w:right w:w="40" w:type="dxa"/>
+              <w:top w:w="25" w:type="dxa"/>
+              <w:bottom w:w="25" w:type="dxa"/>
+              <w:left w:w="35" w:type="dxa"/>
+              <w:right w:w="35" w:type="dxa"/>
             </w:tcMar>
             <w:shd w:fill="FFFFFF"/>
           </w:tcPr>
@@ -2196,10 +2880,10 @@
             <w:tcW w:type="dxa" w:w="2448"/>
             <w:vAlign w:val="center"/>
             <w:tcMar>
-              <w:top w:w="30" w:type="dxa"/>
-              <w:bottom w:w="30" w:type="dxa"/>
-              <w:left w:w="40" w:type="dxa"/>
-              <w:right w:w="40" w:type="dxa"/>
+              <w:top w:w="25" w:type="dxa"/>
+              <w:bottom w:w="25" w:type="dxa"/>
+              <w:left w:w="35" w:type="dxa"/>
+              <w:right w:w="35" w:type="dxa"/>
             </w:tcMar>
             <w:shd w:fill="FFFFFF"/>
           </w:tcPr>
@@ -2224,10 +2908,10 @@
             <w:tcW w:type="dxa" w:w="1152"/>
             <w:vAlign w:val="center"/>
             <w:tcMar>
-              <w:top w:w="30" w:type="dxa"/>
-              <w:bottom w:w="30" w:type="dxa"/>
-              <w:left w:w="40" w:type="dxa"/>
-              <w:right w:w="40" w:type="dxa"/>
+              <w:top w:w="25" w:type="dxa"/>
+              <w:bottom w:w="25" w:type="dxa"/>
+              <w:left w:w="35" w:type="dxa"/>
+              <w:right w:w="35" w:type="dxa"/>
             </w:tcMar>
             <w:shd w:fill="FFFFFF"/>
           </w:tcPr>
@@ -2251,10 +2935,10 @@
             <w:tcW w:type="dxa" w:w="1440"/>
             <w:vAlign w:val="center"/>
             <w:tcMar>
-              <w:top w:w="30" w:type="dxa"/>
-              <w:bottom w:w="30" w:type="dxa"/>
-              <w:left w:w="40" w:type="dxa"/>
-              <w:right w:w="40" w:type="dxa"/>
+              <w:top w:w="25" w:type="dxa"/>
+              <w:bottom w:w="25" w:type="dxa"/>
+              <w:left w:w="35" w:type="dxa"/>
+              <w:right w:w="35" w:type="dxa"/>
             </w:tcMar>
             <w:shd w:fill="FFFFFF"/>
           </w:tcPr>
@@ -2277,10 +2961,10 @@
             <w:tcW w:type="dxa" w:w="2448"/>
             <w:vAlign w:val="center"/>
             <w:tcMar>
-              <w:top w:w="30" w:type="dxa"/>
-              <w:bottom w:w="30" w:type="dxa"/>
-              <w:left w:w="40" w:type="dxa"/>
-              <w:right w:w="40" w:type="dxa"/>
+              <w:top w:w="25" w:type="dxa"/>
+              <w:bottom w:w="25" w:type="dxa"/>
+              <w:left w:w="35" w:type="dxa"/>
+              <w:right w:w="35" w:type="dxa"/>
             </w:tcMar>
             <w:shd w:fill="FFFFFF"/>
           </w:tcPr>
@@ -2305,10 +2989,10 @@
             <w:tcW w:type="dxa" w:w="1152"/>
             <w:vAlign w:val="center"/>
             <w:tcMar>
-              <w:top w:w="30" w:type="dxa"/>
-              <w:bottom w:w="30" w:type="dxa"/>
-              <w:left w:w="40" w:type="dxa"/>
-              <w:right w:w="40" w:type="dxa"/>
+              <w:top w:w="25" w:type="dxa"/>
+              <w:bottom w:w="25" w:type="dxa"/>
+              <w:left w:w="35" w:type="dxa"/>
+              <w:right w:w="35" w:type="dxa"/>
             </w:tcMar>
             <w:shd w:fill="FFFFFF"/>
           </w:tcPr>
@@ -2332,10 +3016,10 @@
             <w:tcW w:type="dxa" w:w="1440"/>
             <w:vAlign w:val="center"/>
             <w:tcMar>
-              <w:top w:w="30" w:type="dxa"/>
-              <w:bottom w:w="30" w:type="dxa"/>
-              <w:left w:w="40" w:type="dxa"/>
-              <w:right w:w="40" w:type="dxa"/>
+              <w:top w:w="25" w:type="dxa"/>
+              <w:bottom w:w="25" w:type="dxa"/>
+              <w:left w:w="35" w:type="dxa"/>
+              <w:right w:w="35" w:type="dxa"/>
             </w:tcMar>
             <w:shd w:fill="FFFFFF"/>
           </w:tcPr>
@@ -2358,10 +3042,10 @@
             <w:tcW w:type="dxa" w:w="2448"/>
             <w:vAlign w:val="center"/>
             <w:tcMar>
-              <w:top w:w="30" w:type="dxa"/>
-              <w:bottom w:w="30" w:type="dxa"/>
-              <w:left w:w="40" w:type="dxa"/>
-              <w:right w:w="40" w:type="dxa"/>
+              <w:top w:w="25" w:type="dxa"/>
+              <w:bottom w:w="25" w:type="dxa"/>
+              <w:left w:w="35" w:type="dxa"/>
+              <w:right w:w="35" w:type="dxa"/>
             </w:tcMar>
             <w:shd w:fill="FFFFFF"/>
           </w:tcPr>
@@ -2386,10 +3070,10 @@
             <w:tcW w:type="dxa" w:w="1152"/>
             <w:vAlign w:val="center"/>
             <w:tcMar>
-              <w:top w:w="30" w:type="dxa"/>
-              <w:bottom w:w="30" w:type="dxa"/>
-              <w:left w:w="40" w:type="dxa"/>
-              <w:right w:w="40" w:type="dxa"/>
+              <w:top w:w="25" w:type="dxa"/>
+              <w:bottom w:w="25" w:type="dxa"/>
+              <w:left w:w="35" w:type="dxa"/>
+              <w:right w:w="35" w:type="dxa"/>
             </w:tcMar>
             <w:shd w:fill="FFFFFF"/>
           </w:tcPr>
@@ -2413,10 +3097,10 @@
             <w:tcW w:type="dxa" w:w="1440"/>
             <w:vAlign w:val="center"/>
             <w:tcMar>
-              <w:top w:w="30" w:type="dxa"/>
-              <w:bottom w:w="30" w:type="dxa"/>
-              <w:left w:w="40" w:type="dxa"/>
-              <w:right w:w="40" w:type="dxa"/>
+              <w:top w:w="25" w:type="dxa"/>
+              <w:bottom w:w="25" w:type="dxa"/>
+              <w:left w:w="35" w:type="dxa"/>
+              <w:right w:w="35" w:type="dxa"/>
             </w:tcMar>
             <w:shd w:fill="FFFFFF"/>
           </w:tcPr>
@@ -2439,10 +3123,10 @@
             <w:tcW w:type="dxa" w:w="2448"/>
             <w:vAlign w:val="center"/>
             <w:tcMar>
-              <w:top w:w="30" w:type="dxa"/>
-              <w:bottom w:w="30" w:type="dxa"/>
-              <w:left w:w="40" w:type="dxa"/>
-              <w:right w:w="40" w:type="dxa"/>
+              <w:top w:w="25" w:type="dxa"/>
+              <w:bottom w:w="25" w:type="dxa"/>
+              <w:left w:w="35" w:type="dxa"/>
+              <w:right w:w="35" w:type="dxa"/>
             </w:tcMar>
             <w:shd w:fill="FFFFFF"/>
           </w:tcPr>
@@ -2467,10 +3151,10 @@
             <w:tcW w:type="dxa" w:w="1152"/>
             <w:vAlign w:val="center"/>
             <w:tcMar>
-              <w:top w:w="30" w:type="dxa"/>
-              <w:bottom w:w="30" w:type="dxa"/>
-              <w:left w:w="40" w:type="dxa"/>
-              <w:right w:w="40" w:type="dxa"/>
+              <w:top w:w="25" w:type="dxa"/>
+              <w:bottom w:w="25" w:type="dxa"/>
+              <w:left w:w="35" w:type="dxa"/>
+              <w:right w:w="35" w:type="dxa"/>
             </w:tcMar>
             <w:shd w:fill="FFFFFF"/>
           </w:tcPr>
@@ -2494,10 +3178,10 @@
             <w:tcW w:type="dxa" w:w="1440"/>
             <w:vAlign w:val="center"/>
             <w:tcMar>
-              <w:top w:w="30" w:type="dxa"/>
-              <w:bottom w:w="30" w:type="dxa"/>
-              <w:left w:w="40" w:type="dxa"/>
-              <w:right w:w="40" w:type="dxa"/>
+              <w:top w:w="25" w:type="dxa"/>
+              <w:bottom w:w="25" w:type="dxa"/>
+              <w:left w:w="35" w:type="dxa"/>
+              <w:right w:w="35" w:type="dxa"/>
             </w:tcMar>
             <w:shd w:fill="FFFFFF"/>
           </w:tcPr>
@@ -2520,10 +3204,10 @@
             <w:tcW w:type="dxa" w:w="2448"/>
             <w:vAlign w:val="center"/>
             <w:tcMar>
-              <w:top w:w="30" w:type="dxa"/>
-              <w:bottom w:w="30" w:type="dxa"/>
-              <w:left w:w="40" w:type="dxa"/>
-              <w:right w:w="40" w:type="dxa"/>
+              <w:top w:w="25" w:type="dxa"/>
+              <w:bottom w:w="25" w:type="dxa"/>
+              <w:left w:w="35" w:type="dxa"/>
+              <w:right w:w="35" w:type="dxa"/>
             </w:tcMar>
             <w:shd w:fill="FFFFFF"/>
           </w:tcPr>
@@ -2572,7 +3256,7 @@
           <w:color w:val="000000"/>
           <w:sz w:val="19"/>
         </w:rPr>
-        <w:t>The dataset incorporates standardized 2D facial color photographs I_raw acquired across pediatric clinical cohorts. The total repository comprises 5,772 photographic portraits (2,886 confirmed ASD cases and 2,886 typically developing controls) compiled from the Zenodo Multi-Center Autism Facial Repository (Record 15073612) and public clinical cohorts [10]. Subjects span pediatric ages 2 to 12 years (mean 5.4 ± 2.1 years, 72% male, 28% female), reflecting the natural male-to-female epidemiological ratio in autism spectrum populations.</w:t>
+        <w:t>The dataset incorporates standardized 2D facial color photographs I_raw acquired across pediatric clinical cohorts. The total repository comprises 5,772 photographic portraits (2,886 confirmed ASD cases and 2,886 typically developing controls) compiled from the Zenodo Multi-Center Autism Facial Repository (Record 15073612) and public clinical cohorts [4], [11]. Subjects span pediatric ages 2 to 12 years (mean 5.4 ± 2.1 years, 72% male, 28% female), reflecting the natural male-to-female epidemiological ratio in autism spectrum populations.</w:t>
       </w:r>
     </w:p>
     <w:p>
@@ -2606,7 +3290,7 @@
         </w:rPr>
         <w:t>Raw photographic images exhibit substantial variations in camera distance, head tilt, and background clutter. To ensure that downstream networks learn intrinsic craniofacial morphology rather than spurious background artifacts, we employ an automated multi-stage preprocessing pipeline:</w:t>
         <w:br/>
-        <w:t>1) MTCNN Face Detection: We utilize Multi-Task Cascaded Convolutional Networks (MTCNN) [14] (P-Net, R-Net, O-Net) to accurately detect the facial bounding box B and five fiducial landmarks (ocular, nasal, and oral corners).</w:t>
+        <w:t>1) MTCNN Face Detection: We utilize Multi-Task Cascaded Convolutional Networks (MTCNN) [23] (P-Net, R-Net, O-Net) to accurately detect the facial bounding box B and five fiducial landmarks (ocular, nasal, and oral corners).</w:t>
         <w:br/>
         <w:t>2) In-Plane Rotational Alignment: Using detected ocular coordinates, the face rotation angle theta relative to the horizontal axis is computed:</w:t>
       </w:r>
@@ -2842,7 +3526,7 @@
         </w:rPr>
         <w:t>We systematically benchmark six deep CNN architectures under identical optimization protocols:</w:t>
         <w:br/>
-        <w:t>1) ResNet-50 (Optimal Selected Backbone): A 50-layer deep residual network [15] structured with bottleneck residual blocks incorporating identity skip connections:</w:t>
+        <w:t>1) ResNet-50 (Optimal Selected Backbone): A 50-layer deep residual network [24] structured with bottleneck residual blocks incorporating identity skip connections:</w:t>
       </w:r>
     </w:p>
     <w:tbl>
@@ -2920,13 +3604,13 @@
           <w:color w:val="000000"/>
           <w:sz w:val="19"/>
         </w:rPr>
-        <w:t>2) ResNet-34: A 34-layer residual network [15] with standard 2-layer residual blocks.</w:t>
+        <w:t>2) ResNet-34: A 34-layer residual network [24] with standard 2-layer residual blocks.</w:t>
         <w:br/>
-        <w:t>3) VGG-19 &amp; VGG-16: Sequential feedforward networks [16] with 3×3 convolutions (143.6M and 138.4M parameters).</w:t>
+        <w:t>3) VGG-19 &amp; VGG-16: Sequential feedforward networks [25] with 3×3 convolutions (143.6M and 138.4M parameters).</w:t>
         <w:br/>
-        <w:t>4) MobileNet-V2: Lightweight network [17] with inverted residuals and depthwise separable convolutions (3.5M parameters).</w:t>
+        <w:t>4) MobileNet-V2: Lightweight network [26] with inverted residuals and depthwise separable convolutions (3.5M parameters).</w:t>
         <w:br/>
-        <w:t>5) AlexNet: Classic 8-layer deep convolutional baseline [18].</w:t>
+        <w:t>5) AlexNet: Classic 8-layer deep convolutional baseline [27].</w:t>
       </w:r>
     </w:p>
     <w:p>
@@ -2941,7 +3625,7 @@
           <w:color w:val="000000"/>
           <w:sz w:val="19"/>
         </w:rPr>
-        <w:t>Backbones were initialized with ImageNet weights and coupled to a Global Average Pooling layer, Dropout (p = 0.40), and linear head. Trained via AdamW [19] (eta = 10^-3, lambda = 10^-4) over 150 epochs with cosine annealing schedule minimizing binary cross-entropy:</w:t>
+        <w:t>Backbones were initialized with ImageNet weights and coupled to a Global Average Pooling layer, Dropout (p = 0.40), and linear head. Trained via AdamW [28] (eta = 10^-3, lambda = 10^-4) over 150 epochs with cosine annealing schedule minimizing binary cross-entropy:</w:t>
       </w:r>
     </w:p>
     <w:tbl>
@@ -3189,10 +3873,10 @@
             <w:tcW w:type="dxa" w:w="1872"/>
             <w:vAlign w:val="center"/>
             <w:tcMar>
-              <w:top w:w="35" w:type="dxa"/>
-              <w:bottom w:w="35" w:type="dxa"/>
-              <w:left w:w="35" w:type="dxa"/>
-              <w:right w:w="35" w:type="dxa"/>
+              <w:top w:w="30" w:type="dxa"/>
+              <w:bottom w:w="30" w:type="dxa"/>
+              <w:left w:w="30" w:type="dxa"/>
+              <w:right w:w="30" w:type="dxa"/>
             </w:tcMar>
             <w:shd w:fill="F1F5F9"/>
           </w:tcPr>
@@ -3216,10 +3900,10 @@
             <w:tcW w:type="dxa" w:w="1066"/>
             <w:vAlign w:val="center"/>
             <w:tcMar>
-              <w:top w:w="35" w:type="dxa"/>
-              <w:bottom w:w="35" w:type="dxa"/>
-              <w:left w:w="35" w:type="dxa"/>
-              <w:right w:w="35" w:type="dxa"/>
+              <w:top w:w="30" w:type="dxa"/>
+              <w:bottom w:w="30" w:type="dxa"/>
+              <w:left w:w="30" w:type="dxa"/>
+              <w:right w:w="30" w:type="dxa"/>
             </w:tcMar>
             <w:shd w:fill="F1F5F9"/>
           </w:tcPr>
@@ -3243,10 +3927,10 @@
             <w:tcW w:type="dxa" w:w="1066"/>
             <w:vAlign w:val="center"/>
             <w:tcMar>
-              <w:top w:w="35" w:type="dxa"/>
-              <w:bottom w:w="35" w:type="dxa"/>
-              <w:left w:w="35" w:type="dxa"/>
-              <w:right w:w="35" w:type="dxa"/>
+              <w:top w:w="30" w:type="dxa"/>
+              <w:bottom w:w="30" w:type="dxa"/>
+              <w:left w:w="30" w:type="dxa"/>
+              <w:right w:w="30" w:type="dxa"/>
             </w:tcMar>
             <w:shd w:fill="F1F5F9"/>
           </w:tcPr>
@@ -3270,10 +3954,10 @@
             <w:tcW w:type="dxa" w:w="1066"/>
             <w:vAlign w:val="center"/>
             <w:tcMar>
-              <w:top w:w="35" w:type="dxa"/>
-              <w:bottom w:w="35" w:type="dxa"/>
-              <w:left w:w="35" w:type="dxa"/>
-              <w:right w:w="35" w:type="dxa"/>
+              <w:top w:w="30" w:type="dxa"/>
+              <w:bottom w:w="30" w:type="dxa"/>
+              <w:left w:w="30" w:type="dxa"/>
+              <w:right w:w="30" w:type="dxa"/>
             </w:tcMar>
             <w:shd w:fill="F1F5F9"/>
           </w:tcPr>
@@ -3297,10 +3981,10 @@
             <w:tcW w:type="dxa" w:w="1066"/>
             <w:vAlign w:val="center"/>
             <w:tcMar>
-              <w:top w:w="35" w:type="dxa"/>
-              <w:bottom w:w="35" w:type="dxa"/>
-              <w:left w:w="35" w:type="dxa"/>
-              <w:right w:w="35" w:type="dxa"/>
+              <w:top w:w="30" w:type="dxa"/>
+              <w:bottom w:w="30" w:type="dxa"/>
+              <w:left w:w="30" w:type="dxa"/>
+              <w:right w:w="30" w:type="dxa"/>
             </w:tcMar>
             <w:shd w:fill="F1F5F9"/>
           </w:tcPr>
@@ -3324,10 +4008,10 @@
             <w:tcW w:type="dxa" w:w="1066"/>
             <w:vAlign w:val="center"/>
             <w:tcMar>
-              <w:top w:w="35" w:type="dxa"/>
-              <w:bottom w:w="35" w:type="dxa"/>
-              <w:left w:w="35" w:type="dxa"/>
-              <w:right w:w="35" w:type="dxa"/>
+              <w:top w:w="30" w:type="dxa"/>
+              <w:bottom w:w="30" w:type="dxa"/>
+              <w:left w:w="30" w:type="dxa"/>
+              <w:right w:w="30" w:type="dxa"/>
             </w:tcMar>
             <w:shd w:fill="F1F5F9"/>
           </w:tcPr>
@@ -3351,10 +4035,10 @@
             <w:tcW w:type="dxa" w:w="1066"/>
             <w:vAlign w:val="center"/>
             <w:tcMar>
-              <w:top w:w="35" w:type="dxa"/>
-              <w:bottom w:w="35" w:type="dxa"/>
-              <w:left w:w="35" w:type="dxa"/>
-              <w:right w:w="35" w:type="dxa"/>
+              <w:top w:w="30" w:type="dxa"/>
+              <w:bottom w:w="30" w:type="dxa"/>
+              <w:left w:w="30" w:type="dxa"/>
+              <w:right w:w="30" w:type="dxa"/>
             </w:tcMar>
             <w:shd w:fill="F1F5F9"/>
           </w:tcPr>
@@ -3378,10 +4062,10 @@
             <w:tcW w:type="dxa" w:w="1008"/>
             <w:vAlign w:val="center"/>
             <w:tcMar>
-              <w:top w:w="35" w:type="dxa"/>
-              <w:bottom w:w="35" w:type="dxa"/>
-              <w:left w:w="35" w:type="dxa"/>
-              <w:right w:w="35" w:type="dxa"/>
+              <w:top w:w="30" w:type="dxa"/>
+              <w:bottom w:w="30" w:type="dxa"/>
+              <w:left w:w="30" w:type="dxa"/>
+              <w:right w:w="30" w:type="dxa"/>
             </w:tcMar>
             <w:shd w:fill="F1F5F9"/>
           </w:tcPr>
@@ -3405,10 +4089,10 @@
             <w:tcW w:type="dxa" w:w="1080"/>
             <w:vAlign w:val="center"/>
             <w:tcMar>
-              <w:top w:w="35" w:type="dxa"/>
-              <w:bottom w:w="35" w:type="dxa"/>
-              <w:left w:w="35" w:type="dxa"/>
-              <w:right w:w="35" w:type="dxa"/>
+              <w:top w:w="30" w:type="dxa"/>
+              <w:bottom w:w="30" w:type="dxa"/>
+              <w:left w:w="30" w:type="dxa"/>
+              <w:right w:w="30" w:type="dxa"/>
             </w:tcMar>
             <w:shd w:fill="F1F5F9"/>
           </w:tcPr>
@@ -3434,10 +4118,10 @@
             <w:tcW w:type="dxa" w:w="1872"/>
             <w:vAlign w:val="center"/>
             <w:tcMar>
-              <w:top w:w="35" w:type="dxa"/>
-              <w:bottom w:w="35" w:type="dxa"/>
-              <w:left w:w="35" w:type="dxa"/>
-              <w:right w:w="35" w:type="dxa"/>
+              <w:top w:w="30" w:type="dxa"/>
+              <w:bottom w:w="30" w:type="dxa"/>
+              <w:left w:w="30" w:type="dxa"/>
+              <w:right w:w="30" w:type="dxa"/>
             </w:tcMar>
             <w:shd w:fill="FFFFFF"/>
           </w:tcPr>
@@ -3451,7 +4135,7 @@
                 <w:rFonts w:ascii="Times New Roman" w:hAnsi="Times New Roman"/>
                 <w:sz w:val="15"/>
               </w:rPr>
-              <w:t>AlexNet [18]</w:t>
+              <w:t>AlexNet [27]</w:t>
             </w:r>
           </w:p>
         </w:tc>
@@ -3460,10 +4144,10 @@
             <w:tcW w:type="dxa" w:w="1066"/>
             <w:vAlign w:val="center"/>
             <w:tcMar>
-              <w:top w:w="35" w:type="dxa"/>
-              <w:bottom w:w="35" w:type="dxa"/>
-              <w:left w:w="35" w:type="dxa"/>
-              <w:right w:w="35" w:type="dxa"/>
+              <w:top w:w="30" w:type="dxa"/>
+              <w:bottom w:w="30" w:type="dxa"/>
+              <w:left w:w="30" w:type="dxa"/>
+              <w:right w:w="30" w:type="dxa"/>
             </w:tcMar>
             <w:shd w:fill="FFFFFF"/>
           </w:tcPr>
@@ -3486,10 +4170,10 @@
             <w:tcW w:type="dxa" w:w="1066"/>
             <w:vAlign w:val="center"/>
             <w:tcMar>
-              <w:top w:w="35" w:type="dxa"/>
-              <w:bottom w:w="35" w:type="dxa"/>
-              <w:left w:w="35" w:type="dxa"/>
-              <w:right w:w="35" w:type="dxa"/>
+              <w:top w:w="30" w:type="dxa"/>
+              <w:bottom w:w="30" w:type="dxa"/>
+              <w:left w:w="30" w:type="dxa"/>
+              <w:right w:w="30" w:type="dxa"/>
             </w:tcMar>
             <w:shd w:fill="FFFFFF"/>
           </w:tcPr>
@@ -3512,10 +4196,10 @@
             <w:tcW w:type="dxa" w:w="1066"/>
             <w:vAlign w:val="center"/>
             <w:tcMar>
-              <w:top w:w="35" w:type="dxa"/>
-              <w:bottom w:w="35" w:type="dxa"/>
-              <w:left w:w="35" w:type="dxa"/>
-              <w:right w:w="35" w:type="dxa"/>
+              <w:top w:w="30" w:type="dxa"/>
+              <w:bottom w:w="30" w:type="dxa"/>
+              <w:left w:w="30" w:type="dxa"/>
+              <w:right w:w="30" w:type="dxa"/>
             </w:tcMar>
             <w:shd w:fill="FFFFFF"/>
           </w:tcPr>
@@ -3538,10 +4222,10 @@
             <w:tcW w:type="dxa" w:w="1066"/>
             <w:vAlign w:val="center"/>
             <w:tcMar>
-              <w:top w:w="35" w:type="dxa"/>
-              <w:bottom w:w="35" w:type="dxa"/>
-              <w:left w:w="35" w:type="dxa"/>
-              <w:right w:w="35" w:type="dxa"/>
+              <w:top w:w="30" w:type="dxa"/>
+              <w:bottom w:w="30" w:type="dxa"/>
+              <w:left w:w="30" w:type="dxa"/>
+              <w:right w:w="30" w:type="dxa"/>
             </w:tcMar>
             <w:shd w:fill="FFFFFF"/>
           </w:tcPr>
@@ -3564,10 +4248,10 @@
             <w:tcW w:type="dxa" w:w="1066"/>
             <w:vAlign w:val="center"/>
             <w:tcMar>
-              <w:top w:w="35" w:type="dxa"/>
-              <w:bottom w:w="35" w:type="dxa"/>
-              <w:left w:w="35" w:type="dxa"/>
-              <w:right w:w="35" w:type="dxa"/>
+              <w:top w:w="30" w:type="dxa"/>
+              <w:bottom w:w="30" w:type="dxa"/>
+              <w:left w:w="30" w:type="dxa"/>
+              <w:right w:w="30" w:type="dxa"/>
             </w:tcMar>
             <w:shd w:fill="FFFFFF"/>
           </w:tcPr>
@@ -3590,10 +4274,10 @@
             <w:tcW w:type="dxa" w:w="1066"/>
             <w:vAlign w:val="center"/>
             <w:tcMar>
-              <w:top w:w="35" w:type="dxa"/>
-              <w:bottom w:w="35" w:type="dxa"/>
-              <w:left w:w="35" w:type="dxa"/>
-              <w:right w:w="35" w:type="dxa"/>
+              <w:top w:w="30" w:type="dxa"/>
+              <w:bottom w:w="30" w:type="dxa"/>
+              <w:left w:w="30" w:type="dxa"/>
+              <w:right w:w="30" w:type="dxa"/>
             </w:tcMar>
             <w:shd w:fill="FFFFFF"/>
           </w:tcPr>
@@ -3616,10 +4300,10 @@
             <w:tcW w:type="dxa" w:w="1008"/>
             <w:vAlign w:val="center"/>
             <w:tcMar>
-              <w:top w:w="35" w:type="dxa"/>
-              <w:bottom w:w="35" w:type="dxa"/>
-              <w:left w:w="35" w:type="dxa"/>
-              <w:right w:w="35" w:type="dxa"/>
+              <w:top w:w="30" w:type="dxa"/>
+              <w:bottom w:w="30" w:type="dxa"/>
+              <w:left w:w="30" w:type="dxa"/>
+              <w:right w:w="30" w:type="dxa"/>
             </w:tcMar>
             <w:shd w:fill="FFFFFF"/>
           </w:tcPr>
@@ -3642,10 +4326,10 @@
             <w:tcW w:type="dxa" w:w="1080"/>
             <w:vAlign w:val="center"/>
             <w:tcMar>
-              <w:top w:w="35" w:type="dxa"/>
-              <w:bottom w:w="35" w:type="dxa"/>
-              <w:left w:w="35" w:type="dxa"/>
-              <w:right w:w="35" w:type="dxa"/>
+              <w:top w:w="30" w:type="dxa"/>
+              <w:bottom w:w="30" w:type="dxa"/>
+              <w:left w:w="30" w:type="dxa"/>
+              <w:right w:w="30" w:type="dxa"/>
             </w:tcMar>
             <w:shd w:fill="FFFFFF"/>
           </w:tcPr>
@@ -3670,10 +4354,10 @@
             <w:tcW w:type="dxa" w:w="1872"/>
             <w:vAlign w:val="center"/>
             <w:tcMar>
-              <w:top w:w="35" w:type="dxa"/>
-              <w:bottom w:w="35" w:type="dxa"/>
-              <w:left w:w="35" w:type="dxa"/>
-              <w:right w:w="35" w:type="dxa"/>
+              <w:top w:w="30" w:type="dxa"/>
+              <w:bottom w:w="30" w:type="dxa"/>
+              <w:left w:w="30" w:type="dxa"/>
+              <w:right w:w="30" w:type="dxa"/>
             </w:tcMar>
             <w:shd w:fill="FFFFFF"/>
           </w:tcPr>
@@ -3687,7 +4371,7 @@
                 <w:rFonts w:ascii="Times New Roman" w:hAnsi="Times New Roman"/>
                 <w:sz w:val="15"/>
               </w:rPr>
-              <w:t>MobileNet-V2 [17]</w:t>
+              <w:t>MobileNet-V2 [26]</w:t>
             </w:r>
           </w:p>
         </w:tc>
@@ -3696,10 +4380,10 @@
             <w:tcW w:type="dxa" w:w="1066"/>
             <w:vAlign w:val="center"/>
             <w:tcMar>
-              <w:top w:w="35" w:type="dxa"/>
-              <w:bottom w:w="35" w:type="dxa"/>
-              <w:left w:w="35" w:type="dxa"/>
-              <w:right w:w="35" w:type="dxa"/>
+              <w:top w:w="30" w:type="dxa"/>
+              <w:bottom w:w="30" w:type="dxa"/>
+              <w:left w:w="30" w:type="dxa"/>
+              <w:right w:w="30" w:type="dxa"/>
             </w:tcMar>
             <w:shd w:fill="FFFFFF"/>
           </w:tcPr>
@@ -3722,10 +4406,10 @@
             <w:tcW w:type="dxa" w:w="1066"/>
             <w:vAlign w:val="center"/>
             <w:tcMar>
-              <w:top w:w="35" w:type="dxa"/>
-              <w:bottom w:w="35" w:type="dxa"/>
-              <w:left w:w="35" w:type="dxa"/>
-              <w:right w:w="35" w:type="dxa"/>
+              <w:top w:w="30" w:type="dxa"/>
+              <w:bottom w:w="30" w:type="dxa"/>
+              <w:left w:w="30" w:type="dxa"/>
+              <w:right w:w="30" w:type="dxa"/>
             </w:tcMar>
             <w:shd w:fill="FFFFFF"/>
           </w:tcPr>
@@ -3748,10 +4432,10 @@
             <w:tcW w:type="dxa" w:w="1066"/>
             <w:vAlign w:val="center"/>
             <w:tcMar>
-              <w:top w:w="35" w:type="dxa"/>
-              <w:bottom w:w="35" w:type="dxa"/>
-              <w:left w:w="35" w:type="dxa"/>
-              <w:right w:w="35" w:type="dxa"/>
+              <w:top w:w="30" w:type="dxa"/>
+              <w:bottom w:w="30" w:type="dxa"/>
+              <w:left w:w="30" w:type="dxa"/>
+              <w:right w:w="30" w:type="dxa"/>
             </w:tcMar>
             <w:shd w:fill="FFFFFF"/>
           </w:tcPr>
@@ -3774,10 +4458,10 @@
             <w:tcW w:type="dxa" w:w="1066"/>
             <w:vAlign w:val="center"/>
             <w:tcMar>
-              <w:top w:w="35" w:type="dxa"/>
-              <w:bottom w:w="35" w:type="dxa"/>
-              <w:left w:w="35" w:type="dxa"/>
-              <w:right w:w="35" w:type="dxa"/>
+              <w:top w:w="30" w:type="dxa"/>
+              <w:bottom w:w="30" w:type="dxa"/>
+              <w:left w:w="30" w:type="dxa"/>
+              <w:right w:w="30" w:type="dxa"/>
             </w:tcMar>
             <w:shd w:fill="FFFFFF"/>
           </w:tcPr>
@@ -3800,10 +4484,10 @@
             <w:tcW w:type="dxa" w:w="1066"/>
             <w:vAlign w:val="center"/>
             <w:tcMar>
-              <w:top w:w="35" w:type="dxa"/>
-              <w:bottom w:w="35" w:type="dxa"/>
-              <w:left w:w="35" w:type="dxa"/>
-              <w:right w:w="35" w:type="dxa"/>
+              <w:top w:w="30" w:type="dxa"/>
+              <w:bottom w:w="30" w:type="dxa"/>
+              <w:left w:w="30" w:type="dxa"/>
+              <w:right w:w="30" w:type="dxa"/>
             </w:tcMar>
             <w:shd w:fill="FFFFFF"/>
           </w:tcPr>
@@ -3826,10 +4510,10 @@
             <w:tcW w:type="dxa" w:w="1066"/>
             <w:vAlign w:val="center"/>
             <w:tcMar>
-              <w:top w:w="35" w:type="dxa"/>
-              <w:bottom w:w="35" w:type="dxa"/>
-              <w:left w:w="35" w:type="dxa"/>
-              <w:right w:w="35" w:type="dxa"/>
+              <w:top w:w="30" w:type="dxa"/>
+              <w:bottom w:w="30" w:type="dxa"/>
+              <w:left w:w="30" w:type="dxa"/>
+              <w:right w:w="30" w:type="dxa"/>
             </w:tcMar>
             <w:shd w:fill="FFFFFF"/>
           </w:tcPr>
@@ -3852,10 +4536,10 @@
             <w:tcW w:type="dxa" w:w="1008"/>
             <w:vAlign w:val="center"/>
             <w:tcMar>
-              <w:top w:w="35" w:type="dxa"/>
-              <w:bottom w:w="35" w:type="dxa"/>
-              <w:left w:w="35" w:type="dxa"/>
-              <w:right w:w="35" w:type="dxa"/>
+              <w:top w:w="30" w:type="dxa"/>
+              <w:bottom w:w="30" w:type="dxa"/>
+              <w:left w:w="30" w:type="dxa"/>
+              <w:right w:w="30" w:type="dxa"/>
             </w:tcMar>
             <w:shd w:fill="FFFFFF"/>
           </w:tcPr>
@@ -3878,10 +4562,10 @@
             <w:tcW w:type="dxa" w:w="1080"/>
             <w:vAlign w:val="center"/>
             <w:tcMar>
-              <w:top w:w="35" w:type="dxa"/>
-              <w:bottom w:w="35" w:type="dxa"/>
-              <w:left w:w="35" w:type="dxa"/>
-              <w:right w:w="35" w:type="dxa"/>
+              <w:top w:w="30" w:type="dxa"/>
+              <w:bottom w:w="30" w:type="dxa"/>
+              <w:left w:w="30" w:type="dxa"/>
+              <w:right w:w="30" w:type="dxa"/>
             </w:tcMar>
             <w:shd w:fill="FFFFFF"/>
           </w:tcPr>
@@ -3906,10 +4590,10 @@
             <w:tcW w:type="dxa" w:w="1872"/>
             <w:vAlign w:val="center"/>
             <w:tcMar>
-              <w:top w:w="35" w:type="dxa"/>
-              <w:bottom w:w="35" w:type="dxa"/>
-              <w:left w:w="35" w:type="dxa"/>
-              <w:right w:w="35" w:type="dxa"/>
+              <w:top w:w="30" w:type="dxa"/>
+              <w:bottom w:w="30" w:type="dxa"/>
+              <w:left w:w="30" w:type="dxa"/>
+              <w:right w:w="30" w:type="dxa"/>
             </w:tcMar>
             <w:shd w:fill="FFFFFF"/>
           </w:tcPr>
@@ -3923,7 +4607,7 @@
                 <w:rFonts w:ascii="Times New Roman" w:hAnsi="Times New Roman"/>
                 <w:sz w:val="15"/>
               </w:rPr>
-              <w:t>VGG-16 [16]</w:t>
+              <w:t>VGG-16 [25]</w:t>
             </w:r>
           </w:p>
         </w:tc>
@@ -3932,10 +4616,10 @@
             <w:tcW w:type="dxa" w:w="1066"/>
             <w:vAlign w:val="center"/>
             <w:tcMar>
-              <w:top w:w="35" w:type="dxa"/>
-              <w:bottom w:w="35" w:type="dxa"/>
-              <w:left w:w="35" w:type="dxa"/>
-              <w:right w:w="35" w:type="dxa"/>
+              <w:top w:w="30" w:type="dxa"/>
+              <w:bottom w:w="30" w:type="dxa"/>
+              <w:left w:w="30" w:type="dxa"/>
+              <w:right w:w="30" w:type="dxa"/>
             </w:tcMar>
             <w:shd w:fill="FFFFFF"/>
           </w:tcPr>
@@ -3958,10 +4642,10 @@
             <w:tcW w:type="dxa" w:w="1066"/>
             <w:vAlign w:val="center"/>
             <w:tcMar>
-              <w:top w:w="35" w:type="dxa"/>
-              <w:bottom w:w="35" w:type="dxa"/>
-              <w:left w:w="35" w:type="dxa"/>
-              <w:right w:w="35" w:type="dxa"/>
+              <w:top w:w="30" w:type="dxa"/>
+              <w:bottom w:w="30" w:type="dxa"/>
+              <w:left w:w="30" w:type="dxa"/>
+              <w:right w:w="30" w:type="dxa"/>
             </w:tcMar>
             <w:shd w:fill="FFFFFF"/>
           </w:tcPr>
@@ -3984,10 +4668,10 @@
             <w:tcW w:type="dxa" w:w="1066"/>
             <w:vAlign w:val="center"/>
             <w:tcMar>
-              <w:top w:w="35" w:type="dxa"/>
-              <w:bottom w:w="35" w:type="dxa"/>
-              <w:left w:w="35" w:type="dxa"/>
-              <w:right w:w="35" w:type="dxa"/>
+              <w:top w:w="30" w:type="dxa"/>
+              <w:bottom w:w="30" w:type="dxa"/>
+              <w:left w:w="30" w:type="dxa"/>
+              <w:right w:w="30" w:type="dxa"/>
             </w:tcMar>
             <w:shd w:fill="FFFFFF"/>
           </w:tcPr>
@@ -4010,10 +4694,10 @@
             <w:tcW w:type="dxa" w:w="1066"/>
             <w:vAlign w:val="center"/>
             <w:tcMar>
-              <w:top w:w="35" w:type="dxa"/>
-              <w:bottom w:w="35" w:type="dxa"/>
-              <w:left w:w="35" w:type="dxa"/>
-              <w:right w:w="35" w:type="dxa"/>
+              <w:top w:w="30" w:type="dxa"/>
+              <w:bottom w:w="30" w:type="dxa"/>
+              <w:left w:w="30" w:type="dxa"/>
+              <w:right w:w="30" w:type="dxa"/>
             </w:tcMar>
             <w:shd w:fill="FFFFFF"/>
           </w:tcPr>
@@ -4036,10 +4720,10 @@
             <w:tcW w:type="dxa" w:w="1066"/>
             <w:vAlign w:val="center"/>
             <w:tcMar>
-              <w:top w:w="35" w:type="dxa"/>
-              <w:bottom w:w="35" w:type="dxa"/>
-              <w:left w:w="35" w:type="dxa"/>
-              <w:right w:w="35" w:type="dxa"/>
+              <w:top w:w="30" w:type="dxa"/>
+              <w:bottom w:w="30" w:type="dxa"/>
+              <w:left w:w="30" w:type="dxa"/>
+              <w:right w:w="30" w:type="dxa"/>
             </w:tcMar>
             <w:shd w:fill="FFFFFF"/>
           </w:tcPr>
@@ -4062,10 +4746,10 @@
             <w:tcW w:type="dxa" w:w="1066"/>
             <w:vAlign w:val="center"/>
             <w:tcMar>
-              <w:top w:w="35" w:type="dxa"/>
-              <w:bottom w:w="35" w:type="dxa"/>
-              <w:left w:w="35" w:type="dxa"/>
-              <w:right w:w="35" w:type="dxa"/>
+              <w:top w:w="30" w:type="dxa"/>
+              <w:bottom w:w="30" w:type="dxa"/>
+              <w:left w:w="30" w:type="dxa"/>
+              <w:right w:w="30" w:type="dxa"/>
             </w:tcMar>
             <w:shd w:fill="FFFFFF"/>
           </w:tcPr>
@@ -4088,10 +4772,10 @@
             <w:tcW w:type="dxa" w:w="1008"/>
             <w:vAlign w:val="center"/>
             <w:tcMar>
-              <w:top w:w="35" w:type="dxa"/>
-              <w:bottom w:w="35" w:type="dxa"/>
-              <w:left w:w="35" w:type="dxa"/>
-              <w:right w:w="35" w:type="dxa"/>
+              <w:top w:w="30" w:type="dxa"/>
+              <w:bottom w:w="30" w:type="dxa"/>
+              <w:left w:w="30" w:type="dxa"/>
+              <w:right w:w="30" w:type="dxa"/>
             </w:tcMar>
             <w:shd w:fill="FFFFFF"/>
           </w:tcPr>
@@ -4114,10 +4798,10 @@
             <w:tcW w:type="dxa" w:w="1080"/>
             <w:vAlign w:val="center"/>
             <w:tcMar>
-              <w:top w:w="35" w:type="dxa"/>
-              <w:bottom w:w="35" w:type="dxa"/>
-              <w:left w:w="35" w:type="dxa"/>
-              <w:right w:w="35" w:type="dxa"/>
+              <w:top w:w="30" w:type="dxa"/>
+              <w:bottom w:w="30" w:type="dxa"/>
+              <w:left w:w="30" w:type="dxa"/>
+              <w:right w:w="30" w:type="dxa"/>
             </w:tcMar>
             <w:shd w:fill="FFFFFF"/>
           </w:tcPr>
@@ -4142,10 +4826,10 @@
             <w:tcW w:type="dxa" w:w="1872"/>
             <w:vAlign w:val="center"/>
             <w:tcMar>
-              <w:top w:w="35" w:type="dxa"/>
-              <w:bottom w:w="35" w:type="dxa"/>
-              <w:left w:w="35" w:type="dxa"/>
-              <w:right w:w="35" w:type="dxa"/>
+              <w:top w:w="30" w:type="dxa"/>
+              <w:bottom w:w="30" w:type="dxa"/>
+              <w:left w:w="30" w:type="dxa"/>
+              <w:right w:w="30" w:type="dxa"/>
             </w:tcMar>
             <w:shd w:fill="FFFFFF"/>
           </w:tcPr>
@@ -4159,7 +4843,7 @@
                 <w:rFonts w:ascii="Times New Roman" w:hAnsi="Times New Roman"/>
                 <w:sz w:val="15"/>
               </w:rPr>
-              <w:t>VGG-19 [16]</w:t>
+              <w:t>VGG-19 [25]</w:t>
             </w:r>
           </w:p>
         </w:tc>
@@ -4168,10 +4852,10 @@
             <w:tcW w:type="dxa" w:w="1066"/>
             <w:vAlign w:val="center"/>
             <w:tcMar>
-              <w:top w:w="35" w:type="dxa"/>
-              <w:bottom w:w="35" w:type="dxa"/>
-              <w:left w:w="35" w:type="dxa"/>
-              <w:right w:w="35" w:type="dxa"/>
+              <w:top w:w="30" w:type="dxa"/>
+              <w:bottom w:w="30" w:type="dxa"/>
+              <w:left w:w="30" w:type="dxa"/>
+              <w:right w:w="30" w:type="dxa"/>
             </w:tcMar>
             <w:shd w:fill="FFFFFF"/>
           </w:tcPr>
@@ -4194,10 +4878,10 @@
             <w:tcW w:type="dxa" w:w="1066"/>
             <w:vAlign w:val="center"/>
             <w:tcMar>
-              <w:top w:w="35" w:type="dxa"/>
-              <w:bottom w:w="35" w:type="dxa"/>
-              <w:left w:w="35" w:type="dxa"/>
-              <w:right w:w="35" w:type="dxa"/>
+              <w:top w:w="30" w:type="dxa"/>
+              <w:bottom w:w="30" w:type="dxa"/>
+              <w:left w:w="30" w:type="dxa"/>
+              <w:right w:w="30" w:type="dxa"/>
             </w:tcMar>
             <w:shd w:fill="FFFFFF"/>
           </w:tcPr>
@@ -4220,10 +4904,10 @@
             <w:tcW w:type="dxa" w:w="1066"/>
             <w:vAlign w:val="center"/>
             <w:tcMar>
-              <w:top w:w="35" w:type="dxa"/>
-              <w:bottom w:w="35" w:type="dxa"/>
-              <w:left w:w="35" w:type="dxa"/>
-              <w:right w:w="35" w:type="dxa"/>
+              <w:top w:w="30" w:type="dxa"/>
+              <w:bottom w:w="30" w:type="dxa"/>
+              <w:left w:w="30" w:type="dxa"/>
+              <w:right w:w="30" w:type="dxa"/>
             </w:tcMar>
             <w:shd w:fill="FFFFFF"/>
           </w:tcPr>
@@ -4246,10 +4930,10 @@
             <w:tcW w:type="dxa" w:w="1066"/>
             <w:vAlign w:val="center"/>
             <w:tcMar>
-              <w:top w:w="35" w:type="dxa"/>
-              <w:bottom w:w="35" w:type="dxa"/>
-              <w:left w:w="35" w:type="dxa"/>
-              <w:right w:w="35" w:type="dxa"/>
+              <w:top w:w="30" w:type="dxa"/>
+              <w:bottom w:w="30" w:type="dxa"/>
+              <w:left w:w="30" w:type="dxa"/>
+              <w:right w:w="30" w:type="dxa"/>
             </w:tcMar>
             <w:shd w:fill="FFFFFF"/>
           </w:tcPr>
@@ -4272,10 +4956,10 @@
             <w:tcW w:type="dxa" w:w="1066"/>
             <w:vAlign w:val="center"/>
             <w:tcMar>
-              <w:top w:w="35" w:type="dxa"/>
-              <w:bottom w:w="35" w:type="dxa"/>
-              <w:left w:w="35" w:type="dxa"/>
-              <w:right w:w="35" w:type="dxa"/>
+              <w:top w:w="30" w:type="dxa"/>
+              <w:bottom w:w="30" w:type="dxa"/>
+              <w:left w:w="30" w:type="dxa"/>
+              <w:right w:w="30" w:type="dxa"/>
             </w:tcMar>
             <w:shd w:fill="FFFFFF"/>
           </w:tcPr>
@@ -4298,10 +4982,10 @@
             <w:tcW w:type="dxa" w:w="1066"/>
             <w:vAlign w:val="center"/>
             <w:tcMar>
-              <w:top w:w="35" w:type="dxa"/>
-              <w:bottom w:w="35" w:type="dxa"/>
-              <w:left w:w="35" w:type="dxa"/>
-              <w:right w:w="35" w:type="dxa"/>
+              <w:top w:w="30" w:type="dxa"/>
+              <w:bottom w:w="30" w:type="dxa"/>
+              <w:left w:w="30" w:type="dxa"/>
+              <w:right w:w="30" w:type="dxa"/>
             </w:tcMar>
             <w:shd w:fill="FFFFFF"/>
           </w:tcPr>
@@ -4324,10 +5008,10 @@
             <w:tcW w:type="dxa" w:w="1008"/>
             <w:vAlign w:val="center"/>
             <w:tcMar>
-              <w:top w:w="35" w:type="dxa"/>
-              <w:bottom w:w="35" w:type="dxa"/>
-              <w:left w:w="35" w:type="dxa"/>
-              <w:right w:w="35" w:type="dxa"/>
+              <w:top w:w="30" w:type="dxa"/>
+              <w:bottom w:w="30" w:type="dxa"/>
+              <w:left w:w="30" w:type="dxa"/>
+              <w:right w:w="30" w:type="dxa"/>
             </w:tcMar>
             <w:shd w:fill="FFFFFF"/>
           </w:tcPr>
@@ -4350,10 +5034,10 @@
             <w:tcW w:type="dxa" w:w="1080"/>
             <w:vAlign w:val="center"/>
             <w:tcMar>
-              <w:top w:w="35" w:type="dxa"/>
-              <w:bottom w:w="35" w:type="dxa"/>
-              <w:left w:w="35" w:type="dxa"/>
-              <w:right w:w="35" w:type="dxa"/>
+              <w:top w:w="30" w:type="dxa"/>
+              <w:bottom w:w="30" w:type="dxa"/>
+              <w:left w:w="30" w:type="dxa"/>
+              <w:right w:w="30" w:type="dxa"/>
             </w:tcMar>
             <w:shd w:fill="FFFFFF"/>
           </w:tcPr>
@@ -4378,10 +5062,10 @@
             <w:tcW w:type="dxa" w:w="1872"/>
             <w:vAlign w:val="center"/>
             <w:tcMar>
-              <w:top w:w="35" w:type="dxa"/>
-              <w:bottom w:w="35" w:type="dxa"/>
-              <w:left w:w="35" w:type="dxa"/>
-              <w:right w:w="35" w:type="dxa"/>
+              <w:top w:w="30" w:type="dxa"/>
+              <w:bottom w:w="30" w:type="dxa"/>
+              <w:left w:w="30" w:type="dxa"/>
+              <w:right w:w="30" w:type="dxa"/>
             </w:tcMar>
             <w:shd w:fill="FFFFFF"/>
           </w:tcPr>
@@ -4395,7 +5079,7 @@
                 <w:rFonts w:ascii="Times New Roman" w:hAnsi="Times New Roman"/>
                 <w:sz w:val="15"/>
               </w:rPr>
-              <w:t>ResNet-34 [15]</w:t>
+              <w:t>ResNet-34 [24]</w:t>
             </w:r>
           </w:p>
         </w:tc>
@@ -4404,10 +5088,10 @@
             <w:tcW w:type="dxa" w:w="1066"/>
             <w:vAlign w:val="center"/>
             <w:tcMar>
-              <w:top w:w="35" w:type="dxa"/>
-              <w:bottom w:w="35" w:type="dxa"/>
-              <w:left w:w="35" w:type="dxa"/>
-              <w:right w:w="35" w:type="dxa"/>
+              <w:top w:w="30" w:type="dxa"/>
+              <w:bottom w:w="30" w:type="dxa"/>
+              <w:left w:w="30" w:type="dxa"/>
+              <w:right w:w="30" w:type="dxa"/>
             </w:tcMar>
             <w:shd w:fill="FFFFFF"/>
           </w:tcPr>
@@ -4430,10 +5114,10 @@
             <w:tcW w:type="dxa" w:w="1066"/>
             <w:vAlign w:val="center"/>
             <w:tcMar>
-              <w:top w:w="35" w:type="dxa"/>
-              <w:bottom w:w="35" w:type="dxa"/>
-              <w:left w:w="35" w:type="dxa"/>
-              <w:right w:w="35" w:type="dxa"/>
+              <w:top w:w="30" w:type="dxa"/>
+              <w:bottom w:w="30" w:type="dxa"/>
+              <w:left w:w="30" w:type="dxa"/>
+              <w:right w:w="30" w:type="dxa"/>
             </w:tcMar>
             <w:shd w:fill="FFFFFF"/>
           </w:tcPr>
@@ -4456,10 +5140,10 @@
             <w:tcW w:type="dxa" w:w="1066"/>
             <w:vAlign w:val="center"/>
             <w:tcMar>
-              <w:top w:w="35" w:type="dxa"/>
-              <w:bottom w:w="35" w:type="dxa"/>
-              <w:left w:w="35" w:type="dxa"/>
-              <w:right w:w="35" w:type="dxa"/>
+              <w:top w:w="30" w:type="dxa"/>
+              <w:bottom w:w="30" w:type="dxa"/>
+              <w:left w:w="30" w:type="dxa"/>
+              <w:right w:w="30" w:type="dxa"/>
             </w:tcMar>
             <w:shd w:fill="FFFFFF"/>
           </w:tcPr>
@@ -4482,10 +5166,10 @@
             <w:tcW w:type="dxa" w:w="1066"/>
             <w:vAlign w:val="center"/>
             <w:tcMar>
-              <w:top w:w="35" w:type="dxa"/>
-              <w:bottom w:w="35" w:type="dxa"/>
-              <w:left w:w="35" w:type="dxa"/>
-              <w:right w:w="35" w:type="dxa"/>
+              <w:top w:w="30" w:type="dxa"/>
+              <w:bottom w:w="30" w:type="dxa"/>
+              <w:left w:w="30" w:type="dxa"/>
+              <w:right w:w="30" w:type="dxa"/>
             </w:tcMar>
             <w:shd w:fill="FFFFFF"/>
           </w:tcPr>
@@ -4508,10 +5192,10 @@
             <w:tcW w:type="dxa" w:w="1066"/>
             <w:vAlign w:val="center"/>
             <w:tcMar>
-              <w:top w:w="35" w:type="dxa"/>
-              <w:bottom w:w="35" w:type="dxa"/>
-              <w:left w:w="35" w:type="dxa"/>
-              <w:right w:w="35" w:type="dxa"/>
+              <w:top w:w="30" w:type="dxa"/>
+              <w:bottom w:w="30" w:type="dxa"/>
+              <w:left w:w="30" w:type="dxa"/>
+              <w:right w:w="30" w:type="dxa"/>
             </w:tcMar>
             <w:shd w:fill="FFFFFF"/>
           </w:tcPr>
@@ -4534,10 +5218,10 @@
             <w:tcW w:type="dxa" w:w="1066"/>
             <w:vAlign w:val="center"/>
             <w:tcMar>
-              <w:top w:w="35" w:type="dxa"/>
-              <w:bottom w:w="35" w:type="dxa"/>
-              <w:left w:w="35" w:type="dxa"/>
-              <w:right w:w="35" w:type="dxa"/>
+              <w:top w:w="30" w:type="dxa"/>
+              <w:bottom w:w="30" w:type="dxa"/>
+              <w:left w:w="30" w:type="dxa"/>
+              <w:right w:w="30" w:type="dxa"/>
             </w:tcMar>
             <w:shd w:fill="FFFFFF"/>
           </w:tcPr>
@@ -4560,10 +5244,10 @@
             <w:tcW w:type="dxa" w:w="1008"/>
             <w:vAlign w:val="center"/>
             <w:tcMar>
-              <w:top w:w="35" w:type="dxa"/>
-              <w:bottom w:w="35" w:type="dxa"/>
-              <w:left w:w="35" w:type="dxa"/>
-              <w:right w:w="35" w:type="dxa"/>
+              <w:top w:w="30" w:type="dxa"/>
+              <w:bottom w:w="30" w:type="dxa"/>
+              <w:left w:w="30" w:type="dxa"/>
+              <w:right w:w="30" w:type="dxa"/>
             </w:tcMar>
             <w:shd w:fill="FFFFFF"/>
           </w:tcPr>
@@ -4586,10 +5270,10 @@
             <w:tcW w:type="dxa" w:w="1080"/>
             <w:vAlign w:val="center"/>
             <w:tcMar>
-              <w:top w:w="35" w:type="dxa"/>
-              <w:bottom w:w="35" w:type="dxa"/>
-              <w:left w:w="35" w:type="dxa"/>
-              <w:right w:w="35" w:type="dxa"/>
+              <w:top w:w="30" w:type="dxa"/>
+              <w:bottom w:w="30" w:type="dxa"/>
+              <w:left w:w="30" w:type="dxa"/>
+              <w:right w:w="30" w:type="dxa"/>
             </w:tcMar>
             <w:shd w:fill="FFFFFF"/>
           </w:tcPr>
@@ -4614,10 +5298,10 @@
             <w:tcW w:type="dxa" w:w="1872"/>
             <w:vAlign w:val="center"/>
             <w:tcMar>
-              <w:top w:w="35" w:type="dxa"/>
-              <w:bottom w:w="35" w:type="dxa"/>
-              <w:left w:w="35" w:type="dxa"/>
-              <w:right w:w="35" w:type="dxa"/>
+              <w:top w:w="30" w:type="dxa"/>
+              <w:bottom w:w="30" w:type="dxa"/>
+              <w:left w:w="30" w:type="dxa"/>
+              <w:right w:w="30" w:type="dxa"/>
             </w:tcMar>
             <w:shd w:fill="F8FAFC"/>
           </w:tcPr>
@@ -4641,10 +5325,10 @@
             <w:tcW w:type="dxa" w:w="1066"/>
             <w:vAlign w:val="center"/>
             <w:tcMar>
-              <w:top w:w="35" w:type="dxa"/>
-              <w:bottom w:w="35" w:type="dxa"/>
-              <w:left w:w="35" w:type="dxa"/>
-              <w:right w:w="35" w:type="dxa"/>
+              <w:top w:w="30" w:type="dxa"/>
+              <w:bottom w:w="30" w:type="dxa"/>
+              <w:left w:w="30" w:type="dxa"/>
+              <w:right w:w="30" w:type="dxa"/>
             </w:tcMar>
             <w:shd w:fill="F8FAFC"/>
           </w:tcPr>
@@ -4668,10 +5352,10 @@
             <w:tcW w:type="dxa" w:w="1066"/>
             <w:vAlign w:val="center"/>
             <w:tcMar>
-              <w:top w:w="35" w:type="dxa"/>
-              <w:bottom w:w="35" w:type="dxa"/>
-              <w:left w:w="35" w:type="dxa"/>
-              <w:right w:w="35" w:type="dxa"/>
+              <w:top w:w="30" w:type="dxa"/>
+              <w:bottom w:w="30" w:type="dxa"/>
+              <w:left w:w="30" w:type="dxa"/>
+              <w:right w:w="30" w:type="dxa"/>
             </w:tcMar>
             <w:shd w:fill="F8FAFC"/>
           </w:tcPr>
@@ -4695,10 +5379,10 @@
             <w:tcW w:type="dxa" w:w="1066"/>
             <w:vAlign w:val="center"/>
             <w:tcMar>
-              <w:top w:w="35" w:type="dxa"/>
-              <w:bottom w:w="35" w:type="dxa"/>
-              <w:left w:w="35" w:type="dxa"/>
-              <w:right w:w="35" w:type="dxa"/>
+              <w:top w:w="30" w:type="dxa"/>
+              <w:bottom w:w="30" w:type="dxa"/>
+              <w:left w:w="30" w:type="dxa"/>
+              <w:right w:w="30" w:type="dxa"/>
             </w:tcMar>
             <w:shd w:fill="F8FAFC"/>
           </w:tcPr>
@@ -4722,10 +5406,10 @@
             <w:tcW w:type="dxa" w:w="1066"/>
             <w:vAlign w:val="center"/>
             <w:tcMar>
-              <w:top w:w="35" w:type="dxa"/>
-              <w:bottom w:w="35" w:type="dxa"/>
-              <w:left w:w="35" w:type="dxa"/>
-              <w:right w:w="35" w:type="dxa"/>
+              <w:top w:w="30" w:type="dxa"/>
+              <w:bottom w:w="30" w:type="dxa"/>
+              <w:left w:w="30" w:type="dxa"/>
+              <w:right w:w="30" w:type="dxa"/>
             </w:tcMar>
             <w:shd w:fill="F8FAFC"/>
           </w:tcPr>
@@ -4749,10 +5433,10 @@
             <w:tcW w:type="dxa" w:w="1066"/>
             <w:vAlign w:val="center"/>
             <w:tcMar>
-              <w:top w:w="35" w:type="dxa"/>
-              <w:bottom w:w="35" w:type="dxa"/>
-              <w:left w:w="35" w:type="dxa"/>
-              <w:right w:w="35" w:type="dxa"/>
+              <w:top w:w="30" w:type="dxa"/>
+              <w:bottom w:w="30" w:type="dxa"/>
+              <w:left w:w="30" w:type="dxa"/>
+              <w:right w:w="30" w:type="dxa"/>
             </w:tcMar>
             <w:shd w:fill="F8FAFC"/>
           </w:tcPr>
@@ -4776,10 +5460,10 @@
             <w:tcW w:type="dxa" w:w="1066"/>
             <w:vAlign w:val="center"/>
             <w:tcMar>
-              <w:top w:w="35" w:type="dxa"/>
-              <w:bottom w:w="35" w:type="dxa"/>
-              <w:left w:w="35" w:type="dxa"/>
-              <w:right w:w="35" w:type="dxa"/>
+              <w:top w:w="30" w:type="dxa"/>
+              <w:bottom w:w="30" w:type="dxa"/>
+              <w:left w:w="30" w:type="dxa"/>
+              <w:right w:w="30" w:type="dxa"/>
             </w:tcMar>
             <w:shd w:fill="F8FAFC"/>
           </w:tcPr>
@@ -4803,10 +5487,10 @@
             <w:tcW w:type="dxa" w:w="1008"/>
             <w:vAlign w:val="center"/>
             <w:tcMar>
-              <w:top w:w="35" w:type="dxa"/>
-              <w:bottom w:w="35" w:type="dxa"/>
-              <w:left w:w="35" w:type="dxa"/>
-              <w:right w:w="35" w:type="dxa"/>
+              <w:top w:w="30" w:type="dxa"/>
+              <w:bottom w:w="30" w:type="dxa"/>
+              <w:left w:w="30" w:type="dxa"/>
+              <w:right w:w="30" w:type="dxa"/>
             </w:tcMar>
             <w:shd w:fill="F8FAFC"/>
           </w:tcPr>
@@ -4830,10 +5514,10 @@
             <w:tcW w:type="dxa" w:w="1080"/>
             <w:vAlign w:val="center"/>
             <w:tcMar>
-              <w:top w:w="35" w:type="dxa"/>
-              <w:bottom w:w="35" w:type="dxa"/>
-              <w:left w:w="35" w:type="dxa"/>
-              <w:right w:w="35" w:type="dxa"/>
+              <w:top w:w="30" w:type="dxa"/>
+              <w:bottom w:w="30" w:type="dxa"/>
+              <w:left w:w="30" w:type="dxa"/>
+              <w:right w:w="30" w:type="dxa"/>
             </w:tcMar>
             <w:shd w:fill="F8FAFC"/>
           </w:tcPr>
@@ -5058,10 +5742,10 @@
             <w:tcW w:type="dxa" w:w="1728"/>
             <w:vAlign w:val="center"/>
             <w:tcMar>
-              <w:top w:w="25" w:type="dxa"/>
-              <w:bottom w:w="25" w:type="dxa"/>
-              <w:left w:w="30" w:type="dxa"/>
-              <w:right w:w="30" w:type="dxa"/>
+              <w:top w:w="20" w:type="dxa"/>
+              <w:bottom w:w="20" w:type="dxa"/>
+              <w:left w:w="25" w:type="dxa"/>
+              <w:right w:w="25" w:type="dxa"/>
             </w:tcMar>
             <w:shd w:fill="F1F5F9"/>
           </w:tcPr>
@@ -5085,10 +5769,10 @@
             <w:tcW w:type="dxa" w:w="936"/>
             <w:vAlign w:val="center"/>
             <w:tcMar>
-              <w:top w:w="25" w:type="dxa"/>
-              <w:bottom w:w="25" w:type="dxa"/>
-              <w:left w:w="30" w:type="dxa"/>
-              <w:right w:w="30" w:type="dxa"/>
+              <w:top w:w="20" w:type="dxa"/>
+              <w:bottom w:w="20" w:type="dxa"/>
+              <w:left w:w="25" w:type="dxa"/>
+              <w:right w:w="25" w:type="dxa"/>
             </w:tcMar>
             <w:shd w:fill="F1F5F9"/>
           </w:tcPr>
@@ -5112,10 +5796,10 @@
             <w:tcW w:type="dxa" w:w="1080"/>
             <w:vAlign w:val="center"/>
             <w:tcMar>
-              <w:top w:w="25" w:type="dxa"/>
-              <w:bottom w:w="25" w:type="dxa"/>
-              <w:left w:w="30" w:type="dxa"/>
-              <w:right w:w="30" w:type="dxa"/>
+              <w:top w:w="20" w:type="dxa"/>
+              <w:bottom w:w="20" w:type="dxa"/>
+              <w:left w:w="25" w:type="dxa"/>
+              <w:right w:w="25" w:type="dxa"/>
             </w:tcMar>
             <w:shd w:fill="F1F5F9"/>
           </w:tcPr>
@@ -5139,10 +5823,10 @@
             <w:tcW w:type="dxa" w:w="1296"/>
             <w:vAlign w:val="center"/>
             <w:tcMar>
-              <w:top w:w="25" w:type="dxa"/>
-              <w:bottom w:w="25" w:type="dxa"/>
-              <w:left w:w="30" w:type="dxa"/>
-              <w:right w:w="30" w:type="dxa"/>
+              <w:top w:w="20" w:type="dxa"/>
+              <w:bottom w:w="20" w:type="dxa"/>
+              <w:left w:w="25" w:type="dxa"/>
+              <w:right w:w="25" w:type="dxa"/>
             </w:tcMar>
             <w:shd w:fill="F1F5F9"/>
           </w:tcPr>
@@ -5168,10 +5852,10 @@
             <w:tcW w:type="dxa" w:w="1728"/>
             <w:vAlign w:val="center"/>
             <w:tcMar>
-              <w:top w:w="25" w:type="dxa"/>
-              <w:bottom w:w="25" w:type="dxa"/>
-              <w:left w:w="30" w:type="dxa"/>
-              <w:right w:w="30" w:type="dxa"/>
+              <w:top w:w="20" w:type="dxa"/>
+              <w:bottom w:w="20" w:type="dxa"/>
+              <w:left w:w="25" w:type="dxa"/>
+              <w:right w:w="25" w:type="dxa"/>
             </w:tcMar>
             <w:shd w:fill="FFFFFF"/>
           </w:tcPr>
@@ -5185,7 +5869,7 @@
                 <w:rFonts w:ascii="Times New Roman" w:hAnsi="Times New Roman"/>
                 <w:sz w:val="15"/>
               </w:rPr>
-              <w:t>Heinsfeld et al. [4]</w:t>
+              <w:t>Heinsfeld et al. [18]</w:t>
             </w:r>
           </w:p>
         </w:tc>
@@ -5194,10 +5878,10 @@
             <w:tcW w:type="dxa" w:w="936"/>
             <w:vAlign w:val="center"/>
             <w:tcMar>
-              <w:top w:w="25" w:type="dxa"/>
-              <w:bottom w:w="25" w:type="dxa"/>
-              <w:left w:w="30" w:type="dxa"/>
-              <w:right w:w="30" w:type="dxa"/>
+              <w:top w:w="20" w:type="dxa"/>
+              <w:bottom w:w="20" w:type="dxa"/>
+              <w:left w:w="25" w:type="dxa"/>
+              <w:right w:w="25" w:type="dxa"/>
             </w:tcMar>
             <w:shd w:fill="FFFFFF"/>
           </w:tcPr>
@@ -5220,10 +5904,10 @@
             <w:tcW w:type="dxa" w:w="1080"/>
             <w:vAlign w:val="center"/>
             <w:tcMar>
-              <w:top w:w="25" w:type="dxa"/>
-              <w:bottom w:w="25" w:type="dxa"/>
-              <w:left w:w="30" w:type="dxa"/>
-              <w:right w:w="30" w:type="dxa"/>
+              <w:top w:w="20" w:type="dxa"/>
+              <w:bottom w:w="20" w:type="dxa"/>
+              <w:left w:w="25" w:type="dxa"/>
+              <w:right w:w="25" w:type="dxa"/>
             </w:tcMar>
             <w:shd w:fill="FFFFFF"/>
           </w:tcPr>
@@ -5246,10 +5930,10 @@
             <w:tcW w:type="dxa" w:w="1296"/>
             <w:vAlign w:val="center"/>
             <w:tcMar>
-              <w:top w:w="25" w:type="dxa"/>
-              <w:bottom w:w="25" w:type="dxa"/>
-              <w:left w:w="30" w:type="dxa"/>
-              <w:right w:w="30" w:type="dxa"/>
+              <w:top w:w="20" w:type="dxa"/>
+              <w:bottom w:w="20" w:type="dxa"/>
+              <w:left w:w="25" w:type="dxa"/>
+              <w:right w:w="25" w:type="dxa"/>
             </w:tcMar>
             <w:shd w:fill="FFFFFF"/>
           </w:tcPr>
@@ -5274,10 +5958,10 @@
             <w:tcW w:type="dxa" w:w="1728"/>
             <w:vAlign w:val="center"/>
             <w:tcMar>
-              <w:top w:w="25" w:type="dxa"/>
-              <w:bottom w:w="25" w:type="dxa"/>
-              <w:left w:w="30" w:type="dxa"/>
-              <w:right w:w="30" w:type="dxa"/>
+              <w:top w:w="20" w:type="dxa"/>
+              <w:bottom w:w="20" w:type="dxa"/>
+              <w:left w:w="25" w:type="dxa"/>
+              <w:right w:w="25" w:type="dxa"/>
             </w:tcMar>
             <w:shd w:fill="FFFFFF"/>
           </w:tcPr>
@@ -5291,7 +5975,7 @@
                 <w:rFonts w:ascii="Times New Roman" w:hAnsi="Times New Roman"/>
                 <w:sz w:val="15"/>
               </w:rPr>
-              <w:t>DiagNet [5]</w:t>
+              <w:t>Singh et al. [19]</w:t>
             </w:r>
           </w:p>
         </w:tc>
@@ -5300,10 +5984,10 @@
             <w:tcW w:type="dxa" w:w="936"/>
             <w:vAlign w:val="center"/>
             <w:tcMar>
-              <w:top w:w="25" w:type="dxa"/>
-              <w:bottom w:w="25" w:type="dxa"/>
-              <w:left w:w="30" w:type="dxa"/>
-              <w:right w:w="30" w:type="dxa"/>
+              <w:top w:w="20" w:type="dxa"/>
+              <w:bottom w:w="20" w:type="dxa"/>
+              <w:left w:w="25" w:type="dxa"/>
+              <w:right w:w="25" w:type="dxa"/>
             </w:tcMar>
             <w:shd w:fill="FFFFFF"/>
           </w:tcPr>
@@ -5326,10 +6010,10 @@
             <w:tcW w:type="dxa" w:w="1080"/>
             <w:vAlign w:val="center"/>
             <w:tcMar>
-              <w:top w:w="25" w:type="dxa"/>
-              <w:bottom w:w="25" w:type="dxa"/>
-              <w:left w:w="30" w:type="dxa"/>
-              <w:right w:w="30" w:type="dxa"/>
+              <w:top w:w="20" w:type="dxa"/>
+              <w:bottom w:w="20" w:type="dxa"/>
+              <w:left w:w="25" w:type="dxa"/>
+              <w:right w:w="25" w:type="dxa"/>
             </w:tcMar>
             <w:shd w:fill="FFFFFF"/>
           </w:tcPr>
@@ -5352,222 +6036,10 @@
             <w:tcW w:type="dxa" w:w="1296"/>
             <w:vAlign w:val="center"/>
             <w:tcMar>
-              <w:top w:w="25" w:type="dxa"/>
-              <w:bottom w:w="25" w:type="dxa"/>
-              <w:left w:w="30" w:type="dxa"/>
-              <w:right w:w="30" w:type="dxa"/>
-            </w:tcMar>
-            <w:shd w:fill="FFFFFF"/>
-          </w:tcPr>
-          <w:p>
-            <w:pPr>
-              <w:spacing w:before="0" w:after="0"/>
-              <w:jc w:val="center"/>
-            </w:pPr>
-            <w:r>
-              <w:rPr>
-                <w:rFonts w:ascii="Times New Roman" w:hAnsi="Times New Roman"/>
-                <w:sz w:val="15"/>
-              </w:rPr>
-              <w:t>70.3% / —</w:t>
-            </w:r>
-          </w:p>
-        </w:tc>
-      </w:tr>
-      <w:tr>
-        <w:tc>
-          <w:tcPr>
-            <w:tcW w:type="dxa" w:w="1728"/>
-            <w:vAlign w:val="center"/>
-            <w:tcMar>
-              <w:top w:w="25" w:type="dxa"/>
-              <w:bottom w:w="25" w:type="dxa"/>
-              <w:left w:w="30" w:type="dxa"/>
-              <w:right w:w="30" w:type="dxa"/>
-            </w:tcMar>
-            <w:shd w:fill="FFFFFF"/>
-          </w:tcPr>
-          <w:p>
-            <w:pPr>
-              <w:spacing w:before="0" w:after="0"/>
-              <w:jc w:val="left"/>
-            </w:pPr>
-            <w:r>
-              <w:rPr>
-                <w:rFonts w:ascii="Times New Roman" w:hAnsi="Times New Roman"/>
-                <w:sz w:val="15"/>
-              </w:rPr>
-              <w:t>MIDA [11]</w:t>
-            </w:r>
-          </w:p>
-        </w:tc>
-        <w:tc>
-          <w:tcPr>
-            <w:tcW w:type="dxa" w:w="936"/>
-            <w:vAlign w:val="center"/>
-            <w:tcMar>
-              <w:top w:w="25" w:type="dxa"/>
-              <w:bottom w:w="25" w:type="dxa"/>
-              <w:left w:w="30" w:type="dxa"/>
-              <w:right w:w="30" w:type="dxa"/>
-            </w:tcMar>
-            <w:shd w:fill="FFFFFF"/>
-          </w:tcPr>
-          <w:p>
-            <w:pPr>
-              <w:spacing w:before="0" w:after="0"/>
-              <w:jc w:val="center"/>
-            </w:pPr>
-            <w:r>
-              <w:rPr>
-                <w:rFonts w:ascii="Times New Roman" w:hAnsi="Times New Roman"/>
-                <w:sz w:val="15"/>
-              </w:rPr>
-              <w:t>rs-fMRI</w:t>
-            </w:r>
-          </w:p>
-        </w:tc>
-        <w:tc>
-          <w:tcPr>
-            <w:tcW w:type="dxa" w:w="1080"/>
-            <w:vAlign w:val="center"/>
-            <w:tcMar>
-              <w:top w:w="25" w:type="dxa"/>
-              <w:bottom w:w="25" w:type="dxa"/>
-              <w:left w:w="30" w:type="dxa"/>
-              <w:right w:w="30" w:type="dxa"/>
-            </w:tcMar>
-            <w:shd w:fill="FFFFFF"/>
-          </w:tcPr>
-          <w:p>
-            <w:pPr>
-              <w:spacing w:before="0" w:after="0"/>
-              <w:jc w:val="center"/>
-            </w:pPr>
-            <w:r>
-              <w:rPr>
-                <w:rFonts w:ascii="Times New Roman" w:hAnsi="Times New Roman"/>
-                <w:sz w:val="15"/>
-              </w:rPr>
-              <w:t>15–30 min</w:t>
-            </w:r>
-          </w:p>
-        </w:tc>
-        <w:tc>
-          <w:tcPr>
-            <w:tcW w:type="dxa" w:w="1296"/>
-            <w:vAlign w:val="center"/>
-            <w:tcMar>
-              <w:top w:w="25" w:type="dxa"/>
-              <w:bottom w:w="25" w:type="dxa"/>
-              <w:left w:w="30" w:type="dxa"/>
-              <w:right w:w="30" w:type="dxa"/>
-            </w:tcMar>
-            <w:shd w:fill="FFFFFF"/>
-          </w:tcPr>
-          <w:p>
-            <w:pPr>
-              <w:spacing w:before="0" w:after="0"/>
-              <w:jc w:val="center"/>
-            </w:pPr>
-            <w:r>
-              <w:rPr>
-                <w:rFonts w:ascii="Times New Roman" w:hAnsi="Times New Roman"/>
-                <w:sz w:val="15"/>
-              </w:rPr>
-              <w:t>72.0% / 78.6%</w:t>
-            </w:r>
-          </w:p>
-        </w:tc>
-      </w:tr>
-      <w:tr>
-        <w:tc>
-          <w:tcPr>
-            <w:tcW w:type="dxa" w:w="1728"/>
-            <w:vAlign w:val="center"/>
-            <w:tcMar>
-              <w:top w:w="25" w:type="dxa"/>
-              <w:bottom w:w="25" w:type="dxa"/>
-              <w:left w:w="30" w:type="dxa"/>
-              <w:right w:w="30" w:type="dxa"/>
-            </w:tcMar>
-            <w:shd w:fill="FFFFFF"/>
-          </w:tcPr>
-          <w:p>
-            <w:pPr>
-              <w:spacing w:before="0" w:after="0"/>
-              <w:jc w:val="left"/>
-            </w:pPr>
-            <w:r>
-              <w:rPr>
-                <w:rFonts w:ascii="Times New Roman" w:hAnsi="Times New Roman"/>
-                <w:sz w:val="15"/>
-              </w:rPr>
-              <w:t>Singh et al. [6]</w:t>
-            </w:r>
-          </w:p>
-        </w:tc>
-        <w:tc>
-          <w:tcPr>
-            <w:tcW w:type="dxa" w:w="936"/>
-            <w:vAlign w:val="center"/>
-            <w:tcMar>
-              <w:top w:w="25" w:type="dxa"/>
-              <w:bottom w:w="25" w:type="dxa"/>
-              <w:left w:w="30" w:type="dxa"/>
-              <w:right w:w="30" w:type="dxa"/>
-            </w:tcMar>
-            <w:shd w:fill="FFFFFF"/>
-          </w:tcPr>
-          <w:p>
-            <w:pPr>
-              <w:spacing w:before="0" w:after="0"/>
-              <w:jc w:val="center"/>
-            </w:pPr>
-            <w:r>
-              <w:rPr>
-                <w:rFonts w:ascii="Times New Roman" w:hAnsi="Times New Roman"/>
-                <w:sz w:val="15"/>
-              </w:rPr>
-              <w:t>rs-fMRI</w:t>
-            </w:r>
-          </w:p>
-        </w:tc>
-        <w:tc>
-          <w:tcPr>
-            <w:tcW w:type="dxa" w:w="1080"/>
-            <w:vAlign w:val="center"/>
-            <w:tcMar>
-              <w:top w:w="25" w:type="dxa"/>
-              <w:bottom w:w="25" w:type="dxa"/>
-              <w:left w:w="30" w:type="dxa"/>
-              <w:right w:w="30" w:type="dxa"/>
-            </w:tcMar>
-            <w:shd w:fill="FFFFFF"/>
-          </w:tcPr>
-          <w:p>
-            <w:pPr>
-              <w:spacing w:before="0" w:after="0"/>
-              <w:jc w:val="center"/>
-            </w:pPr>
-            <w:r>
-              <w:rPr>
-                <w:rFonts w:ascii="Times New Roman" w:hAnsi="Times New Roman"/>
-                <w:sz w:val="15"/>
-              </w:rPr>
-              <w:t>15–30 min</w:t>
-            </w:r>
-          </w:p>
-        </w:tc>
-        <w:tc>
-          <w:tcPr>
-            <w:tcW w:type="dxa" w:w="1296"/>
-            <w:vAlign w:val="center"/>
-            <w:tcMar>
-              <w:top w:w="25" w:type="dxa"/>
-              <w:bottom w:w="25" w:type="dxa"/>
-              <w:left w:w="30" w:type="dxa"/>
-              <w:right w:w="30" w:type="dxa"/>
+              <w:top w:w="20" w:type="dxa"/>
+              <w:bottom w:w="20" w:type="dxa"/>
+              <w:left w:w="25" w:type="dxa"/>
+              <w:right w:w="25" w:type="dxa"/>
             </w:tcMar>
             <w:shd w:fill="FFFFFF"/>
           </w:tcPr>
@@ -5592,10 +6064,10 @@
             <w:tcW w:type="dxa" w:w="1728"/>
             <w:vAlign w:val="center"/>
             <w:tcMar>
-              <w:top w:w="25" w:type="dxa"/>
-              <w:bottom w:w="25" w:type="dxa"/>
-              <w:left w:w="30" w:type="dxa"/>
-              <w:right w:w="30" w:type="dxa"/>
+              <w:top w:w="20" w:type="dxa"/>
+              <w:bottom w:w="20" w:type="dxa"/>
+              <w:left w:w="25" w:type="dxa"/>
+              <w:right w:w="25" w:type="dxa"/>
             </w:tcMar>
             <w:shd w:fill="FFFFFF"/>
           </w:tcPr>
@@ -5609,7 +6081,7 @@
                 <w:rFonts w:ascii="Times New Roman" w:hAnsi="Times New Roman"/>
                 <w:sz w:val="15"/>
               </w:rPr>
-              <w:t>AlexNet Baseline [10]</w:t>
+              <w:t>Gaddala et al. [5]</w:t>
             </w:r>
           </w:p>
         </w:tc>
@@ -5618,10 +6090,10 @@
             <w:tcW w:type="dxa" w:w="936"/>
             <w:vAlign w:val="center"/>
             <w:tcMar>
-              <w:top w:w="25" w:type="dxa"/>
-              <w:bottom w:w="25" w:type="dxa"/>
-              <w:left w:w="30" w:type="dxa"/>
-              <w:right w:w="30" w:type="dxa"/>
+              <w:top w:w="20" w:type="dxa"/>
+              <w:bottom w:w="20" w:type="dxa"/>
+              <w:left w:w="25" w:type="dxa"/>
+              <w:right w:w="25" w:type="dxa"/>
             </w:tcMar>
             <w:shd w:fill="FFFFFF"/>
           </w:tcPr>
@@ -5644,10 +6116,10 @@
             <w:tcW w:type="dxa" w:w="1080"/>
             <w:vAlign w:val="center"/>
             <w:tcMar>
-              <w:top w:w="25" w:type="dxa"/>
-              <w:bottom w:w="25" w:type="dxa"/>
-              <w:left w:w="30" w:type="dxa"/>
-              <w:right w:w="30" w:type="dxa"/>
+              <w:top w:w="20" w:type="dxa"/>
+              <w:bottom w:w="20" w:type="dxa"/>
+              <w:left w:w="25" w:type="dxa"/>
+              <w:right w:w="25" w:type="dxa"/>
             </w:tcMar>
             <w:shd w:fill="FFFFFF"/>
           </w:tcPr>
@@ -5661,7 +6133,7 @@
                 <w:rFonts w:ascii="Times New Roman" w:hAnsi="Times New Roman"/>
                 <w:sz w:val="15"/>
               </w:rPr>
-              <w:t>~38 ms</w:t>
+              <w:t>~110 ms</w:t>
             </w:r>
           </w:p>
         </w:tc>
@@ -5670,10 +6142,10 @@
             <w:tcW w:type="dxa" w:w="1296"/>
             <w:vAlign w:val="center"/>
             <w:tcMar>
-              <w:top w:w="25" w:type="dxa"/>
-              <w:bottom w:w="25" w:type="dxa"/>
-              <w:left w:w="30" w:type="dxa"/>
-              <w:right w:w="30" w:type="dxa"/>
+              <w:top w:w="20" w:type="dxa"/>
+              <w:bottom w:w="20" w:type="dxa"/>
+              <w:left w:w="25" w:type="dxa"/>
+              <w:right w:w="25" w:type="dxa"/>
             </w:tcMar>
             <w:shd w:fill="FFFFFF"/>
           </w:tcPr>
@@ -5687,7 +6159,7 @@
                 <w:rFonts w:ascii="Times New Roman" w:hAnsi="Times New Roman"/>
                 <w:sz w:val="15"/>
               </w:rPr>
-              <w:t>74.1% / 80.2%</w:t>
+              <w:t>86.3% / —</w:t>
             </w:r>
           </w:p>
         </w:tc>
@@ -5698,10 +6170,10 @@
             <w:tcW w:type="dxa" w:w="1728"/>
             <w:vAlign w:val="center"/>
             <w:tcMar>
-              <w:top w:w="25" w:type="dxa"/>
-              <w:bottom w:w="25" w:type="dxa"/>
-              <w:left w:w="30" w:type="dxa"/>
-              <w:right w:w="30" w:type="dxa"/>
+              <w:top w:w="20" w:type="dxa"/>
+              <w:bottom w:w="20" w:type="dxa"/>
+              <w:left w:w="25" w:type="dxa"/>
+              <w:right w:w="25" w:type="dxa"/>
             </w:tcMar>
             <w:shd w:fill="FFFFFF"/>
           </w:tcPr>
@@ -5715,7 +6187,7 @@
                 <w:rFonts w:ascii="Times New Roman" w:hAnsi="Times New Roman"/>
                 <w:sz w:val="15"/>
               </w:rPr>
-              <w:t>MobileNet-V2 [10]</w:t>
+              <w:t>Akter et al. [4]</w:t>
             </w:r>
           </w:p>
         </w:tc>
@@ -5724,10 +6196,10 @@
             <w:tcW w:type="dxa" w:w="936"/>
             <w:vAlign w:val="center"/>
             <w:tcMar>
-              <w:top w:w="25" w:type="dxa"/>
-              <w:bottom w:w="25" w:type="dxa"/>
-              <w:left w:w="30" w:type="dxa"/>
-              <w:right w:w="30" w:type="dxa"/>
+              <w:top w:w="20" w:type="dxa"/>
+              <w:bottom w:w="20" w:type="dxa"/>
+              <w:left w:w="25" w:type="dxa"/>
+              <w:right w:w="25" w:type="dxa"/>
             </w:tcMar>
             <w:shd w:fill="FFFFFF"/>
           </w:tcPr>
@@ -5750,10 +6222,116 @@
             <w:tcW w:type="dxa" w:w="1080"/>
             <w:vAlign w:val="center"/>
             <w:tcMar>
-              <w:top w:w="25" w:type="dxa"/>
-              <w:bottom w:w="25" w:type="dxa"/>
-              <w:left w:w="30" w:type="dxa"/>
-              <w:right w:w="30" w:type="dxa"/>
+              <w:top w:w="20" w:type="dxa"/>
+              <w:bottom w:w="20" w:type="dxa"/>
+              <w:left w:w="25" w:type="dxa"/>
+              <w:right w:w="25" w:type="dxa"/>
+            </w:tcMar>
+            <w:shd w:fill="FFFFFF"/>
+          </w:tcPr>
+          <w:p>
+            <w:pPr>
+              <w:spacing w:before="0" w:after="0"/>
+              <w:jc w:val="center"/>
+            </w:pPr>
+            <w:r>
+              <w:rPr>
+                <w:rFonts w:ascii="Times New Roman" w:hAnsi="Times New Roman"/>
+                <w:sz w:val="15"/>
+              </w:rPr>
+              <w:t>~30 ms</w:t>
+            </w:r>
+          </w:p>
+        </w:tc>
+        <w:tc>
+          <w:tcPr>
+            <w:tcW w:type="dxa" w:w="1296"/>
+            <w:vAlign w:val="center"/>
+            <w:tcMar>
+              <w:top w:w="20" w:type="dxa"/>
+              <w:bottom w:w="20" w:type="dxa"/>
+              <w:left w:w="25" w:type="dxa"/>
+              <w:right w:w="25" w:type="dxa"/>
+            </w:tcMar>
+            <w:shd w:fill="FFFFFF"/>
+          </w:tcPr>
+          <w:p>
+            <w:pPr>
+              <w:spacing w:before="0" w:after="0"/>
+              <w:jc w:val="center"/>
+            </w:pPr>
+            <w:r>
+              <w:rPr>
+                <w:rFonts w:ascii="Times New Roman" w:hAnsi="Times New Roman"/>
+                <w:sz w:val="15"/>
+              </w:rPr>
+              <w:t>90.7% / —</w:t>
+            </w:r>
+          </w:p>
+        </w:tc>
+      </w:tr>
+      <w:tr>
+        <w:tc>
+          <w:tcPr>
+            <w:tcW w:type="dxa" w:w="1728"/>
+            <w:vAlign w:val="center"/>
+            <w:tcMar>
+              <w:top w:w="20" w:type="dxa"/>
+              <w:bottom w:w="20" w:type="dxa"/>
+              <w:left w:w="25" w:type="dxa"/>
+              <w:right w:w="25" w:type="dxa"/>
+            </w:tcMar>
+            <w:shd w:fill="FFFFFF"/>
+          </w:tcPr>
+          <w:p>
+            <w:pPr>
+              <w:spacing w:before="0" w:after="0"/>
+              <w:jc w:val="left"/>
+            </w:pPr>
+            <w:r>
+              <w:rPr>
+                <w:rFonts w:ascii="Times New Roman" w:hAnsi="Times New Roman"/>
+                <w:sz w:val="15"/>
+              </w:rPr>
+              <w:t>Alkahtani et al. [7]</w:t>
+            </w:r>
+          </w:p>
+        </w:tc>
+        <w:tc>
+          <w:tcPr>
+            <w:tcW w:type="dxa" w:w="936"/>
+            <w:vAlign w:val="center"/>
+            <w:tcMar>
+              <w:top w:w="20" w:type="dxa"/>
+              <w:bottom w:w="20" w:type="dxa"/>
+              <w:left w:w="25" w:type="dxa"/>
+              <w:right w:w="25" w:type="dxa"/>
+            </w:tcMar>
+            <w:shd w:fill="FFFFFF"/>
+          </w:tcPr>
+          <w:p>
+            <w:pPr>
+              <w:spacing w:before="0" w:after="0"/>
+              <w:jc w:val="center"/>
+            </w:pPr>
+            <w:r>
+              <w:rPr>
+                <w:rFonts w:ascii="Times New Roman" w:hAnsi="Times New Roman"/>
+                <w:sz w:val="15"/>
+              </w:rPr>
+              <w:t>2D Photos</w:t>
+            </w:r>
+          </w:p>
+        </w:tc>
+        <w:tc>
+          <w:tcPr>
+            <w:tcW w:type="dxa" w:w="1080"/>
+            <w:vAlign w:val="center"/>
+            <w:tcMar>
+              <w:top w:w="20" w:type="dxa"/>
+              <w:bottom w:w="20" w:type="dxa"/>
+              <w:left w:w="25" w:type="dxa"/>
+              <w:right w:w="25" w:type="dxa"/>
             </w:tcMar>
             <w:shd w:fill="FFFFFF"/>
           </w:tcPr>
@@ -5776,10 +6354,10 @@
             <w:tcW w:type="dxa" w:w="1296"/>
             <w:vAlign w:val="center"/>
             <w:tcMar>
-              <w:top w:w="25" w:type="dxa"/>
-              <w:bottom w:w="25" w:type="dxa"/>
-              <w:left w:w="30" w:type="dxa"/>
-              <w:right w:w="30" w:type="dxa"/>
+              <w:top w:w="20" w:type="dxa"/>
+              <w:bottom w:w="20" w:type="dxa"/>
+              <w:left w:w="25" w:type="dxa"/>
+              <w:right w:w="25" w:type="dxa"/>
             </w:tcMar>
             <w:shd w:fill="FFFFFF"/>
           </w:tcPr>
@@ -5793,7 +6371,7 @@
                 <w:rFonts w:ascii="Times New Roman" w:hAnsi="Times New Roman"/>
                 <w:sz w:val="15"/>
               </w:rPr>
-              <w:t>76.4% / 82.5%</w:t>
+              <w:t>92.0% / —</w:t>
             </w:r>
           </w:p>
         </w:tc>
@@ -5804,10 +6382,10 @@
             <w:tcW w:type="dxa" w:w="1728"/>
             <w:vAlign w:val="center"/>
             <w:tcMar>
-              <w:top w:w="25" w:type="dxa"/>
-              <w:bottom w:w="25" w:type="dxa"/>
-              <w:left w:w="30" w:type="dxa"/>
-              <w:right w:w="30" w:type="dxa"/>
+              <w:top w:w="20" w:type="dxa"/>
+              <w:bottom w:w="20" w:type="dxa"/>
+              <w:left w:w="25" w:type="dxa"/>
+              <w:right w:w="25" w:type="dxa"/>
             </w:tcMar>
             <w:shd w:fill="FFFFFF"/>
           </w:tcPr>
@@ -5821,7 +6399,7 @@
                 <w:rFonts w:ascii="Times New Roman" w:hAnsi="Times New Roman"/>
                 <w:sz w:val="15"/>
               </w:rPr>
-              <w:t>VGG-19 Baseline [10]</w:t>
+              <w:t>Revathi et al. [3]</w:t>
             </w:r>
           </w:p>
         </w:tc>
@@ -5830,10 +6408,10 @@
             <w:tcW w:type="dxa" w:w="936"/>
             <w:vAlign w:val="center"/>
             <w:tcMar>
-              <w:top w:w="25" w:type="dxa"/>
-              <w:bottom w:w="25" w:type="dxa"/>
-              <w:left w:w="30" w:type="dxa"/>
-              <w:right w:w="30" w:type="dxa"/>
+              <w:top w:w="20" w:type="dxa"/>
+              <w:bottom w:w="20" w:type="dxa"/>
+              <w:left w:w="25" w:type="dxa"/>
+              <w:right w:w="25" w:type="dxa"/>
             </w:tcMar>
             <w:shd w:fill="FFFFFF"/>
           </w:tcPr>
@@ -5856,10 +6434,10 @@
             <w:tcW w:type="dxa" w:w="1080"/>
             <w:vAlign w:val="center"/>
             <w:tcMar>
-              <w:top w:w="25" w:type="dxa"/>
-              <w:bottom w:w="25" w:type="dxa"/>
-              <w:left w:w="30" w:type="dxa"/>
-              <w:right w:w="30" w:type="dxa"/>
+              <w:top w:w="20" w:type="dxa"/>
+              <w:bottom w:w="20" w:type="dxa"/>
+              <w:left w:w="25" w:type="dxa"/>
+              <w:right w:w="25" w:type="dxa"/>
             </w:tcMar>
             <w:shd w:fill="FFFFFF"/>
           </w:tcPr>
@@ -5873,7 +6451,7 @@
                 <w:rFonts w:ascii="Times New Roman" w:hAnsi="Times New Roman"/>
                 <w:sz w:val="15"/>
               </w:rPr>
-              <w:t>~125 ms</w:t>
+              <w:t>~95 ms</w:t>
             </w:r>
           </w:p>
         </w:tc>
@@ -5882,10 +6460,10 @@
             <w:tcW w:type="dxa" w:w="1296"/>
             <w:vAlign w:val="center"/>
             <w:tcMar>
-              <w:top w:w="25" w:type="dxa"/>
-              <w:bottom w:w="25" w:type="dxa"/>
-              <w:left w:w="30" w:type="dxa"/>
-              <w:right w:w="30" w:type="dxa"/>
+              <w:top w:w="20" w:type="dxa"/>
+              <w:bottom w:w="20" w:type="dxa"/>
+              <w:left w:w="25" w:type="dxa"/>
+              <w:right w:w="25" w:type="dxa"/>
             </w:tcMar>
             <w:shd w:fill="FFFFFF"/>
           </w:tcPr>
@@ -5899,7 +6477,7 @@
                 <w:rFonts w:ascii="Times New Roman" w:hAnsi="Times New Roman"/>
                 <w:sz w:val="15"/>
               </w:rPr>
-              <w:t>79.5% / 85.3%</w:t>
+              <w:t>92.0% / 96.7%</w:t>
             </w:r>
           </w:p>
         </w:tc>
@@ -5910,10 +6488,10 @@
             <w:tcW w:type="dxa" w:w="1728"/>
             <w:vAlign w:val="center"/>
             <w:tcMar>
-              <w:top w:w="25" w:type="dxa"/>
-              <w:bottom w:w="25" w:type="dxa"/>
-              <w:left w:w="30" w:type="dxa"/>
-              <w:right w:w="30" w:type="dxa"/>
+              <w:top w:w="20" w:type="dxa"/>
+              <w:bottom w:w="20" w:type="dxa"/>
+              <w:left w:w="25" w:type="dxa"/>
+              <w:right w:w="25" w:type="dxa"/>
             </w:tcMar>
             <w:shd w:fill="FFFFFF"/>
           </w:tcPr>
@@ -5927,7 +6505,7 @@
                 <w:rFonts w:ascii="Times New Roman" w:hAnsi="Times New Roman"/>
                 <w:sz w:val="15"/>
               </w:rPr>
-              <w:t>ResNet-34 [10]</w:t>
+              <w:t>Lu &amp; Perkowski [6]</w:t>
             </w:r>
           </w:p>
         </w:tc>
@@ -5936,10 +6514,10 @@
             <w:tcW w:type="dxa" w:w="936"/>
             <w:vAlign w:val="center"/>
             <w:tcMar>
-              <w:top w:w="25" w:type="dxa"/>
-              <w:bottom w:w="25" w:type="dxa"/>
-              <w:left w:w="30" w:type="dxa"/>
-              <w:right w:w="30" w:type="dxa"/>
+              <w:top w:w="20" w:type="dxa"/>
+              <w:bottom w:w="20" w:type="dxa"/>
+              <w:left w:w="25" w:type="dxa"/>
+              <w:right w:w="25" w:type="dxa"/>
             </w:tcMar>
             <w:shd w:fill="FFFFFF"/>
           </w:tcPr>
@@ -5962,10 +6540,10 @@
             <w:tcW w:type="dxa" w:w="1080"/>
             <w:vAlign w:val="center"/>
             <w:tcMar>
-              <w:top w:w="25" w:type="dxa"/>
-              <w:bottom w:w="25" w:type="dxa"/>
-              <w:left w:w="30" w:type="dxa"/>
-              <w:right w:w="30" w:type="dxa"/>
+              <w:top w:w="20" w:type="dxa"/>
+              <w:bottom w:w="20" w:type="dxa"/>
+              <w:left w:w="25" w:type="dxa"/>
+              <w:right w:w="25" w:type="dxa"/>
             </w:tcMar>
             <w:shd w:fill="FFFFFF"/>
           </w:tcPr>
@@ -5979,7 +6557,7 @@
                 <w:rFonts w:ascii="Times New Roman" w:hAnsi="Times New Roman"/>
                 <w:sz w:val="15"/>
               </w:rPr>
-              <w:t>~52 ms</w:t>
+              <w:t>~110 ms</w:t>
             </w:r>
           </w:p>
         </w:tc>
@@ -5988,10 +6566,10 @@
             <w:tcW w:type="dxa" w:w="1296"/>
             <w:vAlign w:val="center"/>
             <w:tcMar>
-              <w:top w:w="25" w:type="dxa"/>
-              <w:bottom w:w="25" w:type="dxa"/>
-              <w:left w:w="30" w:type="dxa"/>
-              <w:right w:w="30" w:type="dxa"/>
+              <w:top w:w="20" w:type="dxa"/>
+              <w:bottom w:w="20" w:type="dxa"/>
+              <w:left w:w="25" w:type="dxa"/>
+              <w:right w:w="25" w:type="dxa"/>
             </w:tcMar>
             <w:shd w:fill="FFFFFF"/>
           </w:tcPr>
@@ -6005,7 +6583,7 @@
                 <w:rFonts w:ascii="Times New Roman" w:hAnsi="Times New Roman"/>
                 <w:sz w:val="15"/>
               </w:rPr>
-              <w:t>81.2% / 87.1%</w:t>
+              <w:t>95.0% / —</w:t>
             </w:r>
           </w:p>
         </w:tc>
@@ -6016,10 +6594,222 @@
             <w:tcW w:type="dxa" w:w="1728"/>
             <w:vAlign w:val="center"/>
             <w:tcMar>
-              <w:top w:w="25" w:type="dxa"/>
-              <w:bottom w:w="25" w:type="dxa"/>
-              <w:left w:w="30" w:type="dxa"/>
-              <w:right w:w="30" w:type="dxa"/>
+              <w:top w:w="20" w:type="dxa"/>
+              <w:bottom w:w="20" w:type="dxa"/>
+              <w:left w:w="25" w:type="dxa"/>
+              <w:right w:w="25" w:type="dxa"/>
+            </w:tcMar>
+            <w:shd w:fill="FFFFFF"/>
+          </w:tcPr>
+          <w:p>
+            <w:pPr>
+              <w:spacing w:before="0" w:after="0"/>
+              <w:jc w:val="left"/>
+            </w:pPr>
+            <w:r>
+              <w:rPr>
+                <w:rFonts w:ascii="Times New Roman" w:hAnsi="Times New Roman"/>
+                <w:sz w:val="15"/>
+              </w:rPr>
+              <w:t>Khan et al. [11]</w:t>
+            </w:r>
+          </w:p>
+        </w:tc>
+        <w:tc>
+          <w:tcPr>
+            <w:tcW w:type="dxa" w:w="936"/>
+            <w:vAlign w:val="center"/>
+            <w:tcMar>
+              <w:top w:w="20" w:type="dxa"/>
+              <w:bottom w:w="20" w:type="dxa"/>
+              <w:left w:w="25" w:type="dxa"/>
+              <w:right w:w="25" w:type="dxa"/>
+            </w:tcMar>
+            <w:shd w:fill="FFFFFF"/>
+          </w:tcPr>
+          <w:p>
+            <w:pPr>
+              <w:spacing w:before="0" w:after="0"/>
+              <w:jc w:val="center"/>
+            </w:pPr>
+            <w:r>
+              <w:rPr>
+                <w:rFonts w:ascii="Times New Roman" w:hAnsi="Times New Roman"/>
+                <w:sz w:val="15"/>
+              </w:rPr>
+              <w:t>2D Photos</w:t>
+            </w:r>
+          </w:p>
+        </w:tc>
+        <w:tc>
+          <w:tcPr>
+            <w:tcW w:type="dxa" w:w="1080"/>
+            <w:vAlign w:val="center"/>
+            <w:tcMar>
+              <w:top w:w="20" w:type="dxa"/>
+              <w:bottom w:w="20" w:type="dxa"/>
+              <w:left w:w="25" w:type="dxa"/>
+              <w:right w:w="25" w:type="dxa"/>
+            </w:tcMar>
+            <w:shd w:fill="FFFFFF"/>
+          </w:tcPr>
+          <w:p>
+            <w:pPr>
+              <w:spacing w:before="0" w:after="0"/>
+              <w:jc w:val="center"/>
+            </w:pPr>
+            <w:r>
+              <w:rPr>
+                <w:rFonts w:ascii="Times New Roman" w:hAnsi="Times New Roman"/>
+                <w:sz w:val="15"/>
+              </w:rPr>
+              <w:t>~45 ms</w:t>
+            </w:r>
+          </w:p>
+        </w:tc>
+        <w:tc>
+          <w:tcPr>
+            <w:tcW w:type="dxa" w:w="1296"/>
+            <w:vAlign w:val="center"/>
+            <w:tcMar>
+              <w:top w:w="20" w:type="dxa"/>
+              <w:bottom w:w="20" w:type="dxa"/>
+              <w:left w:w="25" w:type="dxa"/>
+              <w:right w:w="25" w:type="dxa"/>
+            </w:tcMar>
+            <w:shd w:fill="FFFFFF"/>
+          </w:tcPr>
+          <w:p>
+            <w:pPr>
+              <w:spacing w:before="0" w:after="0"/>
+              <w:jc w:val="center"/>
+            </w:pPr>
+            <w:r>
+              <w:rPr>
+                <w:rFonts w:ascii="Times New Roman" w:hAnsi="Times New Roman"/>
+                <w:sz w:val="15"/>
+              </w:rPr>
+              <w:t>96.0% / —</w:t>
+            </w:r>
+          </w:p>
+        </w:tc>
+      </w:tr>
+      <w:tr>
+        <w:tc>
+          <w:tcPr>
+            <w:tcW w:type="dxa" w:w="1728"/>
+            <w:vAlign w:val="center"/>
+            <w:tcMar>
+              <w:top w:w="20" w:type="dxa"/>
+              <w:bottom w:w="20" w:type="dxa"/>
+              <w:left w:w="25" w:type="dxa"/>
+              <w:right w:w="25" w:type="dxa"/>
+            </w:tcMar>
+            <w:shd w:fill="FFFFFF"/>
+          </w:tcPr>
+          <w:p>
+            <w:pPr>
+              <w:spacing w:before="0" w:after="0"/>
+              <w:jc w:val="left"/>
+            </w:pPr>
+            <w:r>
+              <w:rPr>
+                <w:rFonts w:ascii="Times New Roman" w:hAnsi="Times New Roman"/>
+                <w:sz w:val="15"/>
+              </w:rPr>
+              <w:t>Kaur et al. [15]</w:t>
+            </w:r>
+          </w:p>
+        </w:tc>
+        <w:tc>
+          <w:tcPr>
+            <w:tcW w:type="dxa" w:w="936"/>
+            <w:vAlign w:val="center"/>
+            <w:tcMar>
+              <w:top w:w="20" w:type="dxa"/>
+              <w:bottom w:w="20" w:type="dxa"/>
+              <w:left w:w="25" w:type="dxa"/>
+              <w:right w:w="25" w:type="dxa"/>
+            </w:tcMar>
+            <w:shd w:fill="FFFFFF"/>
+          </w:tcPr>
+          <w:p>
+            <w:pPr>
+              <w:spacing w:before="0" w:after="0"/>
+              <w:jc w:val="center"/>
+            </w:pPr>
+            <w:r>
+              <w:rPr>
+                <w:rFonts w:ascii="Times New Roman" w:hAnsi="Times New Roman"/>
+                <w:sz w:val="15"/>
+              </w:rPr>
+              <w:t>2D Photos</w:t>
+            </w:r>
+          </w:p>
+        </w:tc>
+        <w:tc>
+          <w:tcPr>
+            <w:tcW w:type="dxa" w:w="1080"/>
+            <w:vAlign w:val="center"/>
+            <w:tcMar>
+              <w:top w:w="20" w:type="dxa"/>
+              <w:bottom w:w="20" w:type="dxa"/>
+              <w:left w:w="25" w:type="dxa"/>
+              <w:right w:w="25" w:type="dxa"/>
+            </w:tcMar>
+            <w:shd w:fill="FFFFFF"/>
+          </w:tcPr>
+          <w:p>
+            <w:pPr>
+              <w:spacing w:before="0" w:after="0"/>
+              <w:jc w:val="center"/>
+            </w:pPr>
+            <w:r>
+              <w:rPr>
+                <w:rFonts w:ascii="Times New Roman" w:hAnsi="Times New Roman"/>
+                <w:sz w:val="15"/>
+              </w:rPr>
+              <w:t>~65 ms</w:t>
+            </w:r>
+          </w:p>
+        </w:tc>
+        <w:tc>
+          <w:tcPr>
+            <w:tcW w:type="dxa" w:w="1296"/>
+            <w:vAlign w:val="center"/>
+            <w:tcMar>
+              <w:top w:w="20" w:type="dxa"/>
+              <w:bottom w:w="20" w:type="dxa"/>
+              <w:left w:w="25" w:type="dxa"/>
+              <w:right w:w="25" w:type="dxa"/>
+            </w:tcMar>
+            <w:shd w:fill="FFFFFF"/>
+          </w:tcPr>
+          <w:p>
+            <w:pPr>
+              <w:spacing w:before="0" w:after="0"/>
+              <w:jc w:val="center"/>
+            </w:pPr>
+            <w:r>
+              <w:rPr>
+                <w:rFonts w:ascii="Times New Roman" w:hAnsi="Times New Roman"/>
+                <w:sz w:val="15"/>
+              </w:rPr>
+              <w:t>96.2% / —</w:t>
+            </w:r>
+          </w:p>
+        </w:tc>
+      </w:tr>
+      <w:tr>
+        <w:tc>
+          <w:tcPr>
+            <w:tcW w:type="dxa" w:w="1728"/>
+            <w:vAlign w:val="center"/>
+            <w:tcMar>
+              <w:top w:w="20" w:type="dxa"/>
+              <w:bottom w:w="20" w:type="dxa"/>
+              <w:left w:w="25" w:type="dxa"/>
+              <w:right w:w="25" w:type="dxa"/>
             </w:tcMar>
             <w:shd w:fill="F8FAFC"/>
           </w:tcPr>
@@ -6043,10 +6833,10 @@
             <w:tcW w:type="dxa" w:w="936"/>
             <w:vAlign w:val="center"/>
             <w:tcMar>
-              <w:top w:w="25" w:type="dxa"/>
-              <w:bottom w:w="25" w:type="dxa"/>
-              <w:left w:w="30" w:type="dxa"/>
-              <w:right w:w="30" w:type="dxa"/>
+              <w:top w:w="20" w:type="dxa"/>
+              <w:bottom w:w="20" w:type="dxa"/>
+              <w:left w:w="25" w:type="dxa"/>
+              <w:right w:w="25" w:type="dxa"/>
             </w:tcMar>
             <w:shd w:fill="F8FAFC"/>
           </w:tcPr>
@@ -6070,10 +6860,10 @@
             <w:tcW w:type="dxa" w:w="1080"/>
             <w:vAlign w:val="center"/>
             <w:tcMar>
-              <w:top w:w="25" w:type="dxa"/>
-              <w:bottom w:w="25" w:type="dxa"/>
-              <w:left w:w="30" w:type="dxa"/>
-              <w:right w:w="30" w:type="dxa"/>
+              <w:top w:w="20" w:type="dxa"/>
+              <w:bottom w:w="20" w:type="dxa"/>
+              <w:left w:w="25" w:type="dxa"/>
+              <w:right w:w="25" w:type="dxa"/>
             </w:tcMar>
             <w:shd w:fill="F8FAFC"/>
           </w:tcPr>
@@ -6097,10 +6887,10 @@
             <w:tcW w:type="dxa" w:w="1296"/>
             <w:vAlign w:val="center"/>
             <w:tcMar>
-              <w:top w:w="25" w:type="dxa"/>
-              <w:bottom w:w="25" w:type="dxa"/>
-              <w:left w:w="30" w:type="dxa"/>
-              <w:right w:w="30" w:type="dxa"/>
+              <w:top w:w="20" w:type="dxa"/>
+              <w:bottom w:w="20" w:type="dxa"/>
+              <w:left w:w="25" w:type="dxa"/>
+              <w:right w:w="25" w:type="dxa"/>
             </w:tcMar>
             <w:shd w:fill="F8FAFC"/>
           </w:tcPr>
@@ -6133,7 +6923,7 @@
           <w:color w:val="000000"/>
           <w:sz w:val="19"/>
         </w:rPr>
-        <w:t>As shown in Table IV, our photographic ResNet-50 pipeline outperforms published fMRI models (exceeding Singh et al. [6] by 4.3% accuracy and 4.7% AUROC) while eliminating scanner confinement, acoustic trauma, and sedation requirements.</w:t>
+        <w:t>As shown in Table IV, our photographic ResNet-50 pipeline provides an authentic standardized benchmark across 5,772 multi-center images, eliminating acoustic trauma, scanner confinement, and sedation hazards while achieving sub-45ms latency.</w:t>
       </w:r>
     </w:p>
     <w:p>
@@ -6181,7 +6971,7 @@
           <w:color w:val="000000"/>
           <w:sz w:val="19"/>
         </w:rPr>
-        <w:t>The diagnostic efficacy of deep convolutional features extracted from facial portraits is firmly grounded in developmental biology. During human embryonic development between gestational weeks 3 and 8, the facial prominences develop synchronously with the forebrain under the direction of migrating cranial neural crest cells [7]. Molecular signaling pathways (Sonic Hedgehog, Wnt, Fibroblast Growth Factor) govern both neurogenesis in the cerebral cortex and morphological patterning of the periorbital, nasal, and maxillary structures. Genetic variants associated with autism spectrum vulnerability disrupt these coupled signaling cascades, resulting in subtle, quantifiable dysmorphologies such as altered facial width, intercanthal spacing, and philtrum contouring [8], [9]. By capturing hierarchical spatial features from aligned facial portraits, deep residual networks successfully detect these developmental patterns.</w:t>
+        <w:t>The diagnostic efficacy of deep convolutional features extracted from facial portraits is firmly grounded in developmental biology. During human embryonic development between gestational weeks 3 and 8, the facial prominences develop synchronously with the forebrain under the direction of migrating cranial neural crest cells [20]. Molecular signaling pathways (Sonic Hedgehog, Wnt, Fibroblast Growth Factor) govern both neurogenesis in the cerebral cortex and morphological patterning of the periorbital, nasal, and maxillary structures. Genetic variants associated with autism spectrum vulnerability disrupt these coupled signaling cascades, resulting in subtle, quantifiable dysmorphologies such as altered facial width, intercanthal spacing, and philtrum contouring [21], [22]. By capturing hierarchical spatial features from aligned facial portraits, deep residual networks successfully detect these developmental patterns.</w:t>
       </w:r>
     </w:p>
     <w:p>
@@ -6295,7 +7085,7 @@
           <w:rFonts w:ascii="Times New Roman" w:hAnsi="Times New Roman"/>
           <w:sz w:val="15"/>
         </w:rPr>
-        <w:t>[1] C. Lord, M. Elsabbagh, G. Baird, and J. Veenstra-Vanderweele, "Autism spectrum disorder," The Lancet, vol. 392, no. 10146, pp. 508–520, 2018.</w:t>
+        <w:t>[1] M. Beary, A. Hadsell, R. Messersmith, and M.-P. Hosseini, "Diagnosis of Autism in Children Using Facial Analysis and Deep Learning," arXiv preprint arXiv:2008.02890, 2020.</w:t>
       </w:r>
     </w:p>
     <w:p>
@@ -6309,7 +7099,7 @@
           <w:rFonts w:ascii="Times New Roman" w:hAnsi="Times New Roman"/>
           <w:sz w:val="15"/>
         </w:rPr>
-        <w:t>[2] M. J. Maenner, Z. Warren, A. R. Williams, et al., "Prevalence and Characteristics of Autism Spectrum Disorder Among Children Aged 8 Years — ADDM Network, 11 Sites, United States, 2020," MMWR Surveill. Summ., vol. 72, no. 2, pp. 1–14, 2023.</w:t>
+        <w:t>[2] K. K. Mujeeb Rahman and M. M. Subashini, "Identification of Autism in Children Using Static Facial Features and Deep Neural Networks," Brain Sciences, vol. 12, no. 1, p. 94, 2022, doi: 10.3390/brainsci12010094.</w:t>
       </w:r>
     </w:p>
     <w:p>
@@ -6323,7 +7113,7 @@
           <w:rFonts w:ascii="Times New Roman" w:hAnsi="Times New Roman"/>
           <w:sz w:val="15"/>
         </w:rPr>
-        <w:t>[3] A. Di Martino, C.-G. Yan, Q. Li, et al., "The autism brain imaging data exchange: towards a large-scale evaluation of the intrinsic brain architecture in autism," Mol. Psychiatry, vol. 19, no. 6, pp. 659–667, 2014.</w:t>
+        <w:t>[3] M. Revathi and S. Arunarani, "Hybrid Deep Learning with Cross-Attention Fusion for Autism Spectrum Disorder Classification from Facial Images," Intelligence-Based Medicine, vol. 15, p. 100421, 2026, doi: 10.1016/j.ibmed.2026.100421.</w:t>
       </w:r>
     </w:p>
     <w:p>
@@ -6337,7 +7127,7 @@
           <w:rFonts w:ascii="Times New Roman" w:hAnsi="Times New Roman"/>
           <w:sz w:val="15"/>
         </w:rPr>
-        <w:t>[4] A. S. Heinsfeld, A. R. Franco, R. C. Craddock, A. Buchweitz, and F. Meneguzzi, "Identification of autism spectrum disorder using deep learning on functional magnetic resonance imaging data," NeuroImage: Clin., vol. 17, pp. 688–696, 2018.</w:t>
+        <w:t>[4] T. Akter, M. H. Ali, M. I. Khan, M. S. Satu, M. J. Uddin, S. A. Alyami, S. Ali, A. K. M. Azad, and M. A. Moni, "Improved Transfer-Learning-Based Facial Recognition Framework to Detect Autistic Children at an Early Stage," Brain Sciences, vol. 11, no. 6, p. 734, 2021, doi: 10.3390/brainsci11060734.</w:t>
       </w:r>
     </w:p>
     <w:p>
@@ -6351,7 +7141,7 @@
           <w:rFonts w:ascii="Times New Roman" w:hAnsi="Times New Roman"/>
           <w:sz w:val="15"/>
         </w:rPr>
-        <w:t>[5] T. Eslami, V. Mirjalili, A. Fong, A. R. Laird, and F. Saeed, "DiagNet: A tool to diagnose autism spectrum disorder using autoencoders and functional connectivity," in Proc. ACM BCB, 2019, pp. 451–460.</w:t>
+        <w:t>[5] L. K. Gaddala, K. R. Kodepogu, Y. Surekha, M. Tejaswi, K. Ameesha, L. S. Kollapalli, S. K. Kotha, and V. B. Manjeti, "Autism Spectrum Disorder Detection Using Facial Images and Deep Convolutional Neural Networks," Revue d'Intelligence Artificielle, vol. 37, no. 3, pp. 801–806, 2023, doi: 10.18280/ria.370329.</w:t>
       </w:r>
     </w:p>
     <w:p>
@@ -6365,7 +7155,7 @@
           <w:rFonts w:ascii="Times New Roman" w:hAnsi="Times New Roman"/>
           <w:sz w:val="15"/>
         </w:rPr>
-        <w:t>[6] U. Singh, S. Shukla, and M. M. Gore, "Functional Connectivity and Graph Embedding-Based Domain Adaptation for Autism Classification from Multi-site Data," Arab. J. Sci. Eng., vol. 49, no. 11, pp. 15053–15072, 2024.</w:t>
+        <w:t>[6] A. Lu and M. Perkowski, "Deep Learning Approach for Screening Autism Spectrum Disorder in Children with Facial Images and Analysis of Ethnoracial Factors in Model Development and Application," Brain Sciences, vol. 11, no. 11, p. 1446, 2021, doi: 10.3390/brainsci11111446.</w:t>
       </w:r>
     </w:p>
     <w:p>
@@ -6379,7 +7169,7 @@
           <w:rFonts w:ascii="Times New Roman" w:hAnsi="Times New Roman"/>
           <w:sz w:val="15"/>
         </w:rPr>
-        <w:t>[7] D. R. Cordero, S. Brugmann, Y. Chu, et al., "Cranial neural crest cells on the move and their role in craniofacial development," Genesis, vol. 49, no. 4, pp. 249–261, 2011.</w:t>
+        <w:t>[7] H. Alkahtani, T. H. H. Aldhyani, and M. Y. Alzahrani, "Deep Learning Algorithms to Identify Autism Spectrum Disorder in Children-Based Facial Landmarks," Applied Sciences, vol. 13, no. 8, p. 4855, 2023, doi: 10.3390/app13084855.</w:t>
       </w:r>
     </w:p>
     <w:p>
@@ -6393,7 +7183,7 @@
           <w:rFonts w:ascii="Times New Roman" w:hAnsi="Times New Roman"/>
           <w:sz w:val="15"/>
         </w:rPr>
-        <w:t>[8] K. Aldridge, I. D. George, K. K. Cole, et al., "Facial phenotypes in subgroups of prepubertal boys with autism spectrum disorders are correlated with clinical phenotypes," Mol. Autism, vol. 2, no. 1, pp. 15–28, 2011.</w:t>
+        <w:t>[8] Z. A. T. Ahmed, T. H. H. Aldhyani, M. E. Jadhav, M. Y. Alzahrani, M. E. Alzahrani, M. M. Althobaiti, F. Alassery, A. Alshaflut, N. M. Alzahrani, and A. M. Al-madani, "Facial Features Detection System To Identify Children With Autism Spectrum Disorder: Deep Learning Models," Computational and Mathematical Methods in Medicine, vol. 2022, p. 3941049, 2022 (Retracted publication).</w:t>
       </w:r>
     </w:p>
     <w:p>
@@ -6407,7 +7197,7 @@
           <w:rFonts w:ascii="Times New Roman" w:hAnsi="Times New Roman"/>
           <w:sz w:val="15"/>
         </w:rPr>
-        <w:t>[9] T. Obafemi-Ajayi, J. H. Miles, N. Takahashi, et al., "Facial morphometric features correlate with clinical severity in autism spectrum disorder," Neuroinformatics, vol. 13, no. 4, pp. 407–424, 2015.</w:t>
+        <w:t>[9] S. Raj and S. Masood, "Analysis and Detection of Autism Spectrum Disorder Using Machine Learning Techniques," Procedia Computer Science, vol. 167, pp. 994–1004, 2020, doi: 10.1016/j.procs.2020.03.399.</w:t>
       </w:r>
     </w:p>
     <w:p>
@@ -6421,7 +7211,7 @@
           <w:rFonts w:ascii="Times New Roman" w:hAnsi="Times New Roman"/>
           <w:sz w:val="15"/>
         </w:rPr>
-        <w:t>[10] I. Ahmad, J. Rashid, M. Faheem, A. Akram, N. U. Khan, and R. ul Amin, "Autism spectrum disorder detection using facial images: A performance comparison of pretrained convolutional neural networks," Healthc. Technol. Lett., vol. 11, no. 4, pp. 227–239, 2024.</w:t>
+        <w:t>[10] A. K. Kareem, M. M. AL-Ani, and A. A. Nafea, "Detection of Autism Spectrum Disorder Using A 1-Dimensional Convolutional Neural Network," Baghdad Science Journal, vol. 20, no. 6, p. 8564, 2023, doi: 10.21123/bsj.2023.8564.</w:t>
       </w:r>
     </w:p>
     <w:p>
@@ -6435,7 +7225,7 @@
           <w:rFonts w:ascii="Times New Roman" w:hAnsi="Times New Roman"/>
           <w:sz w:val="15"/>
         </w:rPr>
-        <w:t>[11] L. Sun, J. Chen, Z. Wang, et al., "Maximum Independence Domain Adaptation for Multi-Site fMRI Autism Diagnosis," IEEE Trans. Neural Netw. Learn. Syst., vol. 31, pp. 1–12, 2020.</w:t>
+        <w:t>[11] B. Khan, S. M. Bhatti, and A. Akram, "Autism Spectrum Disorder Detection in Children Via Deep Learning Models Based on Facial Images," Bulletin of Business and Economics, vol. 13, no. 1, pp. 557–572, 2024, doi: 10.61506/01.00241.</w:t>
       </w:r>
     </w:p>
     <w:p>
@@ -6449,7 +7239,7 @@
           <w:rFonts w:ascii="Times New Roman" w:hAnsi="Times New Roman"/>
           <w:sz w:val="15"/>
         </w:rPr>
-        <w:t>[12] M. Elbashir, A. Eisa, et al., "Lightweight Deep Learning for Autism Spectrum Disorder Detection Using Facial Portraits," Comput. Biol. Med., vol. 135, p. 104618, 2021.</w:t>
+        <w:t>[12] B. Awaji, E. M. Senan, F. Olayah, E. A. Alshari, M. Alsulami, H. A. Abosaq, J. Alqahtani, and P. Janrao, "Hybrid Techniques of Facial Feature Image Analysis for Early Detection of Autism Spectrum Disorder Based on Combined CNN Features," Diagnostics, vol. 13, no. 18, p. 2948, 2023, doi: 10.3390/diagnostics13182948.</w:t>
       </w:r>
     </w:p>
     <w:p>
@@ -6463,7 +7253,7 @@
           <w:rFonts w:ascii="Times New Roman" w:hAnsi="Times New Roman"/>
           <w:sz w:val="15"/>
         </w:rPr>
-        <w:t>[13] F. W. Alsaade and M. S. Alzahrani, "Artificial Intelligence Based Pediatric Autism Detection Using Facial Biomarkers," Diagnostics, vol. 12, p. 2534, 2022.</w:t>
+        <w:t>[13] U. J. Monani, R. Maity, P. K. Pattnaik, K. S. M. Anbananthen, S. Muthaiyah, and M. Sain, "Evaluating Deep Learning Models for Autism Detection in Children Using Facial Images," Journal of Human, Earth, and Future, vol. 7, no. 1, pp. 48–60, 2026, doi: 10.28991/HEF-2026-07-01-03.</w:t>
       </w:r>
     </w:p>
     <w:p>
@@ -6477,7 +7267,7 @@
           <w:rFonts w:ascii="Times New Roman" w:hAnsi="Times New Roman"/>
           <w:sz w:val="15"/>
         </w:rPr>
-        <w:t>[14] K. Zhang, Z. Zhang, Z. Li, and Y. Qiao, "Joint Face Detection and Alignment Using Multitask Cascaded Convolutional Networks," IEEE Signal Process. Lett., vol. 23, no. 10, pp. 1499–1503, 2016.</w:t>
+        <w:t>[14] Yunidar, A. Suyanda, Melinda, L. Q. Zakaria, and S. Rusdiana, "Classification of Autism Spectrum Disorder (ASD) in Children Using the VGG19 CNN Model Based on Facial Landmarks of the Eye and Forehead Areas," Jurnal Teknokes, vol. 19, no. 2, pp. 61–71, 2026, doi: 10.35882/jteknokes.v19i2.158.</w:t>
       </w:r>
     </w:p>
     <w:p>
@@ -6491,7 +7281,7 @@
           <w:rFonts w:ascii="Times New Roman" w:hAnsi="Times New Roman"/>
           <w:sz w:val="15"/>
         </w:rPr>
-        <w:t>[15] K. He, X. Zhang, S. Ren, and J. Sun, "Deep Residual Learning for Image Recognition," in Proc. IEEE CVPR, 2016, pp. 770–778.</w:t>
+        <w:t>[15] N. Kaur, P. Singh, K. Singh, J. Khan, D. Hussain, Y. H. Gu, R. Aljuaidi, and N. Waheb Rajkhan, "AI-driven Neuroanalytic Modeling for Mental Health: Multichannel CNN-Based Autism Spectrum Disorder Detection via Facial Pattern Analysis," Frontiers in Computational Neuroscience, vol. 20, p. 1851416, 2026, doi: 10.3389/fncom.2026.1851416.</w:t>
       </w:r>
     </w:p>
     <w:p>
@@ -6505,7 +7295,7 @@
           <w:rFonts w:ascii="Times New Roman" w:hAnsi="Times New Roman"/>
           <w:sz w:val="15"/>
         </w:rPr>
-        <w:t>[16] K. Simonyan and A. Zisserman, "Very Deep Convolutional Networks for Large-Scale Image Recognition," arXiv:1409.1556, 2014.</w:t>
+        <w:t>[16] C. Lord, M. Elsabbagh, G. Baird, and J. Veenstra-Vanderweele, "Autism spectrum disorder," The Lancet, vol. 392, no. 10146, pp. 508–520, 2018.</w:t>
       </w:r>
     </w:p>
     <w:p>
@@ -6519,7 +7309,7 @@
           <w:rFonts w:ascii="Times New Roman" w:hAnsi="Times New Roman"/>
           <w:sz w:val="15"/>
         </w:rPr>
-        <w:t>[17] M. Sandler, A. Howard, M. Zhu, A. Zhmoginov, and L.-C. Chen, "MobileNetV2: Inverted Residuals and Linear Bottlenecks," in Proc. IEEE CVPR, 2018, pp. 4510–4520.</w:t>
+        <w:t>[17] M. J. Maenner, Z. Warren, A. R. Williams, et al., "Prevalence and Characteristics of Autism Spectrum Disorder Among Children Aged 8 Years — ADDM Network, 11 Sites, United States, 2020," MMWR Surveill. Summ., vol. 72, no. 2, pp. 1–14, 2023.</w:t>
       </w:r>
     </w:p>
     <w:p>
@@ -6533,7 +7323,7 @@
           <w:rFonts w:ascii="Times New Roman" w:hAnsi="Times New Roman"/>
           <w:sz w:val="15"/>
         </w:rPr>
-        <w:t>[18] A. Krizhevsky, I. Sutskever, and G. E. Hinton, "ImageNet Classification with Deep Convolutional Neural Networks," in Adv. Neural Inf. Process. Syst. (NeurIPS), vol. 25, pp. 1097–1105, 2012.</w:t>
+        <w:t>[18] A. Di Martino, C.-G. Yan, Q. Li, et al., "The autism brain imaging data exchange: towards a large-scale evaluation of the intrinsic brain architecture in autism," Mol. Psychiatry, vol. 19, no. 6, pp. 659–667, 2014.</w:t>
       </w:r>
     </w:p>
     <w:p>
@@ -6547,7 +7337,133 @@
           <w:rFonts w:ascii="Times New Roman" w:hAnsi="Times New Roman"/>
           <w:sz w:val="15"/>
         </w:rPr>
-        <w:t>[19] I. Loshchilov and F. Hutter, "Decoupled Weight Decay Regularization," in Proc. ICLR, 2019.</w:t>
+        <w:t>[19] U. Singh, S. Shukla, and M. M. Gore, "Functional Connectivity and Graph Embedding-Based Domain Adaptation for Autism Classification from Multi-site Data," Arab. J. Sci. Eng., vol. 49, no. 11, pp. 15053–15072, 2024.</w:t>
+      </w:r>
+    </w:p>
+    <w:p>
+      <w:pPr>
+        <w:spacing w:line="240" w:lineRule="auto" w:before="0" w:after="40"/>
+        <w:ind w:left="288" w:hanging="288"/>
+        <w:jc w:val="both"/>
+      </w:pPr>
+      <w:r>
+        <w:rPr>
+          <w:rFonts w:ascii="Times New Roman" w:hAnsi="Times New Roman"/>
+          <w:sz w:val="15"/>
+        </w:rPr>
+        <w:t>[20] D. R. Cordero, S. Brugmann, Y. Chu, et al., "Cranial neural crest cells on the move and their role in craniofacial development," Genesis, vol. 49, no. 4, pp. 249–261, 2011.</w:t>
+      </w:r>
+    </w:p>
+    <w:p>
+      <w:pPr>
+        <w:spacing w:line="240" w:lineRule="auto" w:before="0" w:after="40"/>
+        <w:ind w:left="288" w:hanging="288"/>
+        <w:jc w:val="both"/>
+      </w:pPr>
+      <w:r>
+        <w:rPr>
+          <w:rFonts w:ascii="Times New Roman" w:hAnsi="Times New Roman"/>
+          <w:sz w:val="15"/>
+        </w:rPr>
+        <w:t>[21] K. Aldridge, I. D. George, K. K. Cole, et al., "Facial phenotypes in subgroups of prepubertal boys with autism spectrum disorders are correlated with clinical phenotypes," Mol. Autism, vol. 2, no. 1, pp. 15–28, 2011.</w:t>
+      </w:r>
+    </w:p>
+    <w:p>
+      <w:pPr>
+        <w:spacing w:line="240" w:lineRule="auto" w:before="0" w:after="40"/>
+        <w:ind w:left="288" w:hanging="288"/>
+        <w:jc w:val="both"/>
+      </w:pPr>
+      <w:r>
+        <w:rPr>
+          <w:rFonts w:ascii="Times New Roman" w:hAnsi="Times New Roman"/>
+          <w:sz w:val="15"/>
+        </w:rPr>
+        <w:t>[22] T. Obafemi-Ajayi, J. H. Miles, N. Takahashi, et al., "Facial morphometric features correlate with clinical severity in autism spectrum disorder," Neuroinformatics, vol. 13, no. 4, pp. 407–424, 2015.</w:t>
+      </w:r>
+    </w:p>
+    <w:p>
+      <w:pPr>
+        <w:spacing w:line="240" w:lineRule="auto" w:before="0" w:after="40"/>
+        <w:ind w:left="288" w:hanging="288"/>
+        <w:jc w:val="both"/>
+      </w:pPr>
+      <w:r>
+        <w:rPr>
+          <w:rFonts w:ascii="Times New Roman" w:hAnsi="Times New Roman"/>
+          <w:sz w:val="15"/>
+        </w:rPr>
+        <w:t>[23] K. Zhang, Z. Zhang, Z. Li, and Y. Qiao, "Joint Face Detection and Alignment Using Multitask Cascaded Convolutional Networks," IEEE Signal Process. Lett., vol. 23, no. 10, pp. 1499–1503, 2016.</w:t>
+      </w:r>
+    </w:p>
+    <w:p>
+      <w:pPr>
+        <w:spacing w:line="240" w:lineRule="auto" w:before="0" w:after="40"/>
+        <w:ind w:left="288" w:hanging="288"/>
+        <w:jc w:val="both"/>
+      </w:pPr>
+      <w:r>
+        <w:rPr>
+          <w:rFonts w:ascii="Times New Roman" w:hAnsi="Times New Roman"/>
+          <w:sz w:val="15"/>
+        </w:rPr>
+        <w:t>[24] K. He, X. Zhang, S. Ren, and J. Sun, "Deep Residual Learning for Image Recognition," in Proc. IEEE CVPR, 2016, pp. 770–778.</w:t>
+      </w:r>
+    </w:p>
+    <w:p>
+      <w:pPr>
+        <w:spacing w:line="240" w:lineRule="auto" w:before="0" w:after="40"/>
+        <w:ind w:left="288" w:hanging="288"/>
+        <w:jc w:val="both"/>
+      </w:pPr>
+      <w:r>
+        <w:rPr>
+          <w:rFonts w:ascii="Times New Roman" w:hAnsi="Times New Roman"/>
+          <w:sz w:val="15"/>
+        </w:rPr>
+        <w:t>[25] K. Simonyan and A. Zisserman, "Very Deep Convolutional Networks for Large-Scale Image Recognition," arXiv:1409.1556, 2014.</w:t>
+      </w:r>
+    </w:p>
+    <w:p>
+      <w:pPr>
+        <w:spacing w:line="240" w:lineRule="auto" w:before="0" w:after="40"/>
+        <w:ind w:left="288" w:hanging="288"/>
+        <w:jc w:val="both"/>
+      </w:pPr>
+      <w:r>
+        <w:rPr>
+          <w:rFonts w:ascii="Times New Roman" w:hAnsi="Times New Roman"/>
+          <w:sz w:val="15"/>
+        </w:rPr>
+        <w:t>[26] M. Sandler, A. Howard, M. Zhu, A. Zhmoginov, and L.-C. Chen, "MobileNetV2: Inverted Residuals and Linear Bottlenecks," in Proc. IEEE CVPR, 2018, pp. 4510–4520.</w:t>
+      </w:r>
+    </w:p>
+    <w:p>
+      <w:pPr>
+        <w:spacing w:line="240" w:lineRule="auto" w:before="0" w:after="40"/>
+        <w:ind w:left="288" w:hanging="288"/>
+        <w:jc w:val="both"/>
+      </w:pPr>
+      <w:r>
+        <w:rPr>
+          <w:rFonts w:ascii="Times New Roman" w:hAnsi="Times New Roman"/>
+          <w:sz w:val="15"/>
+        </w:rPr>
+        <w:t>[27] A. Krizhevsky, I. Sutskever, and G. E. Hinton, "ImageNet Classification with Deep Convolutional Neural Networks," in Adv. Neural Inf. Process. Syst. (NeurIPS), vol. 25, pp. 1097–1105, 2012.</w:t>
+      </w:r>
+    </w:p>
+    <w:p>
+      <w:pPr>
+        <w:spacing w:line="240" w:lineRule="auto" w:before="0" w:after="40"/>
+        <w:ind w:left="288" w:hanging="288"/>
+        <w:jc w:val="both"/>
+      </w:pPr>
+      <w:r>
+        <w:rPr>
+          <w:rFonts w:ascii="Times New Roman" w:hAnsi="Times New Roman"/>
+          <w:sz w:val="15"/>
+        </w:rPr>
+        <w:t>[28] I. Loshchilov and F. Hutter, "Decoupled Weight Decay Regularization," in Proc. ICLR, 2019.</w:t>
       </w:r>
     </w:p>
     <w:sectPr>

</xml_diff>